<commit_message>
Enhance CV with updated skills and experience
</commit_message>
<xml_diff>
--- a/Nazmul_Hussain_CV.docx
+++ b/Nazmul_Hussain_CV.docx
@@ -42,7 +42,14 @@
           <w:sz w:val="26"/>
           <w:szCs w:val="26"/>
         </w:rPr>
-        <w:t>Aspiring C# / .NET Developer</w:t>
+        <w:t>Junior</w:t>
+      </w:r>
+      <w:r>
+        <w:rPr>
+          <w:sz w:val="26"/>
+          <w:szCs w:val="26"/>
+        </w:rPr>
+        <w:t xml:space="preserve"> C#/.NET Developer</w:t>
       </w:r>
     </w:p>
     <w:p>
@@ -222,7 +229,14 @@
           <w:sz w:val="21"/>
           <w:szCs w:val="21"/>
         </w:rPr>
-        <w:t xml:space="preserve">Aspiring C#/.NET developer currently completing the Northcoders bootcamp, with a long-standing interest in technology and how systems are built and function. My interest began at a young age through hands-on experience, including upgrading hardware and building my own PC, which developed my curiosity for problem-solving and system design. </w:t>
+        <w:t>Junior</w:t>
+      </w:r>
+      <w:r>
+        <w:rPr>
+          <w:sz w:val="21"/>
+          <w:szCs w:val="21"/>
+        </w:rPr>
+        <w:t xml:space="preserve"> C#/.NET developer currently completing the Northcoders bootcamp, with a long-standing interest in technology and how systems are built and function. My interest began at a young age through hands-on experience, including upgrading hardware and building my own PC, which developed my curiosity for problem-solving and system design. </w:t>
       </w:r>
     </w:p>
     <w:p>
@@ -401,7 +415,21 @@
           <w:sz w:val="21"/>
           <w:szCs w:val="21"/>
         </w:rPr>
-        <w:t xml:space="preserve"> Test-Driven Development (TDD), NUnit, Moq  </w:t>
+        <w:t xml:space="preserve"> Test-Driven Development (TDD), NUnit, </w:t>
+      </w:r>
+      <w:r>
+        <w:rPr>
+          <w:sz w:val="21"/>
+          <w:szCs w:val="21"/>
+        </w:rPr>
+        <w:t xml:space="preserve">Shouldly, </w:t>
+      </w:r>
+      <w:r>
+        <w:rPr>
+          <w:sz w:val="21"/>
+          <w:szCs w:val="21"/>
+        </w:rPr>
+        <w:t>Moq</w:t>
       </w:r>
     </w:p>
     <w:p>
@@ -419,14 +447,21 @@
           <w:sz w:val="21"/>
           <w:szCs w:val="21"/>
         </w:rPr>
-        <w:t>Tools:</w:t>
-      </w:r>
-      <w:r>
-        <w:rPr>
-          <w:sz w:val="21"/>
-          <w:szCs w:val="21"/>
-        </w:rPr>
-        <w:t xml:space="preserve"> Git, GitHub, Visual Studio, VS Code, PowerShell  </w:t>
+        <w:t>Backend:</w:t>
+      </w:r>
+      <w:r>
+        <w:rPr>
+          <w:sz w:val="21"/>
+          <w:szCs w:val="21"/>
+        </w:rPr>
+        <w:t xml:space="preserve"> ASP.NET Core, MVC</w:t>
+      </w:r>
+      <w:r>
+        <w:rPr>
+          <w:sz w:val="21"/>
+          <w:szCs w:val="21"/>
+        </w:rPr>
+        <w:t>, REST APIs</w:t>
       </w:r>
     </w:p>
     <w:p>
@@ -451,7 +486,7 @@
           <w:sz w:val="21"/>
           <w:szCs w:val="21"/>
         </w:rPr>
-        <w:t xml:space="preserve"> SQL Server, T-SQL, Basic ADO.NET  </w:t>
+        <w:t xml:space="preserve"> SQL Server, T-SQL, ADO.NET</w:t>
       </w:r>
     </w:p>
     <w:p>
@@ -469,14 +504,55 @@
           <w:sz w:val="21"/>
           <w:szCs w:val="21"/>
         </w:rPr>
-        <w:t>Web &amp; Backend (Learning):</w:t>
-      </w:r>
-      <w:r>
-        <w:rPr>
-          <w:sz w:val="21"/>
-          <w:szCs w:val="21"/>
-        </w:rPr>
-        <w:t xml:space="preserve"> ASP.NET Core, MVC, HTML, CSS</w:t>
+        <w:t>Tools:</w:t>
+      </w:r>
+      <w:r>
+        <w:rPr>
+          <w:sz w:val="21"/>
+          <w:szCs w:val="21"/>
+        </w:rPr>
+        <w:t xml:space="preserve"> Git, GitHub, Visual Studio, VS Code, PowerShell  </w:t>
+      </w:r>
+    </w:p>
+    <w:p>
+      <w:pPr>
+        <w:spacing w:after="0" w:line="240" w:lineRule="auto"/>
+        <w:rPr>
+          <w:sz w:val="21"/>
+          <w:szCs w:val="21"/>
+        </w:rPr>
+      </w:pPr>
+      <w:r>
+        <w:rPr>
+          <w:b/>
+          <w:bCs/>
+          <w:sz w:val="21"/>
+          <w:szCs w:val="21"/>
+        </w:rPr>
+        <w:t>Frontend</w:t>
+      </w:r>
+      <w:r>
+        <w:rPr>
+          <w:b/>
+          <w:bCs/>
+          <w:sz w:val="21"/>
+          <w:szCs w:val="21"/>
+        </w:rPr>
+        <w:t>:</w:t>
+      </w:r>
+      <w:r>
+        <w:rPr>
+          <w:sz w:val="21"/>
+          <w:szCs w:val="21"/>
+        </w:rPr>
+        <w:t xml:space="preserve"> </w:t>
+      </w:r>
+      <w:r>
+        <w:rPr>
+          <w:sz w:val="21"/>
+          <w:szCs w:val="21"/>
+        </w:rPr>
+        <w:t>HTML, CSS</w:t>
       </w:r>
     </w:p>
     <w:p>
@@ -585,7 +661,14 @@
           <w:sz w:val="21"/>
           <w:szCs w:val="21"/>
         </w:rPr>
-        <w:t>Applying object-oriented programming, clean code, and test-driven development in practical exercises</w:t>
+        <w:t xml:space="preserve">Applying object-oriented programming, clean code, and test-driven development in practical </w:t>
+      </w:r>
+      <w:r>
+        <w:rPr>
+          <w:sz w:val="21"/>
+          <w:szCs w:val="21"/>
+        </w:rPr>
+        <w:t>projects</w:t>
       </w:r>
       <w:r>
         <w:rPr>
@@ -614,7 +697,21 @@
           <w:sz w:val="21"/>
           <w:szCs w:val="21"/>
         </w:rPr>
-        <w:t>Solved coding challenges using logical thinking, debugging, and structured problem-solving</w:t>
+        <w:t>Solv</w:t>
+      </w:r>
+      <w:r>
+        <w:rPr>
+          <w:sz w:val="21"/>
+          <w:szCs w:val="21"/>
+        </w:rPr>
+        <w:t>ing</w:t>
+      </w:r>
+      <w:r>
+        <w:rPr>
+          <w:sz w:val="21"/>
+          <w:szCs w:val="21"/>
+        </w:rPr>
+        <w:t xml:space="preserve"> coding challenges using logical thinking, debugging, and structured problem-solving</w:t>
       </w:r>
     </w:p>
     <w:p>
@@ -636,7 +733,7 @@
           <w:sz w:val="21"/>
           <w:szCs w:val="21"/>
         </w:rPr>
-        <w:t>Quickly learned internal systems and adapted to changing processes and deadlines.</w:t>
+        <w:t>Building backend applications and REST APIs using ASP.NET Core</w:t>
       </w:r>
     </w:p>
     <w:p>
@@ -858,23 +955,23 @@
           <w:sz w:val="21"/>
           <w:szCs w:val="21"/>
         </w:rPr>
-        <w:t xml:space="preserve">PPV Worldwide Limited – Global Visa Consultant  </w:t>
-      </w:r>
-    </w:p>
-    <w:p>
-      <w:pPr>
-        <w:spacing w:after="0" w:line="240" w:lineRule="auto"/>
-        <w:rPr>
-          <w:sz w:val="21"/>
-          <w:szCs w:val="21"/>
-        </w:rPr>
-      </w:pPr>
-      <w:r>
-        <w:rPr>
-          <w:sz w:val="21"/>
-          <w:szCs w:val="21"/>
-        </w:rPr>
-        <w:t xml:space="preserve">London, UK | 2023 – 2025  </w:t>
+        <w:t xml:space="preserve">PPV Worldwide Limited  </w:t>
+      </w:r>
+    </w:p>
+    <w:p>
+      <w:pPr>
+        <w:spacing w:after="0" w:line="240" w:lineRule="auto"/>
+        <w:rPr>
+          <w:sz w:val="21"/>
+          <w:szCs w:val="21"/>
+        </w:rPr>
+      </w:pPr>
+      <w:r>
+        <w:rPr>
+          <w:sz w:val="21"/>
+          <w:szCs w:val="21"/>
+        </w:rPr>
+        <w:t xml:space="preserve">London | 2023 – 2025  </w:t>
       </w:r>
     </w:p>
     <w:p>
@@ -896,7 +993,21 @@
           <w:sz w:val="21"/>
           <w:szCs w:val="21"/>
         </w:rPr>
-        <w:t>Managed end-to-end visa applications, ensuring accuracy, compliance, and timely processing</w:t>
+        <w:t>Processed</w:t>
+      </w:r>
+      <w:r>
+        <w:rPr>
+          <w:sz w:val="21"/>
+          <w:szCs w:val="21"/>
+        </w:rPr>
+        <w:t xml:space="preserve"> end-to-end visa applications, ensuring accuracy, compliance, and timely </w:t>
+      </w:r>
+      <w:r>
+        <w:rPr>
+          <w:sz w:val="21"/>
+          <w:szCs w:val="21"/>
+        </w:rPr>
+        <w:t>submission</w:t>
       </w:r>
       <w:r>
         <w:rPr>
@@ -925,7 +1036,70 @@
           <w:sz w:val="21"/>
           <w:szCs w:val="21"/>
         </w:rPr>
-        <w:t>Used structured systems including Mosadaqa and QVP for document verification, tracking, and record management</w:t>
+        <w:t xml:space="preserve">Used structured systems </w:t>
+      </w:r>
+      <w:r>
+        <w:rPr>
+          <w:sz w:val="21"/>
+          <w:szCs w:val="21"/>
+        </w:rPr>
+        <w:t>(</w:t>
+      </w:r>
+      <w:r>
+        <w:rPr>
+          <w:sz w:val="21"/>
+          <w:szCs w:val="21"/>
+        </w:rPr>
+        <w:t>Mosadaqa</w:t>
+      </w:r>
+      <w:r>
+        <w:rPr>
+          <w:sz w:val="21"/>
+          <w:szCs w:val="21"/>
+        </w:rPr>
+        <w:t>,</w:t>
+      </w:r>
+      <w:r>
+        <w:rPr>
+          <w:sz w:val="21"/>
+          <w:szCs w:val="21"/>
+        </w:rPr>
+        <w:t xml:space="preserve"> QVP</w:t>
+      </w:r>
+      <w:r>
+        <w:rPr>
+          <w:sz w:val="21"/>
+          <w:szCs w:val="21"/>
+        </w:rPr>
+        <w:t>)</w:t>
+      </w:r>
+      <w:r>
+        <w:rPr>
+          <w:sz w:val="21"/>
+          <w:szCs w:val="21"/>
+        </w:rPr>
+        <w:t xml:space="preserve"> for document verification</w:t>
+      </w:r>
+      <w:r>
+        <w:rPr>
+          <w:sz w:val="21"/>
+          <w:szCs w:val="21"/>
+        </w:rPr>
+        <w:t xml:space="preserve"> and </w:t>
+      </w:r>
+      <w:r>
+        <w:rPr>
+          <w:sz w:val="21"/>
+          <w:szCs w:val="21"/>
+        </w:rPr>
+        <w:t>tracking</w:t>
+      </w:r>
+      <w:r>
+        <w:rPr>
+          <w:sz w:val="21"/>
+          <w:szCs w:val="21"/>
+        </w:rPr>
+        <w:t xml:space="preserve"> application progress</w:t>
       </w:r>
       <w:r>
         <w:rPr>
@@ -1065,7 +1239,7 @@
           <w:sz w:val="21"/>
           <w:szCs w:val="21"/>
         </w:rPr>
-        <w:t xml:space="preserve">London, UK | 2017 – 2023  </w:t>
+        <w:t xml:space="preserve">London | 2017 – 2023  </w:t>
       </w:r>
     </w:p>
     <w:p>
@@ -1087,7 +1261,21 @@
           <w:sz w:val="21"/>
           <w:szCs w:val="21"/>
         </w:rPr>
-        <w:t xml:space="preserve">Delivered orders efficiently while maintaining high customer satisfaction  </w:t>
+        <w:t xml:space="preserve">Delivered orders efficiently while maintaining high customer satisfaction </w:t>
+      </w:r>
+      <w:r>
+        <w:rPr>
+          <w:sz w:val="21"/>
+          <w:szCs w:val="21"/>
+        </w:rPr>
+        <w:t>in a fast-paced environment</w:t>
+      </w:r>
+      <w:r>
+        <w:rPr>
+          <w:sz w:val="21"/>
+          <w:szCs w:val="21"/>
+        </w:rPr>
+        <w:t xml:space="preserve"> </w:t>
       </w:r>
     </w:p>
     <w:p>
@@ -1109,7 +1297,21 @@
           <w:sz w:val="21"/>
           <w:szCs w:val="21"/>
         </w:rPr>
-        <w:t xml:space="preserve">Developed strong time management and route optimisation skills  </w:t>
+        <w:t xml:space="preserve">Developed strong time management and route optimisation skills </w:t>
+      </w:r>
+      <w:r>
+        <w:rPr>
+          <w:sz w:val="21"/>
+          <w:szCs w:val="21"/>
+        </w:rPr>
+        <w:t>working independently</w:t>
+      </w:r>
+      <w:r>
+        <w:rPr>
+          <w:sz w:val="21"/>
+          <w:szCs w:val="21"/>
+        </w:rPr>
+        <w:t xml:space="preserve"> </w:t>
       </w:r>
     </w:p>
     <w:p>
@@ -1131,7 +1333,21 @@
           <w:sz w:val="21"/>
           <w:szCs w:val="21"/>
         </w:rPr>
-        <w:t xml:space="preserve">Communicated effectively with customers in fast-paced environments  </w:t>
+        <w:t xml:space="preserve">Communicated effectively with customers </w:t>
+      </w:r>
+      <w:r>
+        <w:rPr>
+          <w:sz w:val="21"/>
+          <w:szCs w:val="21"/>
+        </w:rPr>
+        <w:t>and handled issues in real-time</w:t>
+      </w:r>
+      <w:r>
+        <w:rPr>
+          <w:sz w:val="21"/>
+          <w:szCs w:val="21"/>
+        </w:rPr>
+        <w:t xml:space="preserve"> </w:t>
       </w:r>
     </w:p>
     <w:p>
@@ -1198,7 +1414,7 @@
           <w:sz w:val="21"/>
           <w:szCs w:val="21"/>
         </w:rPr>
-        <w:t xml:space="preserve">Greenwich School of Management – London  </w:t>
+        <w:t xml:space="preserve">Greenwich School of Management  </w:t>
       </w:r>
     </w:p>
     <w:p>
@@ -1374,7 +1590,49 @@
           <w:sz w:val="21"/>
           <w:szCs w:val="21"/>
         </w:rPr>
-        <w:t>Building coding projects and continuing to develop my C# / .NET skills outside of the bootcamp</w:t>
+        <w:t xml:space="preserve">Building </w:t>
+      </w:r>
+      <w:r>
+        <w:rPr>
+          <w:sz w:val="21"/>
+          <w:szCs w:val="21"/>
+        </w:rPr>
+        <w:t xml:space="preserve">personal </w:t>
+      </w:r>
+      <w:r>
+        <w:rPr>
+          <w:sz w:val="21"/>
+          <w:szCs w:val="21"/>
+        </w:rPr>
+        <w:t xml:space="preserve">coding projects </w:t>
+      </w:r>
+      <w:r>
+        <w:rPr>
+          <w:sz w:val="21"/>
+          <w:szCs w:val="21"/>
+        </w:rPr>
+        <w:t>outside the bootcamp to strengthen</w:t>
+      </w:r>
+      <w:r>
+        <w:rPr>
+          <w:sz w:val="21"/>
+          <w:szCs w:val="21"/>
+        </w:rPr>
+        <w:t xml:space="preserve"> my C#/.NET skills</w:t>
+      </w:r>
+      <w:r>
+        <w:rPr>
+          <w:sz w:val="21"/>
+          <w:szCs w:val="21"/>
+        </w:rPr>
+        <w:t xml:space="preserve"> and</w:t>
+      </w:r>
+      <w:r>
+        <w:rPr>
+          <w:sz w:val="21"/>
+          <w:szCs w:val="21"/>
+        </w:rPr>
+        <w:t xml:space="preserve"> apply concepts in real scenarios</w:t>
       </w:r>
       <w:r>
         <w:rPr>
@@ -1403,14 +1661,21 @@
           <w:sz w:val="21"/>
           <w:szCs w:val="21"/>
         </w:rPr>
-        <w:t xml:space="preserve">Chess </w:t>
-      </w:r>
-      <w:r>
-        <w:rPr>
-          <w:sz w:val="21"/>
-          <w:szCs w:val="21"/>
-        </w:rPr>
-        <w:t>– enjoy strategic thinking and problem solving</w:t>
+        <w:t xml:space="preserve">Building and upgrading </w:t>
+      </w:r>
+      <w:r>
+        <w:rPr>
+          <w:sz w:val="21"/>
+          <w:szCs w:val="21"/>
+        </w:rPr>
+        <w:t>computer systems</w:t>
+      </w:r>
+      <w:r>
+        <w:rPr>
+          <w:sz w:val="21"/>
+          <w:szCs w:val="21"/>
+        </w:rPr>
+        <w:t xml:space="preserve"> – interested in how hardware components work together and impact system performance</w:t>
       </w:r>
     </w:p>
     <w:p>
@@ -1432,21 +1697,56 @@
           <w:sz w:val="21"/>
           <w:szCs w:val="21"/>
         </w:rPr>
-        <w:t>Health</w:t>
-      </w:r>
-      <w:r>
-        <w:rPr>
-          <w:sz w:val="21"/>
-          <w:szCs w:val="21"/>
-        </w:rPr>
-        <w:t xml:space="preserve"> and fitness </w:t>
-      </w:r>
-      <w:r>
-        <w:rPr>
-          <w:sz w:val="21"/>
-          <w:szCs w:val="21"/>
-        </w:rPr>
-        <w:t>– value discipline, consistency, and personal progress</w:t>
+        <w:t xml:space="preserve">Strength </w:t>
+      </w:r>
+      <w:r>
+        <w:rPr>
+          <w:sz w:val="21"/>
+          <w:szCs w:val="21"/>
+        </w:rPr>
+        <w:t>t</w:t>
+      </w:r>
+      <w:r>
+        <w:rPr>
+          <w:sz w:val="21"/>
+          <w:szCs w:val="21"/>
+        </w:rPr>
+        <w:t>raining</w:t>
+      </w:r>
+      <w:r>
+        <w:rPr>
+          <w:sz w:val="21"/>
+          <w:szCs w:val="21"/>
+        </w:rPr>
+        <w:t>, c</w:t>
+      </w:r>
+      <w:r>
+        <w:rPr>
+          <w:sz w:val="21"/>
+          <w:szCs w:val="21"/>
+        </w:rPr>
+        <w:t>ardio</w:t>
+      </w:r>
+      <w:r>
+        <w:rPr>
+          <w:sz w:val="21"/>
+          <w:szCs w:val="21"/>
+        </w:rPr>
+        <w:t xml:space="preserve"> and healthy eating</w:t>
+      </w:r>
+      <w:r>
+        <w:rPr>
+          <w:sz w:val="21"/>
+          <w:szCs w:val="21"/>
+        </w:rPr>
+        <w:t xml:space="preserve"> – built a consistent routine after recognising the importance of long-term health, improving discipline and lifestyle </w:t>
+      </w:r>
+      <w:r>
+        <w:rPr>
+          <w:sz w:val="21"/>
+          <w:szCs w:val="21"/>
+        </w:rPr>
+        <w:t>habits</w:t>
       </w:r>
     </w:p>
     <w:p>
@@ -1468,7 +1768,63 @@
           <w:sz w:val="21"/>
           <w:szCs w:val="21"/>
         </w:rPr>
-        <w:t>Following technology developments, including new devices, computing hardware, AI, and blockchain innovation</w:t>
+        <w:t xml:space="preserve">Following developments in technology, including AI and emerging technologies, </w:t>
+      </w:r>
+      <w:r>
+        <w:rPr>
+          <w:sz w:val="21"/>
+          <w:szCs w:val="21"/>
+        </w:rPr>
+        <w:t>to</w:t>
+      </w:r>
+      <w:r>
+        <w:rPr>
+          <w:sz w:val="21"/>
+          <w:szCs w:val="21"/>
+        </w:rPr>
+        <w:t xml:space="preserve"> stay up to date</w:t>
+      </w:r>
+      <w:r>
+        <w:rPr>
+          <w:sz w:val="21"/>
+          <w:szCs w:val="21"/>
+        </w:rPr>
+        <w:t xml:space="preserve"> with new features;</w:t>
+      </w:r>
+      <w:r>
+        <w:rPr>
+          <w:sz w:val="21"/>
+          <w:szCs w:val="21"/>
+        </w:rPr>
+        <w:t xml:space="preserve"> previously</w:t>
+      </w:r>
+      <w:r>
+        <w:rPr>
+          <w:sz w:val="21"/>
+          <w:szCs w:val="21"/>
+        </w:rPr>
+        <w:t xml:space="preserve"> built and ran a small</w:t>
+      </w:r>
+      <w:r>
+        <w:rPr>
+          <w:sz w:val="21"/>
+          <w:szCs w:val="21"/>
+        </w:rPr>
+        <w:t xml:space="preserve"> GPU-based cryptocurrency mining</w:t>
+      </w:r>
+      <w:r>
+        <w:rPr>
+          <w:sz w:val="21"/>
+          <w:szCs w:val="21"/>
+        </w:rPr>
+        <w:t xml:space="preserve"> </w:t>
+      </w:r>
+      <w:r>
+        <w:rPr>
+          <w:sz w:val="21"/>
+          <w:szCs w:val="21"/>
+        </w:rPr>
+        <w:t>rig</w:t>
       </w:r>
     </w:p>
     <w:sectPr>
@@ -4620,7 +4976,6 @@
   <w:style w:type="character" w:default="1" w:styleId="DefaultParagraphFont">
     <w:name w:val="Default Paragraph Font"/>
     <w:uiPriority w:val="1"/>
-    <w:semiHidden/>
     <w:unhideWhenUsed/>
   </w:style>
   <w:style w:type="table" w:default="1" w:styleId="TableNormal">

</xml_diff>

<commit_message>
Update CV after completing Northcoders bootcamp
</commit_message>
<xml_diff>
--- a/Nazmul_Hussain_CV.docx
+++ b/Nazmul_Hussain_CV.docx
@@ -1,6 +1,6 @@
 
 <file path=word/document.xml><?xml version="1.0" encoding="utf-8"?>
-<w:document xmlns:wpc="http://schemas.microsoft.com/office/word/2010/wordprocessingCanvas" xmlns:cx="http://schemas.microsoft.com/office/drawing/2014/chartex" xmlns:cx1="http://schemas.microsoft.com/office/drawing/2015/9/8/chartex" xmlns:cx2="http://schemas.microsoft.com/office/drawing/2015/10/21/chartex" xmlns:cx3="http://schemas.microsoft.com/office/drawing/2016/5/9/chartex" xmlns:cx4="http://schemas.microsoft.com/office/drawing/2016/5/10/chartex" xmlns:cx5="http://schemas.microsoft.com/office/drawing/2016/5/11/chartex" xmlns:cx6="http://schemas.microsoft.com/office/drawing/2016/5/12/chartex" xmlns:cx7="http://schemas.microsoft.com/office/drawing/2016/5/13/chartex" xmlns:cx8="http://schemas.microsoft.com/office/drawing/2016/5/14/chartex" xmlns:mc="http://schemas.openxmlformats.org/markup-compatibility/2006" xmlns:aink="http://schemas.microsoft.com/office/drawing/2016/ink" xmlns:am3d="http://schemas.microsoft.com/office/drawing/2017/model3d" xmlns:o="urn:schemas-microsoft-com:office:office" xmlns:oel="http://schemas.microsoft.com/office/2019/extlst" xmlns:r="http://schemas.openxmlformats.org/officeDocument/2006/relationships" xmlns:m="http://schemas.openxmlformats.org/officeDocument/2006/math" xmlns:v="urn:schemas-microsoft-com:vml" xmlns:wp14="http://schemas.microsoft.com/office/word/2010/wordprocessingDrawing" xmlns:wp="http://schemas.openxmlformats.org/drawingml/2006/wordprocessingDrawing" xmlns:w10="urn:schemas-microsoft-com:office:word" xmlns:w="http://schemas.openxmlformats.org/wordprocessingml/2006/main" xmlns:w14="http://schemas.microsoft.com/office/word/2010/wordml" xmlns:w15="http://schemas.microsoft.com/office/word/2012/wordml" xmlns:w16cex="http://schemas.microsoft.com/office/word/2018/wordml/cex" xmlns:w16cid="http://schemas.microsoft.com/office/word/2016/wordml/cid" xmlns:w16="http://schemas.microsoft.com/office/word/2018/wordml" xmlns:w16du="http://schemas.microsoft.com/office/word/2023/wordml/word16du" xmlns:w16sdtdh="http://schemas.microsoft.com/office/word/2020/wordml/sdtdatahash" xmlns:w16sdtfl="http://schemas.microsoft.com/office/word/2024/wordml/sdtformatlock" xmlns:w16se="http://schemas.microsoft.com/office/word/2015/wordml/symex" xmlns:wpg="http://schemas.microsoft.com/office/word/2010/wordprocessingGroup" xmlns:wpi="http://schemas.microsoft.com/office/word/2010/wordprocessingInk" xmlns:wne="http://schemas.microsoft.com/office/word/2006/wordml" xmlns:wps="http://schemas.microsoft.com/office/word/2010/wordprocessingShape" mc:Ignorable="w14 w15 w16se w16cid w16 w16cex w16sdtdh w16sdtfl w16du wp14">
+<w:document xmlns:wpc="http://schemas.microsoft.com/office/word/2010/wordprocessingCanvas" xmlns:cx="http://schemas.microsoft.com/office/drawing/2014/chartex" xmlns:cx1="http://schemas.microsoft.com/office/drawing/2015/9/8/chartex" xmlns:cx2="http://schemas.microsoft.com/office/drawing/2015/10/21/chartex" xmlns:cx3="http://schemas.microsoft.com/office/drawing/2016/5/9/chartex" xmlns:cx4="http://schemas.microsoft.com/office/drawing/2016/5/10/chartex" xmlns:cx5="http://schemas.microsoft.com/office/drawing/2016/5/11/chartex" xmlns:cx6="http://schemas.microsoft.com/office/drawing/2016/5/12/chartex" xmlns:cx7="http://schemas.microsoft.com/office/drawing/2016/5/13/chartex" xmlns:cx8="http://schemas.microsoft.com/office/drawing/2016/5/14/chartex" xmlns:mc="http://schemas.openxmlformats.org/markup-compatibility/2006" xmlns:aink="http://schemas.microsoft.com/office/drawing/2016/ink" xmlns:am3d="http://schemas.microsoft.com/office/drawing/2017/model3d" xmlns:o="urn:schemas-microsoft-com:office:office" xmlns:oel="http://schemas.microsoft.com/office/2019/extlst" xmlns:r="http://schemas.openxmlformats.org/officeDocument/2006/relationships" xmlns:m="http://schemas.openxmlformats.org/officeDocument/2006/math" xmlns:v="urn:schemas-microsoft-com:vml" xmlns:wp14="http://schemas.microsoft.com/office/word/2010/wordprocessingDrawing" xmlns:wp="http://schemas.openxmlformats.org/drawingml/2006/wordprocessingDrawing" xmlns:w10="urn:schemas-microsoft-com:office:word" xmlns:w="http://schemas.openxmlformats.org/wordprocessingml/2006/main" xmlns:w14="http://schemas.microsoft.com/office/word/2010/wordml" xmlns:w15="http://schemas.microsoft.com/office/word/2012/wordml" xmlns:w16cei="http://schemas.microsoft.com/office/word/2026/wordml/cei" xmlns:w16cex="http://schemas.microsoft.com/office/word/2018/wordml/cex" xmlns:w16cid="http://schemas.microsoft.com/office/word/2016/wordml/cid" xmlns:w16="http://schemas.microsoft.com/office/word/2018/wordml" xmlns:w16du="http://schemas.microsoft.com/office/word/2023/wordml/word16du" xmlns:w16sdtdh="http://schemas.microsoft.com/office/word/2020/wordml/sdtdatahash" xmlns:w16sdtfl="http://schemas.microsoft.com/office/word/2024/wordml/sdtformatlock" xmlns:w16se="http://schemas.microsoft.com/office/word/2015/wordml/symex" xmlns:wpg="http://schemas.microsoft.com/office/word/2010/wordprocessingGroup" xmlns:wpi="http://schemas.microsoft.com/office/word/2010/wordprocessingInk" xmlns:wne="http://schemas.microsoft.com/office/word/2006/wordml" xmlns:wps="http://schemas.microsoft.com/office/word/2010/wordprocessingShape" mc:Ignorable="w14 w15 w16se w16cid w16 w16cex w16sdtdh w16sdtfl w16du wp14">
   <w:body>
     <w:p>
       <w:pPr>
@@ -58,6 +58,10 @@
       <w:pPr>
         <w:spacing w:after="0" w:line="240" w:lineRule="auto"/>
         <w:jc w:val="both"/>
+        <w:rPr>
+          <w:sz w:val="16"/>
+          <w:szCs w:val="16"/>
+        </w:rPr>
       </w:pPr>
     </w:p>
     <w:p>
@@ -213,10 +217,16 @@
         <w:spacing w:after="0" w:line="240" w:lineRule="auto"/>
         <w:ind w:right="50"/>
         <w:jc w:val="both"/>
+        <w:rPr>
+          <w:sz w:val="16"/>
+          <w:szCs w:val="16"/>
+        </w:rPr>
       </w:pPr>
       <w:r>
         <w:rPr>
           <w:b/>
+          <w:sz w:val="16"/>
+          <w:szCs w:val="16"/>
         </w:rPr>
         <w:t xml:space="preserve"> </w:t>
       </w:r>
@@ -369,8 +379,8 @@
         <w:ind w:left="0" w:firstLine="0"/>
         <w:jc w:val="both"/>
         <w:rPr>
-          <w:sz w:val="21"/>
-          <w:szCs w:val="21"/>
+          <w:sz w:val="10"/>
+          <w:szCs w:val="10"/>
         </w:rPr>
       </w:pPr>
     </w:p>
@@ -398,8 +408,8 @@
         <w:ind w:left="0" w:firstLine="0"/>
         <w:jc w:val="both"/>
         <w:rPr>
-          <w:sz w:val="21"/>
-          <w:szCs w:val="21"/>
+          <w:sz w:val="10"/>
+          <w:szCs w:val="10"/>
         </w:rPr>
       </w:pPr>
     </w:p>
@@ -428,15 +438,15 @@
         <w:jc w:val="both"/>
         <w:rPr>
           <w:b/>
-          <w:sz w:val="21"/>
-          <w:szCs w:val="21"/>
+          <w:sz w:val="16"/>
+          <w:szCs w:val="16"/>
         </w:rPr>
       </w:pPr>
       <w:r>
         <w:rPr>
           <w:b/>
-          <w:sz w:val="21"/>
-          <w:szCs w:val="21"/>
+          <w:sz w:val="16"/>
+          <w:szCs w:val="16"/>
         </w:rPr>
         <w:t xml:space="preserve"> </w:t>
       </w:r>
@@ -488,7 +498,28 @@
           <w:sz w:val="21"/>
           <w:szCs w:val="21"/>
         </w:rPr>
-        <w:t xml:space="preserve"> C#, .NET, </w:t>
+        <w:t xml:space="preserve"> </w:t>
+      </w:r>
+      <w:r>
+        <w:rPr>
+          <w:sz w:val="21"/>
+          <w:szCs w:val="21"/>
+        </w:rPr>
+        <w:tab/>
+      </w:r>
+      <w:r>
+        <w:rPr>
+          <w:sz w:val="21"/>
+          <w:szCs w:val="21"/>
+        </w:rPr>
+        <w:tab/>
+      </w:r>
+      <w:r>
+        <w:rPr>
+          <w:sz w:val="21"/>
+          <w:szCs w:val="21"/>
+        </w:rPr>
+        <w:t xml:space="preserve">C#, .NET, </w:t>
       </w:r>
       <w:r>
         <w:rPr>
@@ -528,14 +559,60 @@
           <w:sz w:val="21"/>
           <w:szCs w:val="21"/>
         </w:rPr>
-        <w:t xml:space="preserve"> Test-Driven Development (TDD), NUnit, </w:t>
-      </w:r>
-      <w:r>
-        <w:rPr>
-          <w:sz w:val="21"/>
-          <w:szCs w:val="21"/>
-        </w:rPr>
-        <w:t xml:space="preserve">Shouldly, </w:t>
+        <w:t xml:space="preserve"> </w:t>
+      </w:r>
+      <w:r>
+        <w:rPr>
+          <w:sz w:val="21"/>
+          <w:szCs w:val="21"/>
+        </w:rPr>
+        <w:tab/>
+      </w:r>
+      <w:r>
+        <w:rPr>
+          <w:sz w:val="21"/>
+          <w:szCs w:val="21"/>
+        </w:rPr>
+        <w:tab/>
+      </w:r>
+      <w:r>
+        <w:rPr>
+          <w:sz w:val="21"/>
+          <w:szCs w:val="21"/>
+        </w:rPr>
+        <w:t xml:space="preserve">Test-Driven Development (TDD), </w:t>
+      </w:r>
+      <w:proofErr w:type="spellStart"/>
+      <w:r>
+        <w:rPr>
+          <w:sz w:val="21"/>
+          <w:szCs w:val="21"/>
+        </w:rPr>
+        <w:t>NUnit</w:t>
+      </w:r>
+      <w:proofErr w:type="spellEnd"/>
+      <w:r>
+        <w:rPr>
+          <w:sz w:val="21"/>
+          <w:szCs w:val="21"/>
+        </w:rPr>
+        <w:t xml:space="preserve">, </w:t>
+      </w:r>
+      <w:proofErr w:type="spellStart"/>
+      <w:r>
+        <w:rPr>
+          <w:sz w:val="21"/>
+          <w:szCs w:val="21"/>
+        </w:rPr>
+        <w:t>Shouldly</w:t>
+      </w:r>
+      <w:proofErr w:type="spellEnd"/>
+      <w:r>
+        <w:rPr>
+          <w:sz w:val="21"/>
+          <w:szCs w:val="21"/>
+        </w:rPr>
+        <w:t xml:space="preserve">, </w:t>
       </w:r>
       <w:r>
         <w:rPr>
@@ -575,7 +652,35 @@
           <w:sz w:val="21"/>
           <w:szCs w:val="21"/>
         </w:rPr>
-        <w:t xml:space="preserve"> ASP.NET Core, MVC</w:t>
+        <w:t xml:space="preserve"> </w:t>
+      </w:r>
+      <w:r>
+        <w:rPr>
+          <w:sz w:val="21"/>
+          <w:szCs w:val="21"/>
+        </w:rPr>
+        <w:tab/>
+      </w:r>
+      <w:r>
+        <w:rPr>
+          <w:sz w:val="21"/>
+          <w:szCs w:val="21"/>
+        </w:rPr>
+        <w:tab/>
+      </w:r>
+      <w:r>
+        <w:rPr>
+          <w:sz w:val="21"/>
+          <w:szCs w:val="21"/>
+        </w:rPr>
+        <w:tab/>
+      </w:r>
+      <w:r>
+        <w:rPr>
+          <w:sz w:val="21"/>
+          <w:szCs w:val="21"/>
+        </w:rPr>
+        <w:t>ASP.NET Core, MVC</w:t>
       </w:r>
       <w:r>
         <w:rPr>
@@ -589,21 +694,7 @@
           <w:sz w:val="21"/>
           <w:szCs w:val="21"/>
         </w:rPr>
-        <w:t xml:space="preserve">, Dependency Injection, </w:t>
-      </w:r>
-      <w:r>
-        <w:rPr>
-          <w:sz w:val="21"/>
-          <w:szCs w:val="21"/>
-        </w:rPr>
-        <w:t>Entity Framework Core</w:t>
-      </w:r>
-      <w:r>
-        <w:rPr>
-          <w:sz w:val="21"/>
-          <w:szCs w:val="21"/>
-        </w:rPr>
-        <w:t xml:space="preserve"> </w:t>
+        <w:t xml:space="preserve">, Dependency Injection, Entity Framework Core </w:t>
       </w:r>
     </w:p>
     <w:p>
@@ -647,7 +738,28 @@
           <w:sz w:val="21"/>
           <w:szCs w:val="21"/>
         </w:rPr>
-        <w:t xml:space="preserve"> SQL Server, </w:t>
+        <w:t xml:space="preserve"> </w:t>
+      </w:r>
+      <w:r>
+        <w:rPr>
+          <w:sz w:val="21"/>
+          <w:szCs w:val="21"/>
+        </w:rPr>
+        <w:tab/>
+      </w:r>
+      <w:r>
+        <w:rPr>
+          <w:sz w:val="21"/>
+          <w:szCs w:val="21"/>
+        </w:rPr>
+        <w:tab/>
+      </w:r>
+      <w:r>
+        <w:rPr>
+          <w:sz w:val="21"/>
+          <w:szCs w:val="21"/>
+        </w:rPr>
+        <w:t xml:space="preserve">SQL Server, </w:t>
       </w:r>
       <w:r>
         <w:rPr>
@@ -687,7 +799,42 @@
           <w:sz w:val="21"/>
           <w:szCs w:val="21"/>
         </w:rPr>
-        <w:t xml:space="preserve"> Git, GitHub, Visual Studio, VS Code, PowerShell</w:t>
+        <w:t xml:space="preserve"> </w:t>
+      </w:r>
+      <w:r>
+        <w:rPr>
+          <w:sz w:val="21"/>
+          <w:szCs w:val="21"/>
+        </w:rPr>
+        <w:tab/>
+      </w:r>
+      <w:r>
+        <w:rPr>
+          <w:sz w:val="21"/>
+          <w:szCs w:val="21"/>
+        </w:rPr>
+        <w:tab/>
+      </w:r>
+      <w:r>
+        <w:rPr>
+          <w:sz w:val="21"/>
+          <w:szCs w:val="21"/>
+        </w:rPr>
+        <w:tab/>
+      </w:r>
+      <w:r>
+        <w:rPr>
+          <w:sz w:val="21"/>
+          <w:szCs w:val="21"/>
+        </w:rPr>
+        <w:tab/>
+      </w:r>
+      <w:r>
+        <w:rPr>
+          <w:sz w:val="21"/>
+          <w:szCs w:val="21"/>
+        </w:rPr>
+        <w:t>Git, GitHub, Visual Studio, VS Code, PowerShell</w:t>
       </w:r>
       <w:r>
         <w:rPr>
@@ -743,6 +890,27 @@
           <w:sz w:val="21"/>
           <w:szCs w:val="21"/>
         </w:rPr>
+        <w:tab/>
+      </w:r>
+      <w:r>
+        <w:rPr>
+          <w:sz w:val="21"/>
+          <w:szCs w:val="21"/>
+        </w:rPr>
+        <w:tab/>
+      </w:r>
+      <w:r>
+        <w:rPr>
+          <w:sz w:val="21"/>
+          <w:szCs w:val="21"/>
+        </w:rPr>
+        <w:tab/>
+      </w:r>
+      <w:r>
+        <w:rPr>
+          <w:sz w:val="21"/>
+          <w:szCs w:val="21"/>
+        </w:rPr>
         <w:t xml:space="preserve">Blazor, </w:t>
       </w:r>
       <w:r>
@@ -758,8 +926,8 @@
         <w:spacing w:after="0" w:line="240" w:lineRule="auto"/>
         <w:jc w:val="both"/>
         <w:rPr>
-          <w:sz w:val="21"/>
-          <w:szCs w:val="21"/>
+          <w:sz w:val="16"/>
+          <w:szCs w:val="16"/>
         </w:rPr>
       </w:pPr>
     </w:p>
@@ -887,8 +1055,8 @@
         <w:rPr>
           <w:b/>
           <w:bCs/>
-          <w:sz w:val="21"/>
-          <w:szCs w:val="21"/>
+          <w:sz w:val="10"/>
+          <w:szCs w:val="10"/>
         </w:rPr>
       </w:pPr>
     </w:p>
@@ -1213,8 +1381,8 @@
         <w:rPr>
           <w:b/>
           <w:bCs/>
-          <w:sz w:val="21"/>
-          <w:szCs w:val="21"/>
+          <w:sz w:val="10"/>
+          <w:szCs w:val="10"/>
         </w:rPr>
       </w:pPr>
     </w:p>
@@ -1309,8 +1477,8 @@
         <w:ind w:left="0" w:firstLine="0"/>
         <w:jc w:val="both"/>
         <w:rPr>
-          <w:sz w:val="21"/>
-          <w:szCs w:val="21"/>
+          <w:sz w:val="10"/>
+          <w:szCs w:val="10"/>
         </w:rPr>
       </w:pPr>
     </w:p>
@@ -1654,8 +1822,8 @@
         <w:spacing w:after="0" w:line="240" w:lineRule="auto"/>
         <w:jc w:val="both"/>
         <w:rPr>
-          <w:sz w:val="21"/>
-          <w:szCs w:val="21"/>
+          <w:sz w:val="16"/>
+          <w:szCs w:val="16"/>
         </w:rPr>
       </w:pPr>
     </w:p>
@@ -1680,7 +1848,6 @@
           <w:sz w:val="26"/>
           <w:szCs w:val="26"/>
         </w:rPr>
-        <w:lastRenderedPageBreak/>
         <w:t>Professional Development</w:t>
       </w:r>
     </w:p>
@@ -1860,6 +2027,10 @@
       <w:pPr>
         <w:spacing w:after="0" w:line="240" w:lineRule="auto"/>
         <w:jc w:val="both"/>
+        <w:rPr>
+          <w:sz w:val="10"/>
+          <w:szCs w:val="10"/>
+        </w:rPr>
       </w:pPr>
     </w:p>
     <w:p>
@@ -1972,8 +2143,8 @@
         <w:spacing w:after="0" w:line="240" w:lineRule="auto"/>
         <w:jc w:val="both"/>
         <w:rPr>
-          <w:sz w:val="21"/>
-          <w:szCs w:val="21"/>
+          <w:sz w:val="10"/>
+          <w:szCs w:val="10"/>
         </w:rPr>
       </w:pPr>
     </w:p>
@@ -2044,13 +2215,23 @@
         <w:spacing w:after="0" w:line="240" w:lineRule="auto"/>
         <w:ind w:firstLine="0"/>
         <w:jc w:val="both"/>
-      </w:pPr>
-      <w:r>
+        <w:rPr>
+          <w:sz w:val="16"/>
+          <w:szCs w:val="16"/>
+        </w:rPr>
+      </w:pPr>
+      <w:r>
+        <w:rPr>
+          <w:sz w:val="16"/>
+          <w:szCs w:val="16"/>
+        </w:rPr>
         <w:t xml:space="preserve"> </w:t>
       </w:r>
       <w:r>
         <w:rPr>
           <w:b/>
+          <w:sz w:val="16"/>
+          <w:szCs w:val="16"/>
         </w:rPr>
         <w:t xml:space="preserve"> </w:t>
       </w:r>
@@ -2397,6 +2578,10 @@
         <w:spacing w:after="0" w:line="240" w:lineRule="auto"/>
         <w:ind w:left="357" w:firstLine="0"/>
         <w:jc w:val="both"/>
+        <w:rPr>
+          <w:sz w:val="10"/>
+          <w:szCs w:val="10"/>
+        </w:rPr>
       </w:pPr>
     </w:p>
     <w:p>
@@ -2600,13 +2785,15 @@
         <w:ind w:firstLine="0"/>
         <w:jc w:val="both"/>
         <w:rPr>
-          <w:sz w:val="21"/>
-          <w:szCs w:val="21"/>
+          <w:sz w:val="16"/>
+          <w:szCs w:val="16"/>
         </w:rPr>
       </w:pPr>
       <w:r>
         <w:rPr>
           <w:b/>
+          <w:sz w:val="16"/>
+          <w:szCs w:val="16"/>
         </w:rPr>
         <w:t xml:space="preserve"> </w:t>
       </w:r>
@@ -2727,8 +2914,8 @@
         <w:spacing w:after="0" w:line="240" w:lineRule="auto"/>
         <w:jc w:val="both"/>
         <w:rPr>
-          <w:sz w:val="21"/>
-          <w:szCs w:val="21"/>
+          <w:sz w:val="10"/>
+          <w:szCs w:val="10"/>
         </w:rPr>
       </w:pPr>
     </w:p>
@@ -2816,8 +3003,8 @@
         <w:ind w:left="705" w:right="50" w:firstLine="0"/>
         <w:jc w:val="both"/>
         <w:rPr>
-          <w:sz w:val="21"/>
-          <w:szCs w:val="21"/>
+          <w:sz w:val="16"/>
+          <w:szCs w:val="16"/>
         </w:rPr>
       </w:pPr>
     </w:p>
@@ -3106,8 +3293,8 @@
       </w:r>
     </w:p>
     <w:sectPr>
-      <w:pgSz w:w="11906" w:h="16838"/>
-      <w:pgMar w:top="720" w:right="720" w:bottom="720" w:left="720" w:header="720" w:footer="720" w:gutter="0"/>
+      <w:pgSz w:w="11906" w:h="16838" w:code="9"/>
+      <w:pgMar w:top="1134" w:right="1134" w:bottom="1134" w:left="1134" w:header="720" w:footer="720" w:gutter="0"/>
       <w:cols w:space="720"/>
       <w:docGrid w:linePitch="299"/>
     </w:sectPr>
@@ -3116,7 +3303,7 @@
 </file>
 
 <file path=word/endnotes.xml><?xml version="1.0" encoding="utf-8"?>
-<w:endnotes xmlns:wpc="http://schemas.microsoft.com/office/word/2010/wordprocessingCanvas" xmlns:cx="http://schemas.microsoft.com/office/drawing/2014/chartex" xmlns:cx1="http://schemas.microsoft.com/office/drawing/2015/9/8/chartex" xmlns:cx2="http://schemas.microsoft.com/office/drawing/2015/10/21/chartex" xmlns:cx3="http://schemas.microsoft.com/office/drawing/2016/5/9/chartex" xmlns:cx4="http://schemas.microsoft.com/office/drawing/2016/5/10/chartex" xmlns:cx5="http://schemas.microsoft.com/office/drawing/2016/5/11/chartex" xmlns:cx6="http://schemas.microsoft.com/office/drawing/2016/5/12/chartex" xmlns:cx7="http://schemas.microsoft.com/office/drawing/2016/5/13/chartex" xmlns:cx8="http://schemas.microsoft.com/office/drawing/2016/5/14/chartex" xmlns:mc="http://schemas.openxmlformats.org/markup-compatibility/2006" xmlns:aink="http://schemas.microsoft.com/office/drawing/2016/ink" xmlns:am3d="http://schemas.microsoft.com/office/drawing/2017/model3d" xmlns:o="urn:schemas-microsoft-com:office:office" xmlns:oel="http://schemas.microsoft.com/office/2019/extlst" xmlns:r="http://schemas.openxmlformats.org/officeDocument/2006/relationships" xmlns:m="http://schemas.openxmlformats.org/officeDocument/2006/math" xmlns:v="urn:schemas-microsoft-com:vml" xmlns:wp14="http://schemas.microsoft.com/office/word/2010/wordprocessingDrawing" xmlns:wp="http://schemas.openxmlformats.org/drawingml/2006/wordprocessingDrawing" xmlns:w10="urn:schemas-microsoft-com:office:word" xmlns:w="http://schemas.openxmlformats.org/wordprocessingml/2006/main" xmlns:w14="http://schemas.microsoft.com/office/word/2010/wordml" xmlns:w15="http://schemas.microsoft.com/office/word/2012/wordml" xmlns:w16cex="http://schemas.microsoft.com/office/word/2018/wordml/cex" xmlns:w16cid="http://schemas.microsoft.com/office/word/2016/wordml/cid" xmlns:w16="http://schemas.microsoft.com/office/word/2018/wordml" xmlns:w16du="http://schemas.microsoft.com/office/word/2023/wordml/word16du" xmlns:w16sdtdh="http://schemas.microsoft.com/office/word/2020/wordml/sdtdatahash" xmlns:w16sdtfl="http://schemas.microsoft.com/office/word/2024/wordml/sdtformatlock" xmlns:w16se="http://schemas.microsoft.com/office/word/2015/wordml/symex" xmlns:wpg="http://schemas.microsoft.com/office/word/2010/wordprocessingGroup" xmlns:wpi="http://schemas.microsoft.com/office/word/2010/wordprocessingInk" xmlns:wne="http://schemas.microsoft.com/office/word/2006/wordml" xmlns:wps="http://schemas.microsoft.com/office/word/2010/wordprocessingShape" mc:Ignorable="w14 w15 w16se w16cid w16 w16cex w16sdtdh w16sdtfl w16du wp14">
+<w:endnotes xmlns:wpc="http://schemas.microsoft.com/office/word/2010/wordprocessingCanvas" xmlns:cx="http://schemas.microsoft.com/office/drawing/2014/chartex" xmlns:cx1="http://schemas.microsoft.com/office/drawing/2015/9/8/chartex" xmlns:cx2="http://schemas.microsoft.com/office/drawing/2015/10/21/chartex" xmlns:cx3="http://schemas.microsoft.com/office/drawing/2016/5/9/chartex" xmlns:cx4="http://schemas.microsoft.com/office/drawing/2016/5/10/chartex" xmlns:cx5="http://schemas.microsoft.com/office/drawing/2016/5/11/chartex" xmlns:cx6="http://schemas.microsoft.com/office/drawing/2016/5/12/chartex" xmlns:cx7="http://schemas.microsoft.com/office/drawing/2016/5/13/chartex" xmlns:cx8="http://schemas.microsoft.com/office/drawing/2016/5/14/chartex" xmlns:mc="http://schemas.openxmlformats.org/markup-compatibility/2006" xmlns:aink="http://schemas.microsoft.com/office/drawing/2016/ink" xmlns:am3d="http://schemas.microsoft.com/office/drawing/2017/model3d" xmlns:o="urn:schemas-microsoft-com:office:office" xmlns:oel="http://schemas.microsoft.com/office/2019/extlst" xmlns:r="http://schemas.openxmlformats.org/officeDocument/2006/relationships" xmlns:m="http://schemas.openxmlformats.org/officeDocument/2006/math" xmlns:v="urn:schemas-microsoft-com:vml" xmlns:wp14="http://schemas.microsoft.com/office/word/2010/wordprocessingDrawing" xmlns:wp="http://schemas.openxmlformats.org/drawingml/2006/wordprocessingDrawing" xmlns:w10="urn:schemas-microsoft-com:office:word" xmlns:w="http://schemas.openxmlformats.org/wordprocessingml/2006/main" xmlns:w14="http://schemas.microsoft.com/office/word/2010/wordml" xmlns:w15="http://schemas.microsoft.com/office/word/2012/wordml" xmlns:w16cei="http://schemas.microsoft.com/office/word/2026/wordml/cei" xmlns:w16cex="http://schemas.microsoft.com/office/word/2018/wordml/cex" xmlns:w16cid="http://schemas.microsoft.com/office/word/2016/wordml/cid" xmlns:w16="http://schemas.microsoft.com/office/word/2018/wordml" xmlns:w16du="http://schemas.microsoft.com/office/word/2023/wordml/word16du" xmlns:w16sdtdh="http://schemas.microsoft.com/office/word/2020/wordml/sdtdatahash" xmlns:w16sdtfl="http://schemas.microsoft.com/office/word/2024/wordml/sdtformatlock" xmlns:w16se="http://schemas.microsoft.com/office/word/2015/wordml/symex" xmlns:wpg="http://schemas.microsoft.com/office/word/2010/wordprocessingGroup" xmlns:wpi="http://schemas.microsoft.com/office/word/2010/wordprocessingInk" xmlns:wne="http://schemas.microsoft.com/office/word/2006/wordml" xmlns:wps="http://schemas.microsoft.com/office/word/2010/wordprocessingShape" mc:Ignorable="w14 w15 w16se w16cid w16 w16cex w16sdtdh w16sdtfl w16du wp14">
   <w:endnote w:type="separator" w:id="-1">
     <w:p>
       <w:pPr>
@@ -3141,7 +3328,7 @@
 </file>
 
 <file path=word/footnotes.xml><?xml version="1.0" encoding="utf-8"?>
-<w:footnotes xmlns:wpc="http://schemas.microsoft.com/office/word/2010/wordprocessingCanvas" xmlns:cx="http://schemas.microsoft.com/office/drawing/2014/chartex" xmlns:cx1="http://schemas.microsoft.com/office/drawing/2015/9/8/chartex" xmlns:cx2="http://schemas.microsoft.com/office/drawing/2015/10/21/chartex" xmlns:cx3="http://schemas.microsoft.com/office/drawing/2016/5/9/chartex" xmlns:cx4="http://schemas.microsoft.com/office/drawing/2016/5/10/chartex" xmlns:cx5="http://schemas.microsoft.com/office/drawing/2016/5/11/chartex" xmlns:cx6="http://schemas.microsoft.com/office/drawing/2016/5/12/chartex" xmlns:cx7="http://schemas.microsoft.com/office/drawing/2016/5/13/chartex" xmlns:cx8="http://schemas.microsoft.com/office/drawing/2016/5/14/chartex" xmlns:mc="http://schemas.openxmlformats.org/markup-compatibility/2006" xmlns:aink="http://schemas.microsoft.com/office/drawing/2016/ink" xmlns:am3d="http://schemas.microsoft.com/office/drawing/2017/model3d" xmlns:o="urn:schemas-microsoft-com:office:office" xmlns:oel="http://schemas.microsoft.com/office/2019/extlst" xmlns:r="http://schemas.openxmlformats.org/officeDocument/2006/relationships" xmlns:m="http://schemas.openxmlformats.org/officeDocument/2006/math" xmlns:v="urn:schemas-microsoft-com:vml" xmlns:wp14="http://schemas.microsoft.com/office/word/2010/wordprocessingDrawing" xmlns:wp="http://schemas.openxmlformats.org/drawingml/2006/wordprocessingDrawing" xmlns:w10="urn:schemas-microsoft-com:office:word" xmlns:w="http://schemas.openxmlformats.org/wordprocessingml/2006/main" xmlns:w14="http://schemas.microsoft.com/office/word/2010/wordml" xmlns:w15="http://schemas.microsoft.com/office/word/2012/wordml" xmlns:w16cex="http://schemas.microsoft.com/office/word/2018/wordml/cex" xmlns:w16cid="http://schemas.microsoft.com/office/word/2016/wordml/cid" xmlns:w16="http://schemas.microsoft.com/office/word/2018/wordml" xmlns:w16du="http://schemas.microsoft.com/office/word/2023/wordml/word16du" xmlns:w16sdtdh="http://schemas.microsoft.com/office/word/2020/wordml/sdtdatahash" xmlns:w16sdtfl="http://schemas.microsoft.com/office/word/2024/wordml/sdtformatlock" xmlns:w16se="http://schemas.microsoft.com/office/word/2015/wordml/symex" xmlns:wpg="http://schemas.microsoft.com/office/word/2010/wordprocessingGroup" xmlns:wpi="http://schemas.microsoft.com/office/word/2010/wordprocessingInk" xmlns:wne="http://schemas.microsoft.com/office/word/2006/wordml" xmlns:wps="http://schemas.microsoft.com/office/word/2010/wordprocessingShape" mc:Ignorable="w14 w15 w16se w16cid w16 w16cex w16sdtdh w16sdtfl w16du wp14">
+<w:footnotes xmlns:wpc="http://schemas.microsoft.com/office/word/2010/wordprocessingCanvas" xmlns:cx="http://schemas.microsoft.com/office/drawing/2014/chartex" xmlns:cx1="http://schemas.microsoft.com/office/drawing/2015/9/8/chartex" xmlns:cx2="http://schemas.microsoft.com/office/drawing/2015/10/21/chartex" xmlns:cx3="http://schemas.microsoft.com/office/drawing/2016/5/9/chartex" xmlns:cx4="http://schemas.microsoft.com/office/drawing/2016/5/10/chartex" xmlns:cx5="http://schemas.microsoft.com/office/drawing/2016/5/11/chartex" xmlns:cx6="http://schemas.microsoft.com/office/drawing/2016/5/12/chartex" xmlns:cx7="http://schemas.microsoft.com/office/drawing/2016/5/13/chartex" xmlns:cx8="http://schemas.microsoft.com/office/drawing/2016/5/14/chartex" xmlns:mc="http://schemas.openxmlformats.org/markup-compatibility/2006" xmlns:aink="http://schemas.microsoft.com/office/drawing/2016/ink" xmlns:am3d="http://schemas.microsoft.com/office/drawing/2017/model3d" xmlns:o="urn:schemas-microsoft-com:office:office" xmlns:oel="http://schemas.microsoft.com/office/2019/extlst" xmlns:r="http://schemas.openxmlformats.org/officeDocument/2006/relationships" xmlns:m="http://schemas.openxmlformats.org/officeDocument/2006/math" xmlns:v="urn:schemas-microsoft-com:vml" xmlns:wp14="http://schemas.microsoft.com/office/word/2010/wordprocessingDrawing" xmlns:wp="http://schemas.openxmlformats.org/drawingml/2006/wordprocessingDrawing" xmlns:w10="urn:schemas-microsoft-com:office:word" xmlns:w="http://schemas.openxmlformats.org/wordprocessingml/2006/main" xmlns:w14="http://schemas.microsoft.com/office/word/2010/wordml" xmlns:w15="http://schemas.microsoft.com/office/word/2012/wordml" xmlns:w16cei="http://schemas.microsoft.com/office/word/2026/wordml/cei" xmlns:w16cex="http://schemas.microsoft.com/office/word/2018/wordml/cex" xmlns:w16cid="http://schemas.microsoft.com/office/word/2016/wordml/cid" xmlns:w16="http://schemas.microsoft.com/office/word/2018/wordml" xmlns:w16du="http://schemas.microsoft.com/office/word/2023/wordml/word16du" xmlns:w16sdtdh="http://schemas.microsoft.com/office/word/2020/wordml/sdtdatahash" xmlns:w16sdtfl="http://schemas.microsoft.com/office/word/2024/wordml/sdtformatlock" xmlns:w16se="http://schemas.microsoft.com/office/word/2015/wordml/symex" xmlns:wpg="http://schemas.microsoft.com/office/word/2010/wordprocessingGroup" xmlns:wpi="http://schemas.microsoft.com/office/word/2010/wordprocessingInk" xmlns:wne="http://schemas.microsoft.com/office/word/2006/wordml" xmlns:wps="http://schemas.microsoft.com/office/word/2010/wordprocessingShape" mc:Ignorable="w14 w15 w16se w16cid w16 w16cex w16sdtdh w16sdtfl w16du wp14">
   <w:footnote w:type="separator" w:id="-1">
     <w:p>
       <w:pPr>
@@ -3166,7 +3353,7 @@
 </file>
 
 <file path=word/numbering.xml><?xml version="1.0" encoding="utf-8"?>
-<w:numbering xmlns:wpc="http://schemas.microsoft.com/office/word/2010/wordprocessingCanvas" xmlns:cx="http://schemas.microsoft.com/office/drawing/2014/chartex" xmlns:cx1="http://schemas.microsoft.com/office/drawing/2015/9/8/chartex" xmlns:cx2="http://schemas.microsoft.com/office/drawing/2015/10/21/chartex" xmlns:cx3="http://schemas.microsoft.com/office/drawing/2016/5/9/chartex" xmlns:cx4="http://schemas.microsoft.com/office/drawing/2016/5/10/chartex" xmlns:cx5="http://schemas.microsoft.com/office/drawing/2016/5/11/chartex" xmlns:cx6="http://schemas.microsoft.com/office/drawing/2016/5/12/chartex" xmlns:cx7="http://schemas.microsoft.com/office/drawing/2016/5/13/chartex" xmlns:cx8="http://schemas.microsoft.com/office/drawing/2016/5/14/chartex" xmlns:mc="http://schemas.openxmlformats.org/markup-compatibility/2006" xmlns:aink="http://schemas.microsoft.com/office/drawing/2016/ink" xmlns:am3d="http://schemas.microsoft.com/office/drawing/2017/model3d" xmlns:o="urn:schemas-microsoft-com:office:office" xmlns:oel="http://schemas.microsoft.com/office/2019/extlst" xmlns:r="http://schemas.openxmlformats.org/officeDocument/2006/relationships" xmlns:m="http://schemas.openxmlformats.org/officeDocument/2006/math" xmlns:v="urn:schemas-microsoft-com:vml" xmlns:wp14="http://schemas.microsoft.com/office/word/2010/wordprocessingDrawing" xmlns:wp="http://schemas.openxmlformats.org/drawingml/2006/wordprocessingDrawing" xmlns:w10="urn:schemas-microsoft-com:office:word" xmlns:w="http://schemas.openxmlformats.org/wordprocessingml/2006/main" xmlns:w14="http://schemas.microsoft.com/office/word/2010/wordml" xmlns:w15="http://schemas.microsoft.com/office/word/2012/wordml" xmlns:w16cex="http://schemas.microsoft.com/office/word/2018/wordml/cex" xmlns:w16cid="http://schemas.microsoft.com/office/word/2016/wordml/cid" xmlns:w16="http://schemas.microsoft.com/office/word/2018/wordml" xmlns:w16du="http://schemas.microsoft.com/office/word/2023/wordml/word16du" xmlns:w16sdtdh="http://schemas.microsoft.com/office/word/2020/wordml/sdtdatahash" xmlns:w16sdtfl="http://schemas.microsoft.com/office/word/2024/wordml/sdtformatlock" xmlns:w16se="http://schemas.microsoft.com/office/word/2015/wordml/symex" xmlns:wpg="http://schemas.microsoft.com/office/word/2010/wordprocessingGroup" xmlns:wpi="http://schemas.microsoft.com/office/word/2010/wordprocessingInk" xmlns:wne="http://schemas.microsoft.com/office/word/2006/wordml" xmlns:wps="http://schemas.microsoft.com/office/word/2010/wordprocessingShape" mc:Ignorable="w14 w15 w16se w16cid w16 w16cex w16sdtdh w16sdtfl w16du wp14">
+<w:numbering xmlns:wpc="http://schemas.microsoft.com/office/word/2010/wordprocessingCanvas" xmlns:cx="http://schemas.microsoft.com/office/drawing/2014/chartex" xmlns:cx1="http://schemas.microsoft.com/office/drawing/2015/9/8/chartex" xmlns:cx2="http://schemas.microsoft.com/office/drawing/2015/10/21/chartex" xmlns:cx3="http://schemas.microsoft.com/office/drawing/2016/5/9/chartex" xmlns:cx4="http://schemas.microsoft.com/office/drawing/2016/5/10/chartex" xmlns:cx5="http://schemas.microsoft.com/office/drawing/2016/5/11/chartex" xmlns:cx6="http://schemas.microsoft.com/office/drawing/2016/5/12/chartex" xmlns:cx7="http://schemas.microsoft.com/office/drawing/2016/5/13/chartex" xmlns:cx8="http://schemas.microsoft.com/office/drawing/2016/5/14/chartex" xmlns:mc="http://schemas.openxmlformats.org/markup-compatibility/2006" xmlns:aink="http://schemas.microsoft.com/office/drawing/2016/ink" xmlns:am3d="http://schemas.microsoft.com/office/drawing/2017/model3d" xmlns:o="urn:schemas-microsoft-com:office:office" xmlns:oel="http://schemas.microsoft.com/office/2019/extlst" xmlns:r="http://schemas.openxmlformats.org/officeDocument/2006/relationships" xmlns:m="http://schemas.openxmlformats.org/officeDocument/2006/math" xmlns:v="urn:schemas-microsoft-com:vml" xmlns:wp14="http://schemas.microsoft.com/office/word/2010/wordprocessingDrawing" xmlns:wp="http://schemas.openxmlformats.org/drawingml/2006/wordprocessingDrawing" xmlns:w10="urn:schemas-microsoft-com:office:word" xmlns:w="http://schemas.openxmlformats.org/wordprocessingml/2006/main" xmlns:w14="http://schemas.microsoft.com/office/word/2010/wordml" xmlns:w15="http://schemas.microsoft.com/office/word/2012/wordml" xmlns:w16cei="http://schemas.microsoft.com/office/word/2026/wordml/cei" xmlns:w16cex="http://schemas.microsoft.com/office/word/2018/wordml/cex" xmlns:w16cid="http://schemas.microsoft.com/office/word/2016/wordml/cid" xmlns:w16="http://schemas.microsoft.com/office/word/2018/wordml" xmlns:w16du="http://schemas.microsoft.com/office/word/2023/wordml/word16du" xmlns:w16sdtdh="http://schemas.microsoft.com/office/word/2020/wordml/sdtdatahash" xmlns:w16sdtfl="http://schemas.microsoft.com/office/word/2024/wordml/sdtformatlock" xmlns:w16se="http://schemas.microsoft.com/office/word/2015/wordml/symex" xmlns:wpg="http://schemas.microsoft.com/office/word/2010/wordprocessingGroup" xmlns:wpi="http://schemas.microsoft.com/office/word/2010/wordprocessingInk" xmlns:wne="http://schemas.microsoft.com/office/word/2006/wordml" xmlns:wps="http://schemas.microsoft.com/office/word/2010/wordprocessingShape" mc:Ignorable="w14 w15 w16se w16cid w16 w16cex w16sdtdh w16sdtfl w16du wp14">
   <w:abstractNum w:abstractNumId="0" w15:restartNumberingAfterBreak="0">
     <w:nsid w:val="04C77AFA"/>
     <w:multiLevelType w:val="hybridMultilevel"/>
@@ -6835,6 +7022,7 @@
   <w:style w:type="character" w:default="1" w:styleId="DefaultParagraphFont">
     <w:name w:val="Default Paragraph Font"/>
     <w:uiPriority w:val="1"/>
+    <w:semiHidden/>
     <w:unhideWhenUsed/>
   </w:style>
   <w:style w:type="table" w:default="1" w:styleId="TableNormal">

</xml_diff>

<commit_message>
docs: update CV projects and bootcamp status
</commit_message>
<xml_diff>
--- a/Nazmul_Hussain_CV.docx
+++ b/Nazmul_Hussain_CV.docx
@@ -614,6 +614,7 @@
         </w:rPr>
         <w:t xml:space="preserve">, </w:t>
       </w:r>
+      <w:proofErr w:type="spellStart"/>
       <w:r>
         <w:rPr>
           <w:sz w:val="21"/>
@@ -621,6 +622,7 @@
         </w:rPr>
         <w:t>Moq</w:t>
       </w:r>
+      <w:proofErr w:type="spellEnd"/>
       <w:r>
         <w:rPr>
           <w:sz w:val="21"/>
@@ -713,8 +715,67 @@
           <w:sz w:val="21"/>
           <w:szCs w:val="21"/>
         </w:rPr>
-        <w:t>Databases</w:t>
-      </w:r>
+        <w:t>Databases:</w:t>
+      </w:r>
+      <w:r>
+        <w:rPr>
+          <w:sz w:val="21"/>
+          <w:szCs w:val="21"/>
+        </w:rPr>
+        <w:t xml:space="preserve"> </w:t>
+      </w:r>
+      <w:r>
+        <w:rPr>
+          <w:sz w:val="21"/>
+          <w:szCs w:val="21"/>
+        </w:rPr>
+        <w:tab/>
+      </w:r>
+      <w:r>
+        <w:rPr>
+          <w:sz w:val="21"/>
+          <w:szCs w:val="21"/>
+        </w:rPr>
+        <w:tab/>
+      </w:r>
+      <w:r>
+        <w:rPr>
+          <w:sz w:val="21"/>
+          <w:szCs w:val="21"/>
+        </w:rPr>
+        <w:tab/>
+      </w:r>
+      <w:r>
+        <w:rPr>
+          <w:sz w:val="21"/>
+          <w:szCs w:val="21"/>
+        </w:rPr>
+        <w:t xml:space="preserve">SQL Server, </w:t>
+      </w:r>
+      <w:r>
+        <w:rPr>
+          <w:sz w:val="21"/>
+          <w:szCs w:val="21"/>
+        </w:rPr>
+        <w:t xml:space="preserve">SQLite, </w:t>
+      </w:r>
+      <w:r>
+        <w:rPr>
+          <w:sz w:val="21"/>
+          <w:szCs w:val="21"/>
+        </w:rPr>
+        <w:t>T-SQL, ADO.NET</w:t>
+      </w:r>
+    </w:p>
+    <w:p>
+      <w:pPr>
+        <w:spacing w:after="0" w:line="240" w:lineRule="auto"/>
+        <w:jc w:val="both"/>
+        <w:rPr>
+          <w:sz w:val="21"/>
+          <w:szCs w:val="21"/>
+        </w:rPr>
+      </w:pPr>
       <w:r>
         <w:rPr>
           <w:b/>
@@ -722,8 +783,74 @@
           <w:sz w:val="21"/>
           <w:szCs w:val="21"/>
         </w:rPr>
-        <w:t xml:space="preserve"> &amp; ORM</w:t>
-      </w:r>
+        <w:t>Tools:</w:t>
+      </w:r>
+      <w:r>
+        <w:rPr>
+          <w:sz w:val="21"/>
+          <w:szCs w:val="21"/>
+        </w:rPr>
+        <w:t xml:space="preserve"> </w:t>
+      </w:r>
+      <w:r>
+        <w:rPr>
+          <w:sz w:val="21"/>
+          <w:szCs w:val="21"/>
+        </w:rPr>
+        <w:tab/>
+      </w:r>
+      <w:r>
+        <w:rPr>
+          <w:sz w:val="21"/>
+          <w:szCs w:val="21"/>
+        </w:rPr>
+        <w:tab/>
+      </w:r>
+      <w:r>
+        <w:rPr>
+          <w:sz w:val="21"/>
+          <w:szCs w:val="21"/>
+        </w:rPr>
+        <w:tab/>
+      </w:r>
+      <w:r>
+        <w:rPr>
+          <w:sz w:val="21"/>
+          <w:szCs w:val="21"/>
+        </w:rPr>
+        <w:tab/>
+      </w:r>
+      <w:r>
+        <w:rPr>
+          <w:sz w:val="21"/>
+          <w:szCs w:val="21"/>
+        </w:rPr>
+        <w:t>Git, GitHub, Visual Studio, VS Code, PowerShell</w:t>
+      </w:r>
+      <w:r>
+        <w:rPr>
+          <w:sz w:val="21"/>
+          <w:szCs w:val="21"/>
+        </w:rPr>
+        <w:t>, Trello</w:t>
+      </w:r>
+      <w:r>
+        <w:rPr>
+          <w:sz w:val="21"/>
+          <w:szCs w:val="21"/>
+        </w:rPr>
+        <w:t xml:space="preserve">  </w:t>
+      </w:r>
+    </w:p>
+    <w:p>
+      <w:pPr>
+        <w:spacing w:after="0" w:line="240" w:lineRule="auto"/>
+        <w:jc w:val="both"/>
+        <w:rPr>
+          <w:sz w:val="21"/>
+          <w:szCs w:val="21"/>
+        </w:rPr>
+      </w:pPr>
       <w:r>
         <w:rPr>
           <w:b/>
@@ -731,60 +858,8 @@
           <w:sz w:val="21"/>
           <w:szCs w:val="21"/>
         </w:rPr>
-        <w:t>:</w:t>
-      </w:r>
-      <w:r>
-        <w:rPr>
-          <w:sz w:val="21"/>
-          <w:szCs w:val="21"/>
-        </w:rPr>
-        <w:t xml:space="preserve"> </w:t>
-      </w:r>
-      <w:r>
-        <w:rPr>
-          <w:sz w:val="21"/>
-          <w:szCs w:val="21"/>
-        </w:rPr>
-        <w:tab/>
-      </w:r>
-      <w:r>
-        <w:rPr>
-          <w:sz w:val="21"/>
-          <w:szCs w:val="21"/>
-        </w:rPr>
-        <w:tab/>
-      </w:r>
-      <w:r>
-        <w:rPr>
-          <w:sz w:val="21"/>
-          <w:szCs w:val="21"/>
-        </w:rPr>
-        <w:t xml:space="preserve">SQL Server, </w:t>
-      </w:r>
-      <w:r>
-        <w:rPr>
-          <w:sz w:val="21"/>
-          <w:szCs w:val="21"/>
-        </w:rPr>
-        <w:t xml:space="preserve">SQLite, </w:t>
-      </w:r>
-      <w:r>
-        <w:rPr>
-          <w:sz w:val="21"/>
-          <w:szCs w:val="21"/>
-        </w:rPr>
-        <w:t>T-SQL, ADO.NET</w:t>
-      </w:r>
-    </w:p>
-    <w:p>
-      <w:pPr>
-        <w:spacing w:after="0" w:line="240" w:lineRule="auto"/>
-        <w:jc w:val="both"/>
-        <w:rPr>
-          <w:sz w:val="21"/>
-          <w:szCs w:val="21"/>
-        </w:rPr>
-      </w:pPr>
+        <w:t>Frontend</w:t>
+      </w:r>
       <w:r>
         <w:rPr>
           <w:b/>
@@ -792,7 +867,7 @@
           <w:sz w:val="21"/>
           <w:szCs w:val="21"/>
         </w:rPr>
-        <w:t>Tools:</w:t>
+        <w:t>:</w:t>
       </w:r>
       <w:r>
         <w:rPr>
@@ -827,90 +902,6 @@
           <w:sz w:val="21"/>
           <w:szCs w:val="21"/>
         </w:rPr>
-        <w:tab/>
-      </w:r>
-      <w:r>
-        <w:rPr>
-          <w:sz w:val="21"/>
-          <w:szCs w:val="21"/>
-        </w:rPr>
-        <w:t>Git, GitHub, Visual Studio, VS Code, PowerShell</w:t>
-      </w:r>
-      <w:r>
-        <w:rPr>
-          <w:sz w:val="21"/>
-          <w:szCs w:val="21"/>
-        </w:rPr>
-        <w:t>, Trello</w:t>
-      </w:r>
-      <w:r>
-        <w:rPr>
-          <w:sz w:val="21"/>
-          <w:szCs w:val="21"/>
-        </w:rPr>
-        <w:t xml:space="preserve">  </w:t>
-      </w:r>
-    </w:p>
-    <w:p>
-      <w:pPr>
-        <w:spacing w:after="0" w:line="240" w:lineRule="auto"/>
-        <w:jc w:val="both"/>
-        <w:rPr>
-          <w:sz w:val="21"/>
-          <w:szCs w:val="21"/>
-        </w:rPr>
-      </w:pPr>
-      <w:r>
-        <w:rPr>
-          <w:b/>
-          <w:bCs/>
-          <w:sz w:val="21"/>
-          <w:szCs w:val="21"/>
-        </w:rPr>
-        <w:t>Frontend</w:t>
-      </w:r>
-      <w:r>
-        <w:rPr>
-          <w:b/>
-          <w:bCs/>
-          <w:sz w:val="21"/>
-          <w:szCs w:val="21"/>
-        </w:rPr>
-        <w:t>:</w:t>
-      </w:r>
-      <w:r>
-        <w:rPr>
-          <w:sz w:val="21"/>
-          <w:szCs w:val="21"/>
-        </w:rPr>
-        <w:t xml:space="preserve"> </w:t>
-      </w:r>
-      <w:r>
-        <w:rPr>
-          <w:sz w:val="21"/>
-          <w:szCs w:val="21"/>
-        </w:rPr>
-        <w:tab/>
-      </w:r>
-      <w:r>
-        <w:rPr>
-          <w:sz w:val="21"/>
-          <w:szCs w:val="21"/>
-        </w:rPr>
-        <w:tab/>
-      </w:r>
-      <w:r>
-        <w:rPr>
-          <w:sz w:val="21"/>
-          <w:szCs w:val="21"/>
-        </w:rPr>
-        <w:tab/>
-      </w:r>
-      <w:r>
-        <w:rPr>
-          <w:sz w:val="21"/>
-          <w:szCs w:val="21"/>
-        </w:rPr>
         <w:t xml:space="preserve">Blazor, </w:t>
       </w:r>
       <w:r>
@@ -920,6 +911,22 @@
         </w:rPr>
         <w:t>HTML, CSS</w:t>
       </w:r>
+      <w:r>
+        <w:rPr>
+          <w:sz w:val="21"/>
+          <w:szCs w:val="21"/>
+        </w:rPr>
+        <w:t xml:space="preserve">, </w:t>
+      </w:r>
+      <w:proofErr w:type="spellStart"/>
+      <w:r>
+        <w:rPr>
+          <w:sz w:val="21"/>
+          <w:szCs w:val="21"/>
+        </w:rPr>
+        <w:t>HttpClient</w:t>
+      </w:r>
+      <w:proofErr w:type="spellEnd"/>
     </w:p>
     <w:p>
       <w:pPr>
@@ -1097,12 +1104,21 @@
         </w:rPr>
         <w:t xml:space="preserve"> </w:t>
       </w:r>
-      <w:r>
-        <w:rPr>
-          <w:sz w:val="21"/>
-          <w:szCs w:val="21"/>
-        </w:rPr>
-        <w:t>Supabase Authentication</w:t>
+      <w:proofErr w:type="spellStart"/>
+      <w:r>
+        <w:rPr>
+          <w:sz w:val="21"/>
+          <w:szCs w:val="21"/>
+        </w:rPr>
+        <w:t>Supabase</w:t>
+      </w:r>
+      <w:proofErr w:type="spellEnd"/>
+      <w:r>
+        <w:rPr>
+          <w:sz w:val="21"/>
+          <w:szCs w:val="21"/>
+        </w:rPr>
+        <w:t xml:space="preserve"> Authentication</w:t>
       </w:r>
       <w:r>
         <w:rPr>
@@ -1181,21 +1197,7 @@
           <w:sz w:val="21"/>
           <w:szCs w:val="21"/>
         </w:rPr>
-        <w:t xml:space="preserve">Collaborated in a team to develop a full-stack productivity and </w:t>
-      </w:r>
-      <w:r>
-        <w:rPr>
-          <w:sz w:val="21"/>
-          <w:szCs w:val="21"/>
-        </w:rPr>
-        <w:t xml:space="preserve">lo-fi </w:t>
-      </w:r>
-      <w:r>
-        <w:rPr>
-          <w:sz w:val="21"/>
-          <w:szCs w:val="21"/>
-        </w:rPr>
-        <w:t>music application featuring music search, playlists, timers, projects and user accounts</w:t>
+        <w:t>Collaborated in a team to build a productivity application that combines lo-fi music with tools including music search, playlists, timers, projects and user accounts.</w:t>
       </w:r>
     </w:p>
     <w:p>
@@ -1218,7 +1220,7 @@
           <w:sz w:val="21"/>
           <w:szCs w:val="21"/>
         </w:rPr>
-        <w:t>Pair programmed on YouTube API integration and music search functionality across the ASP.NET Core backend and Blazor frontend</w:t>
+        <w:t>Pair programmed on the YouTube integration, enabling users to search for music and play selected videos within the application, while also contributing to backend functionality, testing and dashboard features.</w:t>
       </w:r>
     </w:p>
     <w:p>
@@ -1241,136 +1243,7 @@
           <w:sz w:val="21"/>
           <w:szCs w:val="21"/>
         </w:rPr>
-        <w:t xml:space="preserve">Developed a Pomodoro-style timer prototype </w:t>
-      </w:r>
-      <w:r>
-        <w:rPr>
-          <w:sz w:val="21"/>
-          <w:szCs w:val="21"/>
-        </w:rPr>
-        <w:t>integrated with music playback controls and task-tracking functionality</w:t>
-      </w:r>
-    </w:p>
-    <w:p>
-      <w:pPr>
-        <w:pStyle w:val="ListParagraph"/>
-        <w:numPr>
-          <w:ilvl w:val="0"/>
-          <w:numId w:val="18"/>
-        </w:numPr>
-        <w:spacing w:after="0" w:line="240" w:lineRule="auto"/>
-        <w:ind w:left="357" w:hanging="357"/>
-        <w:jc w:val="both"/>
-        <w:rPr>
-          <w:sz w:val="21"/>
-          <w:szCs w:val="21"/>
-        </w:rPr>
-      </w:pPr>
-      <w:r>
-        <w:rPr>
-          <w:sz w:val="21"/>
-          <w:szCs w:val="21"/>
-        </w:rPr>
-        <w:t>Contributed to repository, service and controller development using ASP.NET Core and Entity Framework Core</w:t>
-      </w:r>
-    </w:p>
-    <w:p>
-      <w:pPr>
-        <w:pStyle w:val="ListParagraph"/>
-        <w:numPr>
-          <w:ilvl w:val="0"/>
-          <w:numId w:val="18"/>
-        </w:numPr>
-        <w:spacing w:after="0" w:line="240" w:lineRule="auto"/>
-        <w:ind w:left="357" w:hanging="357"/>
-        <w:jc w:val="both"/>
-        <w:rPr>
-          <w:sz w:val="21"/>
-          <w:szCs w:val="21"/>
-        </w:rPr>
-      </w:pPr>
-      <w:r>
-        <w:rPr>
-          <w:sz w:val="21"/>
-          <w:szCs w:val="21"/>
-        </w:rPr>
-        <w:t>Participated in test-driven development (TDD)</w:t>
-      </w:r>
-      <w:r>
-        <w:rPr>
-          <w:sz w:val="21"/>
-          <w:szCs w:val="21"/>
-        </w:rPr>
-        <w:t>, writing and maintaining unit tests using NUnit, Moq, and Shouldly</w:t>
-      </w:r>
-    </w:p>
-    <w:p>
-      <w:pPr>
-        <w:pStyle w:val="ListParagraph"/>
-        <w:numPr>
-          <w:ilvl w:val="0"/>
-          <w:numId w:val="18"/>
-        </w:numPr>
-        <w:spacing w:after="0" w:line="240" w:lineRule="auto"/>
-        <w:ind w:left="357" w:hanging="357"/>
-        <w:jc w:val="both"/>
-        <w:rPr>
-          <w:sz w:val="21"/>
-          <w:szCs w:val="21"/>
-        </w:rPr>
-      </w:pPr>
-      <w:r>
-        <w:rPr>
-          <w:sz w:val="21"/>
-          <w:szCs w:val="21"/>
-        </w:rPr>
-        <w:t>Implemented custom API and database health checks to monitor application availability</w:t>
-      </w:r>
-    </w:p>
-    <w:p>
-      <w:pPr>
-        <w:pStyle w:val="ListParagraph"/>
-        <w:numPr>
-          <w:ilvl w:val="0"/>
-          <w:numId w:val="18"/>
-        </w:numPr>
-        <w:spacing w:after="0" w:line="240" w:lineRule="auto"/>
-        <w:ind w:left="357" w:hanging="357"/>
-        <w:jc w:val="both"/>
-        <w:rPr>
-          <w:sz w:val="21"/>
-          <w:szCs w:val="21"/>
-        </w:rPr>
-      </w:pPr>
-      <w:r>
-        <w:rPr>
-          <w:sz w:val="21"/>
-          <w:szCs w:val="21"/>
-        </w:rPr>
-        <w:t>Worked using Agile practices including daily stand-ups, sprint planning, ticket management and collaborative Git workflows</w:t>
-      </w:r>
-    </w:p>
-    <w:p>
-      <w:pPr>
-        <w:pStyle w:val="ListParagraph"/>
-        <w:numPr>
-          <w:ilvl w:val="0"/>
-          <w:numId w:val="18"/>
-        </w:numPr>
-        <w:spacing w:after="0" w:line="240" w:lineRule="auto"/>
-        <w:ind w:left="357" w:hanging="357"/>
-        <w:jc w:val="both"/>
-        <w:rPr>
-          <w:sz w:val="21"/>
-          <w:szCs w:val="21"/>
-        </w:rPr>
-      </w:pPr>
-      <w:r>
-        <w:rPr>
-          <w:sz w:val="21"/>
-          <w:szCs w:val="21"/>
-        </w:rPr>
-        <w:t>Contributed to dashboard functionality and user interface improvements using Blazor</w:t>
+        <w:t>Independently implemented API and database health checks to monitor whether key parts of the application were running correctly, and developed a Pomodoro timer prototype that controlled music playback based on a 25-minute focus session.</w:t>
       </w:r>
     </w:p>
     <w:p>
@@ -1567,36 +1440,63 @@
           <w:sz w:val="20"/>
           <w:szCs w:val="20"/>
         </w:rPr>
-        <w:t xml:space="preserve"> NUnit</w:t>
-      </w:r>
+        <w:t xml:space="preserve"> </w:t>
+      </w:r>
+      <w:proofErr w:type="spellStart"/>
       <w:r>
         <w:rPr>
           <w:sz w:val="20"/>
           <w:szCs w:val="20"/>
         </w:rPr>
-        <w:t xml:space="preserve"> |</w:t>
-      </w:r>
+        <w:t>NUnit</w:t>
+      </w:r>
+      <w:proofErr w:type="spellEnd"/>
       <w:r>
         <w:rPr>
           <w:sz w:val="20"/>
           <w:szCs w:val="20"/>
         </w:rPr>
-        <w:t xml:space="preserve"> Moq</w:t>
+        <w:t xml:space="preserve"> |</w:t>
       </w:r>
       <w:r>
         <w:rPr>
           <w:sz w:val="20"/>
           <w:szCs w:val="20"/>
         </w:rPr>
-        <w:t xml:space="preserve"> |</w:t>
-      </w:r>
+        <w:t xml:space="preserve"> </w:t>
+      </w:r>
+      <w:proofErr w:type="spellStart"/>
       <w:r>
         <w:rPr>
           <w:sz w:val="20"/>
           <w:szCs w:val="20"/>
         </w:rPr>
-        <w:t xml:space="preserve"> Shouldly</w:t>
-      </w:r>
+        <w:t>Moq</w:t>
+      </w:r>
+      <w:proofErr w:type="spellEnd"/>
+      <w:r>
+        <w:rPr>
+          <w:sz w:val="20"/>
+          <w:szCs w:val="20"/>
+        </w:rPr>
+        <w:t xml:space="preserve"> |</w:t>
+      </w:r>
+      <w:r>
+        <w:rPr>
+          <w:sz w:val="20"/>
+          <w:szCs w:val="20"/>
+        </w:rPr>
+        <w:t xml:space="preserve"> </w:t>
+      </w:r>
+      <w:proofErr w:type="spellStart"/>
+      <w:r>
+        <w:rPr>
+          <w:sz w:val="20"/>
+          <w:szCs w:val="20"/>
+        </w:rPr>
+        <w:t>Shouldly</w:t>
+      </w:r>
+      <w:proofErr w:type="spellEnd"/>
     </w:p>
     <w:p>
       <w:pPr>
@@ -1618,7 +1518,7 @@
           <w:sz w:val="21"/>
           <w:szCs w:val="21"/>
         </w:rPr>
-        <w:t>Built a full-stack record shop application using ASP.NET Core and Blazor</w:t>
+        <w:t>Built a full-stack record shop application for managing a record inventory, allowing users to view, search, add, edit and delete records.</w:t>
       </w:r>
     </w:p>
     <w:p>
@@ -1641,21 +1541,7 @@
           <w:sz w:val="21"/>
           <w:szCs w:val="21"/>
         </w:rPr>
-        <w:t xml:space="preserve">Developed a RESTful API with CRUD </w:t>
-      </w:r>
-      <w:r>
-        <w:rPr>
-          <w:sz w:val="21"/>
-          <w:szCs w:val="21"/>
-        </w:rPr>
-        <w:t>operations</w:t>
-      </w:r>
-      <w:r>
-        <w:rPr>
-          <w:sz w:val="21"/>
-          <w:szCs w:val="21"/>
-        </w:rPr>
-        <w:t xml:space="preserve"> for managing record inventory</w:t>
+        <w:t>Developed the frontend and backend communication so changes made through the user interface could be processed by the application and stored in a SQL Server database.</w:t>
       </w:r>
     </w:p>
     <w:p>
@@ -1678,143 +1564,7 @@
           <w:sz w:val="21"/>
           <w:szCs w:val="21"/>
         </w:rPr>
-        <w:t>Built reusable Blazor components with routing, forms, and navigation</w:t>
-      </w:r>
-    </w:p>
-    <w:p>
-      <w:pPr>
-        <w:pStyle w:val="ListParagraph"/>
-        <w:numPr>
-          <w:ilvl w:val="0"/>
-          <w:numId w:val="18"/>
-        </w:numPr>
-        <w:spacing w:after="0" w:line="240" w:lineRule="auto"/>
-        <w:ind w:left="357" w:hanging="357"/>
-        <w:jc w:val="both"/>
-        <w:rPr>
-          <w:sz w:val="21"/>
-          <w:szCs w:val="21"/>
-        </w:rPr>
-      </w:pPr>
-      <w:r>
-        <w:rPr>
-          <w:sz w:val="21"/>
-          <w:szCs w:val="21"/>
-        </w:rPr>
-        <w:t>Integrated frontend and backend systems using HttpClient</w:t>
-      </w:r>
-      <w:r>
-        <w:rPr>
-          <w:sz w:val="21"/>
-          <w:szCs w:val="21"/>
-        </w:rPr>
-        <w:t xml:space="preserve"> and</w:t>
-      </w:r>
-      <w:r>
-        <w:rPr>
-          <w:sz w:val="21"/>
-          <w:szCs w:val="21"/>
-        </w:rPr>
-        <w:t xml:space="preserve"> </w:t>
-      </w:r>
-      <w:r>
-        <w:rPr>
-          <w:sz w:val="21"/>
-          <w:szCs w:val="21"/>
-        </w:rPr>
-        <w:t>REST API communication</w:t>
-      </w:r>
-    </w:p>
-    <w:p>
-      <w:pPr>
-        <w:pStyle w:val="ListParagraph"/>
-        <w:numPr>
-          <w:ilvl w:val="0"/>
-          <w:numId w:val="18"/>
-        </w:numPr>
-        <w:spacing w:after="0" w:line="240" w:lineRule="auto"/>
-        <w:ind w:left="357" w:hanging="357"/>
-        <w:jc w:val="both"/>
-        <w:rPr>
-          <w:sz w:val="21"/>
-          <w:szCs w:val="21"/>
-        </w:rPr>
-      </w:pPr>
-      <w:r>
-        <w:rPr>
-          <w:sz w:val="21"/>
-          <w:szCs w:val="21"/>
-        </w:rPr>
-        <w:t>Implemented record search, creation, editing, and deletion functionality</w:t>
-      </w:r>
-    </w:p>
-    <w:p>
-      <w:pPr>
-        <w:pStyle w:val="ListParagraph"/>
-        <w:numPr>
-          <w:ilvl w:val="0"/>
-          <w:numId w:val="18"/>
-        </w:numPr>
-        <w:spacing w:after="0" w:line="240" w:lineRule="auto"/>
-        <w:ind w:left="357" w:hanging="357"/>
-        <w:jc w:val="both"/>
-        <w:rPr>
-          <w:sz w:val="21"/>
-          <w:szCs w:val="21"/>
-        </w:rPr>
-      </w:pPr>
-      <w:r>
-        <w:rPr>
-          <w:sz w:val="21"/>
-          <w:szCs w:val="21"/>
-        </w:rPr>
-        <w:t>Used Entity Framework Core with SQL Server for data persistence</w:t>
-      </w:r>
-    </w:p>
-    <w:p>
-      <w:pPr>
-        <w:pStyle w:val="ListParagraph"/>
-        <w:numPr>
-          <w:ilvl w:val="0"/>
-          <w:numId w:val="18"/>
-        </w:numPr>
-        <w:spacing w:after="0" w:line="240" w:lineRule="auto"/>
-        <w:ind w:left="357" w:hanging="357"/>
-        <w:jc w:val="both"/>
-        <w:rPr>
-          <w:sz w:val="21"/>
-          <w:szCs w:val="21"/>
-        </w:rPr>
-      </w:pPr>
-      <w:r>
-        <w:rPr>
-          <w:sz w:val="21"/>
-          <w:szCs w:val="21"/>
-        </w:rPr>
-        <w:t>Applied test-driven development using NUnit, Moq, and Shouldly</w:t>
-      </w:r>
-    </w:p>
-    <w:p>
-      <w:pPr>
-        <w:pStyle w:val="ListParagraph"/>
-        <w:numPr>
-          <w:ilvl w:val="0"/>
-          <w:numId w:val="18"/>
-        </w:numPr>
-        <w:spacing w:after="0" w:line="240" w:lineRule="auto"/>
-        <w:ind w:left="357" w:hanging="357"/>
-        <w:jc w:val="both"/>
-        <w:rPr>
-          <w:sz w:val="21"/>
-          <w:szCs w:val="21"/>
-        </w:rPr>
-      </w:pPr>
-      <w:r>
-        <w:rPr>
-          <w:sz w:val="21"/>
-          <w:szCs w:val="21"/>
-        </w:rPr>
-        <w:t>Added custom health checks to monitor API and database availability</w:t>
+        <w:t>Used test-driven development to verify application behaviour and added API and database health checks to help identify whether key parts of the application were operating correctly.</w:t>
       </w:r>
     </w:p>
     <w:p>
@@ -1923,6 +1673,13 @@
           <w:sz w:val="21"/>
           <w:szCs w:val="21"/>
         </w:rPr>
+        <w:t xml:space="preserve">Completed </w:t>
+      </w:r>
+      <w:r>
+        <w:rPr>
+          <w:sz w:val="21"/>
+          <w:szCs w:val="21"/>
+        </w:rPr>
         <w:t xml:space="preserve">Intensive training in C# and modern software development practices  </w:t>
       </w:r>
     </w:p>
@@ -1946,7 +1703,21 @@
           <w:sz w:val="21"/>
           <w:szCs w:val="21"/>
         </w:rPr>
-        <w:t xml:space="preserve">Applying object-oriented programming, clean code, and test-driven development in practical </w:t>
+        <w:t>Appl</w:t>
+      </w:r>
+      <w:r>
+        <w:rPr>
+          <w:sz w:val="21"/>
+          <w:szCs w:val="21"/>
+        </w:rPr>
+        <w:t>ied</w:t>
+      </w:r>
+      <w:r>
+        <w:rPr>
+          <w:sz w:val="21"/>
+          <w:szCs w:val="21"/>
+        </w:rPr>
+        <w:t xml:space="preserve"> object-oriented programming, clean code, and test-driven development in practical </w:t>
       </w:r>
       <w:r>
         <w:rPr>
@@ -1990,7 +1761,7 @@
           <w:sz w:val="21"/>
           <w:szCs w:val="21"/>
         </w:rPr>
-        <w:t>ing</w:t>
+        <w:t>ed</w:t>
       </w:r>
       <w:r>
         <w:rPr>
@@ -2020,7 +1791,22 @@
           <w:sz w:val="21"/>
           <w:szCs w:val="21"/>
         </w:rPr>
-        <w:t>Building backend applications and REST APIs using ASP.NET Core</w:t>
+        <w:lastRenderedPageBreak/>
+        <w:t>Buil</w:t>
+      </w:r>
+      <w:r>
+        <w:rPr>
+          <w:sz w:val="21"/>
+          <w:szCs w:val="21"/>
+        </w:rPr>
+        <w:t>t</w:t>
+      </w:r>
+      <w:r>
+        <w:rPr>
+          <w:sz w:val="21"/>
+          <w:szCs w:val="21"/>
+        </w:rPr>
+        <w:t xml:space="preserve"> backend applications and REST APIs using ASP.NET Core</w:t>
       </w:r>
     </w:p>
     <w:p>
@@ -2426,6 +2212,7 @@
         </w:rPr>
         <w:t>(</w:t>
       </w:r>
+      <w:proofErr w:type="spellStart"/>
       <w:r>
         <w:rPr>
           <w:sz w:val="21"/>
@@ -2433,6 +2220,7 @@
         </w:rPr>
         <w:t>Mosadaqa</w:t>
       </w:r>
+      <w:proofErr w:type="spellEnd"/>
       <w:r>
         <w:rPr>
           <w:sz w:val="21"/>
@@ -2614,12 +2402,21 @@
           <w:szCs w:val="21"/>
         </w:rPr>
       </w:pPr>
-      <w:r>
-        <w:rPr>
-          <w:sz w:val="21"/>
-          <w:szCs w:val="21"/>
-        </w:rPr>
-        <w:t xml:space="preserve">UberEats, Deliveroo &amp; Stuart  </w:t>
+      <w:proofErr w:type="spellStart"/>
+      <w:r>
+        <w:rPr>
+          <w:sz w:val="21"/>
+          <w:szCs w:val="21"/>
+        </w:rPr>
+        <w:t>UberEats</w:t>
+      </w:r>
+      <w:proofErr w:type="spellEnd"/>
+      <w:r>
+        <w:rPr>
+          <w:sz w:val="21"/>
+          <w:szCs w:val="21"/>
+        </w:rPr>
+        <w:t xml:space="preserve">, Deliveroo &amp; Stuart  </w:t>
       </w:r>
     </w:p>
     <w:p>
@@ -3066,14 +2863,14 @@
           <w:sz w:val="21"/>
           <w:szCs w:val="21"/>
         </w:rPr>
-        <w:t xml:space="preserve">coding projects </w:t>
-      </w:r>
-      <w:r>
-        <w:rPr>
-          <w:sz w:val="21"/>
-          <w:szCs w:val="21"/>
-        </w:rPr>
-        <w:t>outside the bootcamp to strengthen</w:t>
+        <w:t>coding projects</w:t>
+      </w:r>
+      <w:r>
+        <w:rPr>
+          <w:sz w:val="21"/>
+          <w:szCs w:val="21"/>
+        </w:rPr>
+        <w:t xml:space="preserve"> to strengthen</w:t>
       </w:r>
       <w:r>
         <w:rPr>
@@ -3094,7 +2891,21 @@
           <w:sz w:val="21"/>
           <w:szCs w:val="21"/>
         </w:rPr>
-        <w:t xml:space="preserve"> apply concepts in real scenarios</w:t>
+        <w:t xml:space="preserve"> apply concepts in real</w:t>
+      </w:r>
+      <w:r>
+        <w:rPr>
+          <w:sz w:val="21"/>
+          <w:szCs w:val="21"/>
+        </w:rPr>
+        <w:t>-world</w:t>
+      </w:r>
+      <w:r>
+        <w:rPr>
+          <w:sz w:val="21"/>
+          <w:szCs w:val="21"/>
+        </w:rPr>
+        <w:t xml:space="preserve"> scenarios</w:t>
       </w:r>
       <w:r>
         <w:rPr>

</xml_diff>

<commit_message>
Update CV with live demo link for projects
</commit_message>
<xml_diff>
--- a/Nazmul_Hussain_CV.docx
+++ b/Nazmul_Hussain_CV.docx
@@ -121,6 +121,17 @@
         </w:rPr>
       </w:pPr>
       <w:hyperlink r:id="rId7" w:history="1">
+        <w:r>
+          <w:rPr>
+            <w:rStyle w:val="Hyperlink"/>
+          </w:rPr>
+          <w:t>nazmulhussain.co.uk</w:t>
+        </w:r>
+      </w:hyperlink>
+      <w:r>
+        <w:t xml:space="preserve"> | </w:t>
+      </w:r>
+      <w:hyperlink r:id="rId8" w:history="1">
         <w:r>
           <w:rPr>
             <w:rStyle w:val="Hyperlink"/>
@@ -161,7 +172,7 @@
         </w:rPr>
         <w:t xml:space="preserve"> | </w:t>
       </w:r>
-      <w:hyperlink r:id="rId8" w:history="1">
+      <w:hyperlink r:id="rId9" w:history="1">
         <w:r>
           <w:rPr>
             <w:rStyle w:val="Hyperlink"/>
@@ -580,41 +591,15 @@
           <w:sz w:val="21"/>
           <w:szCs w:val="21"/>
         </w:rPr>
-        <w:t xml:space="preserve">Test-Driven Development (TDD), </w:t>
-      </w:r>
-      <w:proofErr w:type="spellStart"/>
-      <w:r>
-        <w:rPr>
-          <w:sz w:val="21"/>
-          <w:szCs w:val="21"/>
-        </w:rPr>
-        <w:t>NUnit</w:t>
-      </w:r>
-      <w:proofErr w:type="spellEnd"/>
-      <w:r>
-        <w:rPr>
-          <w:sz w:val="21"/>
-          <w:szCs w:val="21"/>
-        </w:rPr>
-        <w:t xml:space="preserve">, </w:t>
-      </w:r>
-      <w:proofErr w:type="spellStart"/>
-      <w:r>
-        <w:rPr>
-          <w:sz w:val="21"/>
-          <w:szCs w:val="21"/>
-        </w:rPr>
-        <w:t>Shouldly</w:t>
-      </w:r>
-      <w:proofErr w:type="spellEnd"/>
-      <w:r>
-        <w:rPr>
-          <w:sz w:val="21"/>
-          <w:szCs w:val="21"/>
-        </w:rPr>
-        <w:t xml:space="preserve">, </w:t>
-      </w:r>
-      <w:proofErr w:type="spellStart"/>
+        <w:t xml:space="preserve">Test-Driven Development (TDD), NUnit, </w:t>
+      </w:r>
+      <w:r>
+        <w:rPr>
+          <w:sz w:val="21"/>
+          <w:szCs w:val="21"/>
+        </w:rPr>
+        <w:t xml:space="preserve">Shouldly, </w:t>
+      </w:r>
       <w:r>
         <w:rPr>
           <w:sz w:val="21"/>
@@ -622,7 +607,6 @@
         </w:rPr>
         <w:t>Moq</w:t>
       </w:r>
-      <w:proofErr w:type="spellEnd"/>
       <w:r>
         <w:rPr>
           <w:sz w:val="21"/>
@@ -750,6 +734,13 @@
           <w:sz w:val="21"/>
           <w:szCs w:val="21"/>
         </w:rPr>
+        <w:t xml:space="preserve">PostgreSQL, </w:t>
+      </w:r>
+      <w:r>
+        <w:rPr>
+          <w:sz w:val="21"/>
+          <w:szCs w:val="21"/>
+        </w:rPr>
         <w:t xml:space="preserve">SQL Server, </w:t>
       </w:r>
       <w:r>
@@ -825,7 +816,35 @@
           <w:sz w:val="21"/>
           <w:szCs w:val="21"/>
         </w:rPr>
-        <w:t>Git, GitHub, Visual Studio, VS Code, PowerShell</w:t>
+        <w:t xml:space="preserve">Git, GitHub, </w:t>
+      </w:r>
+      <w:r>
+        <w:rPr>
+          <w:sz w:val="21"/>
+          <w:szCs w:val="21"/>
+        </w:rPr>
+        <w:t xml:space="preserve">Docker, </w:t>
+      </w:r>
+      <w:r>
+        <w:rPr>
+          <w:sz w:val="21"/>
+          <w:szCs w:val="21"/>
+        </w:rPr>
+        <w:t xml:space="preserve">Visual Studio, </w:t>
+      </w:r>
+      <w:r>
+        <w:rPr>
+          <w:sz w:val="21"/>
+          <w:szCs w:val="21"/>
+        </w:rPr>
+        <w:t xml:space="preserve">Rider, </w:t>
+      </w:r>
+      <w:r>
+        <w:rPr>
+          <w:sz w:val="21"/>
+          <w:szCs w:val="21"/>
+        </w:rPr>
+        <w:t>VS Code, PowerShell</w:t>
       </w:r>
       <w:r>
         <w:rPr>
@@ -918,7 +937,6 @@
         </w:rPr>
         <w:t xml:space="preserve">, </w:t>
       </w:r>
-      <w:proofErr w:type="spellStart"/>
       <w:r>
         <w:rPr>
           <w:sz w:val="21"/>
@@ -926,7 +944,6 @@
         </w:rPr>
         <w:t>HttpClient</w:t>
       </w:r>
-      <w:proofErr w:type="spellEnd"/>
     </w:p>
     <w:p>
       <w:pPr>
@@ -1014,12 +1031,21 @@
       </w:pPr>
       <w:r>
         <w:rPr>
-          <w:sz w:val="21"/>
-          <w:szCs w:val="21"/>
-        </w:rPr>
-        <w:t xml:space="preserve">GitHub: </w:t>
-      </w:r>
-      <w:hyperlink r:id="rId9" w:history="1">
+          <w:b/>
+          <w:bCs/>
+          <w:sz w:val="21"/>
+          <w:szCs w:val="21"/>
+        </w:rPr>
+        <w:t>GitHub:</w:t>
+      </w:r>
+      <w:r>
+        <w:rPr>
+          <w:sz w:val="21"/>
+          <w:szCs w:val="21"/>
+        </w:rPr>
+        <w:t xml:space="preserve"> </w:t>
+      </w:r>
+      <w:hyperlink r:id="rId10" w:history="1">
         <w:r>
           <w:rPr>
             <w:rStyle w:val="Hyperlink"/>
@@ -1036,7 +1062,7 @@
         </w:rPr>
         <w:t xml:space="preserve"> | </w:t>
       </w:r>
-      <w:hyperlink r:id="rId10" w:history="1">
+      <w:hyperlink r:id="rId11" w:history="1">
         <w:r>
           <w:rPr>
             <w:rStyle w:val="Hyperlink"/>
@@ -1104,21 +1130,12 @@
         </w:rPr>
         <w:t xml:space="preserve"> </w:t>
       </w:r>
-      <w:proofErr w:type="spellStart"/>
-      <w:r>
-        <w:rPr>
-          <w:sz w:val="21"/>
-          <w:szCs w:val="21"/>
-        </w:rPr>
-        <w:t>Supabase</w:t>
-      </w:r>
-      <w:proofErr w:type="spellEnd"/>
-      <w:r>
-        <w:rPr>
-          <w:sz w:val="21"/>
-          <w:szCs w:val="21"/>
-        </w:rPr>
-        <w:t xml:space="preserve"> Authentication</w:t>
+      <w:r>
+        <w:rPr>
+          <w:sz w:val="21"/>
+          <w:szCs w:val="21"/>
+        </w:rPr>
+        <w:t>Supabase Authentication</w:t>
       </w:r>
       <w:r>
         <w:rPr>
@@ -1311,12 +1328,54 @@
       </w:pPr>
       <w:r>
         <w:rPr>
-          <w:sz w:val="21"/>
-          <w:szCs w:val="21"/>
-        </w:rPr>
-        <w:t xml:space="preserve">GitHub: </w:t>
-      </w:r>
-      <w:hyperlink r:id="rId11" w:history="1">
+          <w:b/>
+          <w:bCs/>
+          <w:sz w:val="21"/>
+          <w:szCs w:val="21"/>
+        </w:rPr>
+        <w:t>Live Demo:</w:t>
+      </w:r>
+      <w:r>
+        <w:rPr>
+          <w:sz w:val="21"/>
+          <w:szCs w:val="21"/>
+        </w:rPr>
+        <w:t xml:space="preserve"> </w:t>
+      </w:r>
+      <w:hyperlink r:id="rId12" w:history="1">
+        <w:r>
+          <w:rPr>
+            <w:rStyle w:val="Hyperlink"/>
+            <w:sz w:val="21"/>
+            <w:szCs w:val="21"/>
+          </w:rPr>
+          <w:t>Record Shop</w:t>
+        </w:r>
+      </w:hyperlink>
+      <w:r>
+        <w:rPr>
+          <w:sz w:val="21"/>
+          <w:szCs w:val="21"/>
+        </w:rPr>
+        <w:t xml:space="preserve"> | </w:t>
+      </w:r>
+      <w:r>
+        <w:rPr>
+          <w:b/>
+          <w:bCs/>
+          <w:sz w:val="21"/>
+          <w:szCs w:val="21"/>
+        </w:rPr>
+        <w:t>GitHub:</w:t>
+      </w:r>
+      <w:r>
+        <w:rPr>
+          <w:sz w:val="21"/>
+          <w:szCs w:val="21"/>
+        </w:rPr>
+        <w:t xml:space="preserve"> </w:t>
+      </w:r>
+      <w:hyperlink r:id="rId13" w:history="1">
         <w:r>
           <w:rPr>
             <w:rStyle w:val="Hyperlink"/>
@@ -1333,7 +1392,7 @@
         </w:rPr>
         <w:t xml:space="preserve"> | </w:t>
       </w:r>
-      <w:hyperlink r:id="rId12" w:history="1">
+      <w:hyperlink r:id="rId14" w:history="1">
         <w:r>
           <w:rPr>
             <w:rStyle w:val="Hyperlink"/>
@@ -1343,6 +1402,9 @@
           <w:t>Backend Repository</w:t>
         </w:r>
       </w:hyperlink>
+      <w:r>
+        <w:tab/>
+      </w:r>
     </w:p>
     <w:p>
       <w:pPr>
@@ -1405,44 +1467,43 @@
           <w:sz w:val="20"/>
           <w:szCs w:val="20"/>
         </w:rPr>
-        <w:t xml:space="preserve"> SQL Server</w:t>
+        <w:t xml:space="preserve"> </w:t>
       </w:r>
       <w:r>
         <w:rPr>
           <w:sz w:val="20"/>
           <w:szCs w:val="20"/>
         </w:rPr>
-        <w:t xml:space="preserve"> |</w:t>
+        <w:t>Entity Framework Core</w:t>
       </w:r>
       <w:r>
         <w:rPr>
           <w:sz w:val="20"/>
           <w:szCs w:val="20"/>
         </w:rPr>
-        <w:t xml:space="preserve"> </w:t>
+        <w:t xml:space="preserve"> |</w:t>
       </w:r>
       <w:r>
         <w:rPr>
           <w:sz w:val="20"/>
           <w:szCs w:val="20"/>
         </w:rPr>
-        <w:t>Entity Framework Core</w:t>
+        <w:t xml:space="preserve"> PostgreSQL |</w:t>
       </w:r>
       <w:r>
         <w:rPr>
           <w:sz w:val="20"/>
           <w:szCs w:val="20"/>
         </w:rPr>
-        <w:t xml:space="preserve"> |</w:t>
+        <w:t xml:space="preserve"> </w:t>
       </w:r>
       <w:r>
         <w:rPr>
           <w:sz w:val="20"/>
           <w:szCs w:val="20"/>
         </w:rPr>
-        <w:t xml:space="preserve"> </w:t>
-      </w:r>
-      <w:proofErr w:type="spellStart"/>
+        <w:t xml:space="preserve">Docker | </w:t>
+      </w:r>
       <w:r>
         <w:rPr>
           <w:sz w:val="20"/>
@@ -1450,7 +1511,6 @@
         </w:rPr>
         <w:t>NUnit</w:t>
       </w:r>
-      <w:proofErr w:type="spellEnd"/>
       <w:r>
         <w:rPr>
           <w:sz w:val="20"/>
@@ -1463,40 +1523,22 @@
           <w:sz w:val="20"/>
           <w:szCs w:val="20"/>
         </w:rPr>
-        <w:t xml:space="preserve"> </w:t>
-      </w:r>
-      <w:proofErr w:type="spellStart"/>
+        <w:t xml:space="preserve"> Moq</w:t>
+      </w:r>
       <w:r>
         <w:rPr>
           <w:sz w:val="20"/>
           <w:szCs w:val="20"/>
         </w:rPr>
-        <w:t>Moq</w:t>
-      </w:r>
-      <w:proofErr w:type="spellEnd"/>
+        <w:t xml:space="preserve"> |</w:t>
+      </w:r>
       <w:r>
         <w:rPr>
           <w:sz w:val="20"/>
           <w:szCs w:val="20"/>
         </w:rPr>
-        <w:t xml:space="preserve"> |</w:t>
-      </w:r>
-      <w:r>
-        <w:rPr>
-          <w:sz w:val="20"/>
-          <w:szCs w:val="20"/>
-        </w:rPr>
-        <w:t xml:space="preserve"> </w:t>
-      </w:r>
-      <w:proofErr w:type="spellStart"/>
-      <w:r>
-        <w:rPr>
-          <w:sz w:val="20"/>
-          <w:szCs w:val="20"/>
-        </w:rPr>
-        <w:t>Shouldly</w:t>
-      </w:r>
-      <w:proofErr w:type="spellEnd"/>
+        <w:t xml:space="preserve"> Shouldly</w:t>
+      </w:r>
     </w:p>
     <w:p>
       <w:pPr>
@@ -1541,7 +1583,14 @@
           <w:sz w:val="21"/>
           <w:szCs w:val="21"/>
         </w:rPr>
-        <w:t>Developed the frontend and backend communication so changes made through the user interface could be processed by the application and stored in a SQL Server database.</w:t>
+        <w:t>Developed the application so changes made through the user interface are processed by the backend and stored persistently, keeping record information available between sessions</w:t>
+      </w:r>
+      <w:r>
+        <w:rPr>
+          <w:sz w:val="21"/>
+          <w:szCs w:val="21"/>
+        </w:rPr>
+        <w:t xml:space="preserve">. </w:t>
       </w:r>
     </w:p>
     <w:p>
@@ -1564,7 +1613,44 @@
           <w:sz w:val="21"/>
           <w:szCs w:val="21"/>
         </w:rPr>
-        <w:t>Used test-driven development to verify application behaviour and added API and database health checks to help identify whether key parts of the application were operating correctly.</w:t>
+        <w:t>Added automated testing and health checks to verify that key parts of the application behave correctly and to help identify problems with the application or database</w:t>
+      </w:r>
+      <w:r>
+        <w:rPr>
+          <w:sz w:val="21"/>
+          <w:szCs w:val="21"/>
+        </w:rPr>
+        <w:t>.</w:t>
+      </w:r>
+    </w:p>
+    <w:p>
+      <w:pPr>
+        <w:pStyle w:val="ListParagraph"/>
+        <w:numPr>
+          <w:ilvl w:val="0"/>
+          <w:numId w:val="18"/>
+        </w:numPr>
+        <w:spacing w:after="0" w:line="240" w:lineRule="auto"/>
+        <w:ind w:left="357" w:hanging="357"/>
+        <w:jc w:val="both"/>
+        <w:rPr>
+          <w:sz w:val="21"/>
+          <w:szCs w:val="21"/>
+        </w:rPr>
+      </w:pPr>
+      <w:r>
+        <w:rPr>
+          <w:sz w:val="21"/>
+          <w:szCs w:val="21"/>
+        </w:rPr>
+        <w:t>Deployed the completed application online using Railway, with the frontend and backend running as separate services and a Neon PostgreSQL database providing persistent production data</w:t>
+      </w:r>
+      <w:r>
+        <w:rPr>
+          <w:sz w:val="21"/>
+          <w:szCs w:val="21"/>
+        </w:rPr>
+        <w:t>.</w:t>
       </w:r>
     </w:p>
     <w:p>
@@ -1680,7 +1766,14 @@
           <w:sz w:val="21"/>
           <w:szCs w:val="21"/>
         </w:rPr>
-        <w:t xml:space="preserve">Intensive training in C# and modern software development practices  </w:t>
+        <w:t>i</w:t>
+      </w:r>
+      <w:r>
+        <w:rPr>
+          <w:sz w:val="21"/>
+          <w:szCs w:val="21"/>
+        </w:rPr>
+        <w:t xml:space="preserve">ntensive training in C# and modern software development practices  </w:t>
       </w:r>
     </w:p>
     <w:p>
@@ -1703,6 +1796,7 @@
           <w:sz w:val="21"/>
           <w:szCs w:val="21"/>
         </w:rPr>
+        <w:lastRenderedPageBreak/>
         <w:t>Appl</w:t>
       </w:r>
       <w:r>
@@ -1791,7 +1885,6 @@
           <w:sz w:val="21"/>
           <w:szCs w:val="21"/>
         </w:rPr>
-        <w:lastRenderedPageBreak/>
         <w:t>Buil</w:t>
       </w:r>
       <w:r>
@@ -2212,7 +2305,6 @@
         </w:rPr>
         <w:t>(</w:t>
       </w:r>
-      <w:proofErr w:type="spellStart"/>
       <w:r>
         <w:rPr>
           <w:sz w:val="21"/>
@@ -2220,7 +2312,6 @@
         </w:rPr>
         <w:t>Mosadaqa</w:t>
       </w:r>
-      <w:proofErr w:type="spellEnd"/>
       <w:r>
         <w:rPr>
           <w:sz w:val="21"/>
@@ -2402,21 +2493,12 @@
           <w:szCs w:val="21"/>
         </w:rPr>
       </w:pPr>
-      <w:proofErr w:type="spellStart"/>
-      <w:r>
-        <w:rPr>
-          <w:sz w:val="21"/>
-          <w:szCs w:val="21"/>
-        </w:rPr>
-        <w:t>UberEats</w:t>
-      </w:r>
-      <w:proofErr w:type="spellEnd"/>
-      <w:r>
-        <w:rPr>
-          <w:sz w:val="21"/>
-          <w:szCs w:val="21"/>
-        </w:rPr>
-        <w:t xml:space="preserve">, Deliveroo &amp; Stuart  </w:t>
+      <w:r>
+        <w:rPr>
+          <w:sz w:val="21"/>
+          <w:szCs w:val="21"/>
+        </w:rPr>
+        <w:t xml:space="preserve">UberEats, Deliveroo &amp; Stuart  </w:t>
       </w:r>
     </w:p>
     <w:p>
@@ -6833,7 +6915,6 @@
   <w:style w:type="character" w:default="1" w:styleId="DefaultParagraphFont">
     <w:name w:val="Default Paragraph Font"/>
     <w:uiPriority w:val="1"/>
-    <w:semiHidden/>
     <w:unhideWhenUsed/>
   </w:style>
   <w:style w:type="table" w:default="1" w:styleId="TableNormal">

</xml_diff>

<commit_message>
Update CV with live demo link for both projects
</commit_message>
<xml_diff>
--- a/Nazmul_Hussain_CV.docx
+++ b/Nazmul_Hussain_CV.docx
@@ -1,6 +1,6 @@
 
 <file path=word/document.xml><?xml version="1.0" encoding="utf-8"?>
-<w:document xmlns:wpc="http://schemas.microsoft.com/office/word/2010/wordprocessingCanvas" xmlns:cx="http://schemas.microsoft.com/office/drawing/2014/chartex" xmlns:cx1="http://schemas.microsoft.com/office/drawing/2015/9/8/chartex" xmlns:cx2="http://schemas.microsoft.com/office/drawing/2015/10/21/chartex" xmlns:cx3="http://schemas.microsoft.com/office/drawing/2016/5/9/chartex" xmlns:cx4="http://schemas.microsoft.com/office/drawing/2016/5/10/chartex" xmlns:cx5="http://schemas.microsoft.com/office/drawing/2016/5/11/chartex" xmlns:cx6="http://schemas.microsoft.com/office/drawing/2016/5/12/chartex" xmlns:cx7="http://schemas.microsoft.com/office/drawing/2016/5/13/chartex" xmlns:cx8="http://schemas.microsoft.com/office/drawing/2016/5/14/chartex" xmlns:mc="http://schemas.openxmlformats.org/markup-compatibility/2006" xmlns:aink="http://schemas.microsoft.com/office/drawing/2016/ink" xmlns:am3d="http://schemas.microsoft.com/office/drawing/2017/model3d" xmlns:o="urn:schemas-microsoft-com:office:office" xmlns:oel="http://schemas.microsoft.com/office/2019/extlst" xmlns:r="http://schemas.openxmlformats.org/officeDocument/2006/relationships" xmlns:m="http://schemas.openxmlformats.org/officeDocument/2006/math" xmlns:v="urn:schemas-microsoft-com:vml" xmlns:wp14="http://schemas.microsoft.com/office/word/2010/wordprocessingDrawing" xmlns:wp="http://schemas.openxmlformats.org/drawingml/2006/wordprocessingDrawing" xmlns:w10="urn:schemas-microsoft-com:office:word" xmlns:w="http://schemas.openxmlformats.org/wordprocessingml/2006/main" xmlns:w14="http://schemas.microsoft.com/office/word/2010/wordml" xmlns:w15="http://schemas.microsoft.com/office/word/2012/wordml" xmlns:w16cei="http://schemas.microsoft.com/office/word/2026/wordml/cei" xmlns:w16cex="http://schemas.microsoft.com/office/word/2018/wordml/cex" xmlns:w16cid="http://schemas.microsoft.com/office/word/2016/wordml/cid" xmlns:w16="http://schemas.microsoft.com/office/word/2018/wordml" xmlns:w16du="http://schemas.microsoft.com/office/word/2023/wordml/word16du" xmlns:w16sdtdh="http://schemas.microsoft.com/office/word/2020/wordml/sdtdatahash" xmlns:w16sdtfl="http://schemas.microsoft.com/office/word/2024/wordml/sdtformatlock" xmlns:w16se="http://schemas.microsoft.com/office/word/2015/wordml/symex" xmlns:wpg="http://schemas.microsoft.com/office/word/2010/wordprocessingGroup" xmlns:wpi="http://schemas.microsoft.com/office/word/2010/wordprocessingInk" xmlns:wne="http://schemas.microsoft.com/office/word/2006/wordml" xmlns:wps="http://schemas.microsoft.com/office/word/2010/wordprocessingShape" mc:Ignorable="w14 w15 w16se w16cid w16 w16cex w16sdtdh w16sdtfl w16du wp14">
+<w:document xmlns:wpc="http://schemas.microsoft.com/office/word/2010/wordprocessingCanvas" xmlns:cx="http://schemas.microsoft.com/office/drawing/2014/chartex" xmlns:cx1="http://schemas.microsoft.com/office/drawing/2015/9/8/chartex" xmlns:cx2="http://schemas.microsoft.com/office/drawing/2015/10/21/chartex" xmlns:cx3="http://schemas.microsoft.com/office/drawing/2016/5/9/chartex" xmlns:cx4="http://schemas.microsoft.com/office/drawing/2016/5/10/chartex" xmlns:cx5="http://schemas.microsoft.com/office/drawing/2016/5/11/chartex" xmlns:cx6="http://schemas.microsoft.com/office/drawing/2016/5/12/chartex" xmlns:cx7="http://schemas.microsoft.com/office/drawing/2016/5/13/chartex" xmlns:cx8="http://schemas.microsoft.com/office/drawing/2016/5/14/chartex" xmlns:mc="http://schemas.openxmlformats.org/markup-compatibility/2006" xmlns:aink="http://schemas.microsoft.com/office/drawing/2016/ink" xmlns:am3d="http://schemas.microsoft.com/office/drawing/2017/model3d" xmlns:o="urn:schemas-microsoft-com:office:office" xmlns:oel="http://schemas.microsoft.com/office/2019/extlst" xmlns:r="http://schemas.openxmlformats.org/officeDocument/2006/relationships" xmlns:m="http://schemas.openxmlformats.org/officeDocument/2006/math" xmlns:v="urn:schemas-microsoft-com:vml" xmlns:wp14="http://schemas.microsoft.com/office/word/2010/wordprocessingDrawing" xmlns:wp="http://schemas.openxmlformats.org/drawingml/2006/wordprocessingDrawing" xmlns:w10="urn:schemas-microsoft-com:office:word" xmlns:w="http://schemas.openxmlformats.org/wordprocessingml/2006/main" xmlns:w14="http://schemas.microsoft.com/office/word/2010/wordml" xmlns:w15="http://schemas.microsoft.com/office/word/2012/wordml" xmlns:w16cex="http://schemas.microsoft.com/office/word/2018/wordml/cex" xmlns:w16cid="http://schemas.microsoft.com/office/word/2016/wordml/cid" xmlns:w16="http://schemas.microsoft.com/office/word/2018/wordml" xmlns:w16du="http://schemas.microsoft.com/office/word/2023/wordml/word16du" xmlns:w16sdtdh="http://schemas.microsoft.com/office/word/2020/wordml/sdtdatahash" xmlns:w16sdtfl="http://schemas.microsoft.com/office/word/2024/wordml/sdtformatlock" xmlns:w16se="http://schemas.microsoft.com/office/word/2015/wordml/symex" xmlns:wpg="http://schemas.microsoft.com/office/word/2010/wordprocessingGroup" xmlns:wpi="http://schemas.microsoft.com/office/word/2010/wordprocessingInk" xmlns:wne="http://schemas.microsoft.com/office/word/2006/wordml" xmlns:wps="http://schemas.microsoft.com/office/word/2010/wordprocessingShape" mc:Ignorable="w14 w15 w16se w16cid w16 w16cex w16sdtdh w16sdtfl w16du wp14">
   <w:body>
     <w:p>
       <w:pPr>
@@ -823,6 +823,13 @@
           <w:sz w:val="21"/>
           <w:szCs w:val="21"/>
         </w:rPr>
+        <w:t xml:space="preserve">GitHub Actions, </w:t>
+      </w:r>
+      <w:r>
+        <w:rPr>
+          <w:sz w:val="21"/>
+          <w:szCs w:val="21"/>
+        </w:rPr>
         <w:t xml:space="preserve">Docker, </w:t>
       </w:r>
       <w:r>
@@ -837,14 +844,14 @@
           <w:sz w:val="21"/>
           <w:szCs w:val="21"/>
         </w:rPr>
-        <w:t xml:space="preserve">Rider, </w:t>
-      </w:r>
-      <w:r>
-        <w:rPr>
-          <w:sz w:val="21"/>
-          <w:szCs w:val="21"/>
-        </w:rPr>
-        <w:t>VS Code, PowerShell</w:t>
+        <w:t>Rider,</w:t>
+      </w:r>
+      <w:r>
+        <w:rPr>
+          <w:sz w:val="21"/>
+          <w:szCs w:val="21"/>
+        </w:rPr>
+        <w:t xml:space="preserve"> PowerShell</w:t>
       </w:r>
       <w:r>
         <w:rPr>
@@ -1016,19 +1023,8 @@
           <w:sz w:val="21"/>
           <w:szCs w:val="21"/>
         </w:rPr>
-        <w:t>Music Application (Team Project)</w:t>
-      </w:r>
-    </w:p>
-    <w:p>
-      <w:pPr>
-        <w:spacing w:after="0" w:line="240" w:lineRule="auto"/>
-        <w:ind w:left="0" w:firstLine="0"/>
-        <w:jc w:val="both"/>
-        <w:rPr>
-          <w:sz w:val="21"/>
-          <w:szCs w:val="21"/>
-        </w:rPr>
-      </w:pPr>
+        <w:t>Music Application (Team Project</w:t>
+      </w:r>
       <w:r>
         <w:rPr>
           <w:b/>
@@ -1036,6 +1032,84 @@
           <w:sz w:val="21"/>
           <w:szCs w:val="21"/>
         </w:rPr>
+        <w:t>, Extended Independently</w:t>
+      </w:r>
+      <w:r>
+        <w:rPr>
+          <w:b/>
+          <w:bCs/>
+          <w:sz w:val="21"/>
+          <w:szCs w:val="21"/>
+        </w:rPr>
+        <w:t>)</w:t>
+      </w:r>
+    </w:p>
+    <w:p>
+      <w:pPr>
+        <w:spacing w:after="0" w:line="240" w:lineRule="auto"/>
+        <w:ind w:left="0" w:firstLine="0"/>
+        <w:jc w:val="both"/>
+        <w:rPr>
+          <w:sz w:val="21"/>
+          <w:szCs w:val="21"/>
+        </w:rPr>
+      </w:pPr>
+      <w:r>
+        <w:rPr>
+          <w:b/>
+          <w:bCs/>
+          <w:sz w:val="21"/>
+          <w:szCs w:val="21"/>
+        </w:rPr>
+        <w:t>Live Demo:</w:t>
+      </w:r>
+      <w:r>
+        <w:rPr>
+          <w:sz w:val="21"/>
+          <w:szCs w:val="21"/>
+        </w:rPr>
+        <w:t xml:space="preserve"> </w:t>
+      </w:r>
+      <w:hyperlink r:id="rId10" w:history="1">
+        <w:r>
+          <w:rPr>
+            <w:rStyle w:val="Hyperlink"/>
+            <w:sz w:val="21"/>
+            <w:szCs w:val="21"/>
+          </w:rPr>
+          <w:t>Calico</w:t>
+        </w:r>
+      </w:hyperlink>
+      <w:r>
+        <w:rPr>
+          <w:sz w:val="21"/>
+          <w:szCs w:val="21"/>
+        </w:rPr>
+        <w:t xml:space="preserve"> </w:t>
+      </w:r>
+      <w:r>
+        <w:rPr>
+          <w:sz w:val="21"/>
+          <w:szCs w:val="21"/>
+        </w:rPr>
+        <w:t>|</w:t>
+      </w:r>
+      <w:r>
+        <w:rPr>
+          <w:b/>
+          <w:bCs/>
+          <w:sz w:val="21"/>
+          <w:szCs w:val="21"/>
+        </w:rPr>
+        <w:t xml:space="preserve"> </w:t>
+      </w:r>
+      <w:r>
+        <w:rPr>
+          <w:b/>
+          <w:bCs/>
+          <w:sz w:val="21"/>
+          <w:szCs w:val="21"/>
+        </w:rPr>
         <w:t>GitHub:</w:t>
       </w:r>
       <w:r>
@@ -1045,7 +1119,7 @@
         </w:rPr>
         <w:t xml:space="preserve"> </w:t>
       </w:r>
-      <w:hyperlink r:id="rId10" w:history="1">
+      <w:hyperlink r:id="rId11" w:history="1">
         <w:r>
           <w:rPr>
             <w:rStyle w:val="Hyperlink"/>
@@ -1062,7 +1136,7 @@
         </w:rPr>
         <w:t xml:space="preserve"> | </w:t>
       </w:r>
-      <w:hyperlink r:id="rId11" w:history="1">
+      <w:hyperlink r:id="rId12" w:history="1">
         <w:r>
           <w:rPr>
             <w:rStyle w:val="Hyperlink"/>
@@ -1177,7 +1251,21 @@
           <w:sz w:val="21"/>
           <w:szCs w:val="21"/>
         </w:rPr>
-        <w:t xml:space="preserve"> Git</w:t>
+        <w:t xml:space="preserve"> </w:t>
+      </w:r>
+      <w:r>
+        <w:rPr>
+          <w:sz w:val="21"/>
+          <w:szCs w:val="21"/>
+        </w:rPr>
+        <w:t xml:space="preserve">Docker | Railway | Azure SQL | </w:t>
+      </w:r>
+      <w:r>
+        <w:rPr>
+          <w:sz w:val="21"/>
+          <w:szCs w:val="21"/>
+        </w:rPr>
+        <w:t>Git</w:t>
       </w:r>
       <w:r>
         <w:rPr>
@@ -1265,6 +1353,52 @@
     </w:p>
     <w:p>
       <w:pPr>
+        <w:pStyle w:val="ListParagraph"/>
+        <w:numPr>
+          <w:ilvl w:val="0"/>
+          <w:numId w:val="18"/>
+        </w:numPr>
+        <w:spacing w:after="0" w:line="240" w:lineRule="auto"/>
+        <w:ind w:left="357" w:hanging="357"/>
+        <w:jc w:val="both"/>
+        <w:rPr>
+          <w:sz w:val="21"/>
+          <w:szCs w:val="21"/>
+        </w:rPr>
+      </w:pPr>
+      <w:r>
+        <w:rPr>
+          <w:sz w:val="21"/>
+          <w:szCs w:val="21"/>
+        </w:rPr>
+        <w:t>After the bootcamp, reviewed the application independently to find and fix security weaknesses, including issues that could have let users access or change other people's information without permission.</w:t>
+      </w:r>
+    </w:p>
+    <w:p>
+      <w:pPr>
+        <w:pStyle w:val="ListParagraph"/>
+        <w:numPr>
+          <w:ilvl w:val="0"/>
+          <w:numId w:val="18"/>
+        </w:numPr>
+        <w:spacing w:after="0" w:line="240" w:lineRule="auto"/>
+        <w:ind w:left="357" w:hanging="357"/>
+        <w:jc w:val="both"/>
+        <w:rPr>
+          <w:sz w:val="21"/>
+          <w:szCs w:val="21"/>
+        </w:rPr>
+      </w:pPr>
+      <w:r>
+        <w:rPr>
+          <w:sz w:val="21"/>
+          <w:szCs w:val="21"/>
+        </w:rPr>
+        <w:t>Rebuilt the login and sign-up process to work correctly, replaced a temporary placeholder for the music search feature with the real working version, finished the timer feature left incomplete during the bootcamp, and deployed the finished application online for anyone to use.</w:t>
+      </w:r>
+    </w:p>
+    <w:p>
+      <w:pPr>
         <w:spacing w:after="0" w:line="240" w:lineRule="auto"/>
         <w:ind w:left="0" w:firstLine="0"/>
         <w:jc w:val="both"/>
@@ -1342,7 +1476,7 @@
         </w:rPr>
         <w:t xml:space="preserve"> </w:t>
       </w:r>
-      <w:hyperlink r:id="rId12" w:history="1">
+      <w:hyperlink r:id="rId13" w:history="1">
         <w:r>
           <w:rPr>
             <w:rStyle w:val="Hyperlink"/>
@@ -1375,7 +1509,7 @@
         </w:rPr>
         <w:t xml:space="preserve"> </w:t>
       </w:r>
-      <w:hyperlink r:id="rId13" w:history="1">
+      <w:hyperlink r:id="rId14" w:history="1">
         <w:r>
           <w:rPr>
             <w:rStyle w:val="Hyperlink"/>
@@ -1392,7 +1526,7 @@
         </w:rPr>
         <w:t xml:space="preserve"> | </w:t>
       </w:r>
-      <w:hyperlink r:id="rId14" w:history="1">
+      <w:hyperlink r:id="rId15" w:history="1">
         <w:r>
           <w:rPr>
             <w:rStyle w:val="Hyperlink"/>
@@ -1502,7 +1636,21 @@
           <w:sz w:val="20"/>
           <w:szCs w:val="20"/>
         </w:rPr>
-        <w:t xml:space="preserve">Docker | </w:t>
+        <w:t>Docker</w:t>
+      </w:r>
+      <w:r>
+        <w:rPr>
+          <w:sz w:val="20"/>
+          <w:szCs w:val="20"/>
+        </w:rPr>
+        <w:t xml:space="preserve"> | Railway</w:t>
+      </w:r>
+      <w:r>
+        <w:rPr>
+          <w:sz w:val="20"/>
+          <w:szCs w:val="20"/>
+        </w:rPr>
+        <w:t xml:space="preserve"> | </w:t>
       </w:r>
       <w:r>
         <w:rPr>
@@ -1684,6 +1832,7 @@
           <w:sz w:val="26"/>
           <w:szCs w:val="26"/>
         </w:rPr>
+        <w:lastRenderedPageBreak/>
         <w:t>Professional Development</w:t>
       </w:r>
     </w:p>
@@ -1796,7 +1945,6 @@
           <w:sz w:val="21"/>
           <w:szCs w:val="21"/>
         </w:rPr>
-        <w:lastRenderedPageBreak/>
         <w:t>Appl</w:t>
       </w:r>
       <w:r>
@@ -3196,7 +3344,7 @@
 </file>
 
 <file path=word/endnotes.xml><?xml version="1.0" encoding="utf-8"?>
-<w:endnotes xmlns:wpc="http://schemas.microsoft.com/office/word/2010/wordprocessingCanvas" xmlns:cx="http://schemas.microsoft.com/office/drawing/2014/chartex" xmlns:cx1="http://schemas.microsoft.com/office/drawing/2015/9/8/chartex" xmlns:cx2="http://schemas.microsoft.com/office/drawing/2015/10/21/chartex" xmlns:cx3="http://schemas.microsoft.com/office/drawing/2016/5/9/chartex" xmlns:cx4="http://schemas.microsoft.com/office/drawing/2016/5/10/chartex" xmlns:cx5="http://schemas.microsoft.com/office/drawing/2016/5/11/chartex" xmlns:cx6="http://schemas.microsoft.com/office/drawing/2016/5/12/chartex" xmlns:cx7="http://schemas.microsoft.com/office/drawing/2016/5/13/chartex" xmlns:cx8="http://schemas.microsoft.com/office/drawing/2016/5/14/chartex" xmlns:mc="http://schemas.openxmlformats.org/markup-compatibility/2006" xmlns:aink="http://schemas.microsoft.com/office/drawing/2016/ink" xmlns:am3d="http://schemas.microsoft.com/office/drawing/2017/model3d" xmlns:o="urn:schemas-microsoft-com:office:office" xmlns:oel="http://schemas.microsoft.com/office/2019/extlst" xmlns:r="http://schemas.openxmlformats.org/officeDocument/2006/relationships" xmlns:m="http://schemas.openxmlformats.org/officeDocument/2006/math" xmlns:v="urn:schemas-microsoft-com:vml" xmlns:wp14="http://schemas.microsoft.com/office/word/2010/wordprocessingDrawing" xmlns:wp="http://schemas.openxmlformats.org/drawingml/2006/wordprocessingDrawing" xmlns:w10="urn:schemas-microsoft-com:office:word" xmlns:w="http://schemas.openxmlformats.org/wordprocessingml/2006/main" xmlns:w14="http://schemas.microsoft.com/office/word/2010/wordml" xmlns:w15="http://schemas.microsoft.com/office/word/2012/wordml" xmlns:w16cei="http://schemas.microsoft.com/office/word/2026/wordml/cei" xmlns:w16cex="http://schemas.microsoft.com/office/word/2018/wordml/cex" xmlns:w16cid="http://schemas.microsoft.com/office/word/2016/wordml/cid" xmlns:w16="http://schemas.microsoft.com/office/word/2018/wordml" xmlns:w16du="http://schemas.microsoft.com/office/word/2023/wordml/word16du" xmlns:w16sdtdh="http://schemas.microsoft.com/office/word/2020/wordml/sdtdatahash" xmlns:w16sdtfl="http://schemas.microsoft.com/office/word/2024/wordml/sdtformatlock" xmlns:w16se="http://schemas.microsoft.com/office/word/2015/wordml/symex" xmlns:wpg="http://schemas.microsoft.com/office/word/2010/wordprocessingGroup" xmlns:wpi="http://schemas.microsoft.com/office/word/2010/wordprocessingInk" xmlns:wne="http://schemas.microsoft.com/office/word/2006/wordml" xmlns:wps="http://schemas.microsoft.com/office/word/2010/wordprocessingShape" mc:Ignorable="w14 w15 w16se w16cid w16 w16cex w16sdtdh w16sdtfl w16du wp14">
+<w:endnotes xmlns:wpc="http://schemas.microsoft.com/office/word/2010/wordprocessingCanvas" xmlns:cx="http://schemas.microsoft.com/office/drawing/2014/chartex" xmlns:cx1="http://schemas.microsoft.com/office/drawing/2015/9/8/chartex" xmlns:cx2="http://schemas.microsoft.com/office/drawing/2015/10/21/chartex" xmlns:cx3="http://schemas.microsoft.com/office/drawing/2016/5/9/chartex" xmlns:cx4="http://schemas.microsoft.com/office/drawing/2016/5/10/chartex" xmlns:cx5="http://schemas.microsoft.com/office/drawing/2016/5/11/chartex" xmlns:cx6="http://schemas.microsoft.com/office/drawing/2016/5/12/chartex" xmlns:cx7="http://schemas.microsoft.com/office/drawing/2016/5/13/chartex" xmlns:cx8="http://schemas.microsoft.com/office/drawing/2016/5/14/chartex" xmlns:mc="http://schemas.openxmlformats.org/markup-compatibility/2006" xmlns:aink="http://schemas.microsoft.com/office/drawing/2016/ink" xmlns:am3d="http://schemas.microsoft.com/office/drawing/2017/model3d" xmlns:o="urn:schemas-microsoft-com:office:office" xmlns:oel="http://schemas.microsoft.com/office/2019/extlst" xmlns:r="http://schemas.openxmlformats.org/officeDocument/2006/relationships" xmlns:m="http://schemas.openxmlformats.org/officeDocument/2006/math" xmlns:v="urn:schemas-microsoft-com:vml" xmlns:wp14="http://schemas.microsoft.com/office/word/2010/wordprocessingDrawing" xmlns:wp="http://schemas.openxmlformats.org/drawingml/2006/wordprocessingDrawing" xmlns:w10="urn:schemas-microsoft-com:office:word" xmlns:w="http://schemas.openxmlformats.org/wordprocessingml/2006/main" xmlns:w14="http://schemas.microsoft.com/office/word/2010/wordml" xmlns:w15="http://schemas.microsoft.com/office/word/2012/wordml" xmlns:w16cex="http://schemas.microsoft.com/office/word/2018/wordml/cex" xmlns:w16cid="http://schemas.microsoft.com/office/word/2016/wordml/cid" xmlns:w16="http://schemas.microsoft.com/office/word/2018/wordml" xmlns:w16du="http://schemas.microsoft.com/office/word/2023/wordml/word16du" xmlns:w16sdtdh="http://schemas.microsoft.com/office/word/2020/wordml/sdtdatahash" xmlns:w16sdtfl="http://schemas.microsoft.com/office/word/2024/wordml/sdtformatlock" xmlns:w16se="http://schemas.microsoft.com/office/word/2015/wordml/symex" xmlns:wpg="http://schemas.microsoft.com/office/word/2010/wordprocessingGroup" xmlns:wpi="http://schemas.microsoft.com/office/word/2010/wordprocessingInk" xmlns:wne="http://schemas.microsoft.com/office/word/2006/wordml" xmlns:wps="http://schemas.microsoft.com/office/word/2010/wordprocessingShape" mc:Ignorable="w14 w15 w16se w16cid w16 w16cex w16sdtdh w16sdtfl w16du wp14">
   <w:endnote w:type="separator" w:id="-1">
     <w:p>
       <w:pPr>
@@ -3221,7 +3369,7 @@
 </file>
 
 <file path=word/footnotes.xml><?xml version="1.0" encoding="utf-8"?>
-<w:footnotes xmlns:wpc="http://schemas.microsoft.com/office/word/2010/wordprocessingCanvas" xmlns:cx="http://schemas.microsoft.com/office/drawing/2014/chartex" xmlns:cx1="http://schemas.microsoft.com/office/drawing/2015/9/8/chartex" xmlns:cx2="http://schemas.microsoft.com/office/drawing/2015/10/21/chartex" xmlns:cx3="http://schemas.microsoft.com/office/drawing/2016/5/9/chartex" xmlns:cx4="http://schemas.microsoft.com/office/drawing/2016/5/10/chartex" xmlns:cx5="http://schemas.microsoft.com/office/drawing/2016/5/11/chartex" xmlns:cx6="http://schemas.microsoft.com/office/drawing/2016/5/12/chartex" xmlns:cx7="http://schemas.microsoft.com/office/drawing/2016/5/13/chartex" xmlns:cx8="http://schemas.microsoft.com/office/drawing/2016/5/14/chartex" xmlns:mc="http://schemas.openxmlformats.org/markup-compatibility/2006" xmlns:aink="http://schemas.microsoft.com/office/drawing/2016/ink" xmlns:am3d="http://schemas.microsoft.com/office/drawing/2017/model3d" xmlns:o="urn:schemas-microsoft-com:office:office" xmlns:oel="http://schemas.microsoft.com/office/2019/extlst" xmlns:r="http://schemas.openxmlformats.org/officeDocument/2006/relationships" xmlns:m="http://schemas.openxmlformats.org/officeDocument/2006/math" xmlns:v="urn:schemas-microsoft-com:vml" xmlns:wp14="http://schemas.microsoft.com/office/word/2010/wordprocessingDrawing" xmlns:wp="http://schemas.openxmlformats.org/drawingml/2006/wordprocessingDrawing" xmlns:w10="urn:schemas-microsoft-com:office:word" xmlns:w="http://schemas.openxmlformats.org/wordprocessingml/2006/main" xmlns:w14="http://schemas.microsoft.com/office/word/2010/wordml" xmlns:w15="http://schemas.microsoft.com/office/word/2012/wordml" xmlns:w16cei="http://schemas.microsoft.com/office/word/2026/wordml/cei" xmlns:w16cex="http://schemas.microsoft.com/office/word/2018/wordml/cex" xmlns:w16cid="http://schemas.microsoft.com/office/word/2016/wordml/cid" xmlns:w16="http://schemas.microsoft.com/office/word/2018/wordml" xmlns:w16du="http://schemas.microsoft.com/office/word/2023/wordml/word16du" xmlns:w16sdtdh="http://schemas.microsoft.com/office/word/2020/wordml/sdtdatahash" xmlns:w16sdtfl="http://schemas.microsoft.com/office/word/2024/wordml/sdtformatlock" xmlns:w16se="http://schemas.microsoft.com/office/word/2015/wordml/symex" xmlns:wpg="http://schemas.microsoft.com/office/word/2010/wordprocessingGroup" xmlns:wpi="http://schemas.microsoft.com/office/word/2010/wordprocessingInk" xmlns:wne="http://schemas.microsoft.com/office/word/2006/wordml" xmlns:wps="http://schemas.microsoft.com/office/word/2010/wordprocessingShape" mc:Ignorable="w14 w15 w16se w16cid w16 w16cex w16sdtdh w16sdtfl w16du wp14">
+<w:footnotes xmlns:wpc="http://schemas.microsoft.com/office/word/2010/wordprocessingCanvas" xmlns:cx="http://schemas.microsoft.com/office/drawing/2014/chartex" xmlns:cx1="http://schemas.microsoft.com/office/drawing/2015/9/8/chartex" xmlns:cx2="http://schemas.microsoft.com/office/drawing/2015/10/21/chartex" xmlns:cx3="http://schemas.microsoft.com/office/drawing/2016/5/9/chartex" xmlns:cx4="http://schemas.microsoft.com/office/drawing/2016/5/10/chartex" xmlns:cx5="http://schemas.microsoft.com/office/drawing/2016/5/11/chartex" xmlns:cx6="http://schemas.microsoft.com/office/drawing/2016/5/12/chartex" xmlns:cx7="http://schemas.microsoft.com/office/drawing/2016/5/13/chartex" xmlns:cx8="http://schemas.microsoft.com/office/drawing/2016/5/14/chartex" xmlns:mc="http://schemas.openxmlformats.org/markup-compatibility/2006" xmlns:aink="http://schemas.microsoft.com/office/drawing/2016/ink" xmlns:am3d="http://schemas.microsoft.com/office/drawing/2017/model3d" xmlns:o="urn:schemas-microsoft-com:office:office" xmlns:oel="http://schemas.microsoft.com/office/2019/extlst" xmlns:r="http://schemas.openxmlformats.org/officeDocument/2006/relationships" xmlns:m="http://schemas.openxmlformats.org/officeDocument/2006/math" xmlns:v="urn:schemas-microsoft-com:vml" xmlns:wp14="http://schemas.microsoft.com/office/word/2010/wordprocessingDrawing" xmlns:wp="http://schemas.openxmlformats.org/drawingml/2006/wordprocessingDrawing" xmlns:w10="urn:schemas-microsoft-com:office:word" xmlns:w="http://schemas.openxmlformats.org/wordprocessingml/2006/main" xmlns:w14="http://schemas.microsoft.com/office/word/2010/wordml" xmlns:w15="http://schemas.microsoft.com/office/word/2012/wordml" xmlns:w16cex="http://schemas.microsoft.com/office/word/2018/wordml/cex" xmlns:w16cid="http://schemas.microsoft.com/office/word/2016/wordml/cid" xmlns:w16="http://schemas.microsoft.com/office/word/2018/wordml" xmlns:w16du="http://schemas.microsoft.com/office/word/2023/wordml/word16du" xmlns:w16sdtdh="http://schemas.microsoft.com/office/word/2020/wordml/sdtdatahash" xmlns:w16sdtfl="http://schemas.microsoft.com/office/word/2024/wordml/sdtformatlock" xmlns:w16se="http://schemas.microsoft.com/office/word/2015/wordml/symex" xmlns:wpg="http://schemas.microsoft.com/office/word/2010/wordprocessingGroup" xmlns:wpi="http://schemas.microsoft.com/office/word/2010/wordprocessingInk" xmlns:wne="http://schemas.microsoft.com/office/word/2006/wordml" xmlns:wps="http://schemas.microsoft.com/office/word/2010/wordprocessingShape" mc:Ignorable="w14 w15 w16se w16cid w16 w16cex w16sdtdh w16sdtfl w16du wp14">
   <w:footnote w:type="separator" w:id="-1">
     <w:p>
       <w:pPr>
@@ -3246,7 +3394,7 @@
 </file>
 
 <file path=word/numbering.xml><?xml version="1.0" encoding="utf-8"?>
-<w:numbering xmlns:wpc="http://schemas.microsoft.com/office/word/2010/wordprocessingCanvas" xmlns:cx="http://schemas.microsoft.com/office/drawing/2014/chartex" xmlns:cx1="http://schemas.microsoft.com/office/drawing/2015/9/8/chartex" xmlns:cx2="http://schemas.microsoft.com/office/drawing/2015/10/21/chartex" xmlns:cx3="http://schemas.microsoft.com/office/drawing/2016/5/9/chartex" xmlns:cx4="http://schemas.microsoft.com/office/drawing/2016/5/10/chartex" xmlns:cx5="http://schemas.microsoft.com/office/drawing/2016/5/11/chartex" xmlns:cx6="http://schemas.microsoft.com/office/drawing/2016/5/12/chartex" xmlns:cx7="http://schemas.microsoft.com/office/drawing/2016/5/13/chartex" xmlns:cx8="http://schemas.microsoft.com/office/drawing/2016/5/14/chartex" xmlns:mc="http://schemas.openxmlformats.org/markup-compatibility/2006" xmlns:aink="http://schemas.microsoft.com/office/drawing/2016/ink" xmlns:am3d="http://schemas.microsoft.com/office/drawing/2017/model3d" xmlns:o="urn:schemas-microsoft-com:office:office" xmlns:oel="http://schemas.microsoft.com/office/2019/extlst" xmlns:r="http://schemas.openxmlformats.org/officeDocument/2006/relationships" xmlns:m="http://schemas.openxmlformats.org/officeDocument/2006/math" xmlns:v="urn:schemas-microsoft-com:vml" xmlns:wp14="http://schemas.microsoft.com/office/word/2010/wordprocessingDrawing" xmlns:wp="http://schemas.openxmlformats.org/drawingml/2006/wordprocessingDrawing" xmlns:w10="urn:schemas-microsoft-com:office:word" xmlns:w="http://schemas.openxmlformats.org/wordprocessingml/2006/main" xmlns:w14="http://schemas.microsoft.com/office/word/2010/wordml" xmlns:w15="http://schemas.microsoft.com/office/word/2012/wordml" xmlns:w16cei="http://schemas.microsoft.com/office/word/2026/wordml/cei" xmlns:w16cex="http://schemas.microsoft.com/office/word/2018/wordml/cex" xmlns:w16cid="http://schemas.microsoft.com/office/word/2016/wordml/cid" xmlns:w16="http://schemas.microsoft.com/office/word/2018/wordml" xmlns:w16du="http://schemas.microsoft.com/office/word/2023/wordml/word16du" xmlns:w16sdtdh="http://schemas.microsoft.com/office/word/2020/wordml/sdtdatahash" xmlns:w16sdtfl="http://schemas.microsoft.com/office/word/2024/wordml/sdtformatlock" xmlns:w16se="http://schemas.microsoft.com/office/word/2015/wordml/symex" xmlns:wpg="http://schemas.microsoft.com/office/word/2010/wordprocessingGroup" xmlns:wpi="http://schemas.microsoft.com/office/word/2010/wordprocessingInk" xmlns:wne="http://schemas.microsoft.com/office/word/2006/wordml" xmlns:wps="http://schemas.microsoft.com/office/word/2010/wordprocessingShape" mc:Ignorable="w14 w15 w16se w16cid w16 w16cex w16sdtdh w16sdtfl w16du wp14">
+<w:numbering xmlns:wpc="http://schemas.microsoft.com/office/word/2010/wordprocessingCanvas" xmlns:cx="http://schemas.microsoft.com/office/drawing/2014/chartex" xmlns:cx1="http://schemas.microsoft.com/office/drawing/2015/9/8/chartex" xmlns:cx2="http://schemas.microsoft.com/office/drawing/2015/10/21/chartex" xmlns:cx3="http://schemas.microsoft.com/office/drawing/2016/5/9/chartex" xmlns:cx4="http://schemas.microsoft.com/office/drawing/2016/5/10/chartex" xmlns:cx5="http://schemas.microsoft.com/office/drawing/2016/5/11/chartex" xmlns:cx6="http://schemas.microsoft.com/office/drawing/2016/5/12/chartex" xmlns:cx7="http://schemas.microsoft.com/office/drawing/2016/5/13/chartex" xmlns:cx8="http://schemas.microsoft.com/office/drawing/2016/5/14/chartex" xmlns:mc="http://schemas.openxmlformats.org/markup-compatibility/2006" xmlns:aink="http://schemas.microsoft.com/office/drawing/2016/ink" xmlns:am3d="http://schemas.microsoft.com/office/drawing/2017/model3d" xmlns:o="urn:schemas-microsoft-com:office:office" xmlns:oel="http://schemas.microsoft.com/office/2019/extlst" xmlns:r="http://schemas.openxmlformats.org/officeDocument/2006/relationships" xmlns:m="http://schemas.openxmlformats.org/officeDocument/2006/math" xmlns:v="urn:schemas-microsoft-com:vml" xmlns:wp14="http://schemas.microsoft.com/office/word/2010/wordprocessingDrawing" xmlns:wp="http://schemas.openxmlformats.org/drawingml/2006/wordprocessingDrawing" xmlns:w10="urn:schemas-microsoft-com:office:word" xmlns:w="http://schemas.openxmlformats.org/wordprocessingml/2006/main" xmlns:w14="http://schemas.microsoft.com/office/word/2010/wordml" xmlns:w15="http://schemas.microsoft.com/office/word/2012/wordml" xmlns:w16cex="http://schemas.microsoft.com/office/word/2018/wordml/cex" xmlns:w16cid="http://schemas.microsoft.com/office/word/2016/wordml/cid" xmlns:w16="http://schemas.microsoft.com/office/word/2018/wordml" xmlns:w16du="http://schemas.microsoft.com/office/word/2023/wordml/word16du" xmlns:w16sdtdh="http://schemas.microsoft.com/office/word/2020/wordml/sdtdatahash" xmlns:w16sdtfl="http://schemas.microsoft.com/office/word/2024/wordml/sdtformatlock" xmlns:w16se="http://schemas.microsoft.com/office/word/2015/wordml/symex" xmlns:wpg="http://schemas.microsoft.com/office/word/2010/wordprocessingGroup" xmlns:wpi="http://schemas.microsoft.com/office/word/2010/wordprocessingInk" xmlns:wne="http://schemas.microsoft.com/office/word/2006/wordml" xmlns:wps="http://schemas.microsoft.com/office/word/2010/wordprocessingShape" mc:Ignorable="w14 w15 w16se w16cid w16 w16cex w16sdtdh w16sdtfl w16du wp14">
   <w:abstractNum w:abstractNumId="0" w15:restartNumberingAfterBreak="0">
     <w:nsid w:val="04C77AFA"/>
     <w:multiLevelType w:val="hybridMultilevel"/>

</xml_diff>

<commit_message>
Update CV content and formatting
</commit_message>
<xml_diff>
--- a/Nazmul_Hussain_CV.docx
+++ b/Nazmul_Hussain_CV.docx
@@ -229,13 +229,14 @@
         <w:ind w:right="50"/>
         <w:jc w:val="both"/>
         <w:rPr>
+          <w:bCs/>
           <w:sz w:val="16"/>
           <w:szCs w:val="16"/>
         </w:rPr>
       </w:pPr>
       <w:r>
         <w:rPr>
-          <w:b/>
+          <w:bCs/>
           <w:sz w:val="16"/>
           <w:szCs w:val="16"/>
         </w:rPr>
@@ -339,14 +340,14 @@
           <w:sz w:val="21"/>
           <w:szCs w:val="21"/>
         </w:rPr>
-        <w:t>bootcamp, with a strong interest in technology and software development. My interest developed through hands-on experience</w:t>
-      </w:r>
-      <w:r>
-        <w:rPr>
-          <w:sz w:val="21"/>
-          <w:szCs w:val="21"/>
-        </w:rPr>
-        <w:t xml:space="preserve"> building and</w:t>
+        <w:t xml:space="preserve">bootcamp, with a strong interest in technology and software development. </w:t>
+      </w:r>
+      <w:r>
+        <w:rPr>
+          <w:sz w:val="21"/>
+          <w:szCs w:val="21"/>
+        </w:rPr>
+        <w:t>My curiosity about technology grew through</w:t>
       </w:r>
       <w:r>
         <w:rPr>
@@ -360,28 +361,70 @@
           <w:sz w:val="21"/>
           <w:szCs w:val="21"/>
         </w:rPr>
-        <w:t>u</w:t>
-      </w:r>
-      <w:r>
-        <w:rPr>
-          <w:sz w:val="21"/>
-          <w:szCs w:val="21"/>
-        </w:rPr>
-        <w:t xml:space="preserve">pgrading my own PC, which sparked my curiosity for problem-solving and </w:t>
-      </w:r>
-      <w:r>
-        <w:rPr>
-          <w:sz w:val="21"/>
-          <w:szCs w:val="21"/>
-        </w:rPr>
-        <w:t>software systems</w:t>
-      </w:r>
-      <w:r>
-        <w:rPr>
-          <w:sz w:val="21"/>
-          <w:szCs w:val="21"/>
-        </w:rPr>
-        <w:t>.</w:t>
+        <w:t>building and upgrading my PC,</w:t>
+      </w:r>
+      <w:r>
+        <w:rPr>
+          <w:sz w:val="21"/>
+          <w:szCs w:val="21"/>
+        </w:rPr>
+        <w:t xml:space="preserve"> </w:t>
+      </w:r>
+      <w:r>
+        <w:rPr>
+          <w:sz w:val="21"/>
+          <w:szCs w:val="21"/>
+        </w:rPr>
+        <w:t xml:space="preserve">which </w:t>
+      </w:r>
+      <w:r>
+        <w:rPr>
+          <w:sz w:val="21"/>
+          <w:szCs w:val="21"/>
+        </w:rPr>
+        <w:t>spark</w:t>
+      </w:r>
+      <w:r>
+        <w:rPr>
+          <w:sz w:val="21"/>
+          <w:szCs w:val="21"/>
+        </w:rPr>
+        <w:t>ed</w:t>
+      </w:r>
+      <w:r>
+        <w:rPr>
+          <w:sz w:val="21"/>
+          <w:szCs w:val="21"/>
+        </w:rPr>
+        <w:t xml:space="preserve"> my interest in problem</w:t>
+      </w:r>
+      <w:r>
+        <w:rPr>
+          <w:sz w:val="21"/>
+          <w:szCs w:val="21"/>
+        </w:rPr>
+        <w:t>-</w:t>
+      </w:r>
+      <w:r>
+        <w:rPr>
+          <w:sz w:val="21"/>
+          <w:szCs w:val="21"/>
+        </w:rPr>
+        <w:t>solving and</w:t>
+      </w:r>
+      <w:r>
+        <w:rPr>
+          <w:sz w:val="21"/>
+          <w:szCs w:val="21"/>
+        </w:rPr>
+        <w:t xml:space="preserve"> in</w:t>
+      </w:r>
+      <w:r>
+        <w:rPr>
+          <w:sz w:val="21"/>
+          <w:szCs w:val="21"/>
+        </w:rPr>
+        <w:t xml:space="preserve"> how software systems work.</w:t>
       </w:r>
     </w:p>
     <w:p>
@@ -410,7 +453,56 @@
           <w:sz w:val="21"/>
           <w:szCs w:val="21"/>
         </w:rPr>
-        <w:t>With a background in computing and experience working in structured, data-focused environments, I have developed a logical and detail-oriented approach. I particularly enjoy backend development and building reliable applications using clean and well-structured code.</w:t>
+        <w:t>Although software development was something I had</w:t>
+      </w:r>
+      <w:r>
+        <w:rPr>
+          <w:sz w:val="21"/>
+          <w:szCs w:val="21"/>
+        </w:rPr>
+        <w:t xml:space="preserve"> </w:t>
+      </w:r>
+      <w:r>
+        <w:rPr>
+          <w:sz w:val="21"/>
+          <w:szCs w:val="21"/>
+        </w:rPr>
+        <w:t>wanted to pursue for many years, I initially lacked the skills to turn that interest into a career. I</w:t>
+      </w:r>
+      <w:r>
+        <w:rPr>
+          <w:sz w:val="21"/>
+          <w:szCs w:val="21"/>
+        </w:rPr>
+        <w:t xml:space="preserve"> </w:t>
+      </w:r>
+      <w:r>
+        <w:rPr>
+          <w:sz w:val="21"/>
+          <w:szCs w:val="21"/>
+        </w:rPr>
+        <w:t>develop</w:t>
+      </w:r>
+      <w:r>
+        <w:rPr>
+          <w:sz w:val="21"/>
+          <w:szCs w:val="21"/>
+        </w:rPr>
+        <w:t>ed</w:t>
+      </w:r>
+      <w:r>
+        <w:rPr>
+          <w:sz w:val="21"/>
+          <w:szCs w:val="21"/>
+        </w:rPr>
+        <w:t xml:space="preserve"> those skills through Northcoders, building on my previous computing background and experience working in structured, data-focused environments</w:t>
+      </w:r>
+      <w:r>
+        <w:rPr>
+          <w:sz w:val="21"/>
+          <w:szCs w:val="21"/>
+        </w:rPr>
+        <w:t>.</w:t>
       </w:r>
     </w:p>
     <w:p>
@@ -439,7 +531,84 @@
           <w:sz w:val="21"/>
           <w:szCs w:val="21"/>
         </w:rPr>
-        <w:t>I am looking forward to applying my skills in a junior developer role, continuing to develop as a software engineer, and contributing as a valued member of a team.</w:t>
+        <w:t>Since completing the bootcamp, I have continued developing independently by extending and</w:t>
+      </w:r>
+      <w:r>
+        <w:rPr>
+          <w:sz w:val="21"/>
+          <w:szCs w:val="21"/>
+        </w:rPr>
+        <w:t xml:space="preserve"> deploying</w:t>
+      </w:r>
+      <w:r>
+        <w:rPr>
+          <w:sz w:val="21"/>
+          <w:szCs w:val="21"/>
+        </w:rPr>
+        <w:t xml:space="preserve"> my projects and creating my own portfolio website to showcase my work. </w:t>
+      </w:r>
+      <w:r>
+        <w:rPr>
+          <w:sz w:val="21"/>
+          <w:szCs w:val="21"/>
+        </w:rPr>
+        <w:t xml:space="preserve">I am looking forward to </w:t>
+      </w:r>
+      <w:r>
+        <w:rPr>
+          <w:sz w:val="21"/>
+          <w:szCs w:val="21"/>
+        </w:rPr>
+        <w:t>putting</w:t>
+      </w:r>
+      <w:r>
+        <w:rPr>
+          <w:sz w:val="21"/>
+          <w:szCs w:val="21"/>
+        </w:rPr>
+        <w:t xml:space="preserve"> my skills in</w:t>
+      </w:r>
+      <w:r>
+        <w:rPr>
+          <w:sz w:val="21"/>
+          <w:szCs w:val="21"/>
+        </w:rPr>
+        <w:t xml:space="preserve">to practice, </w:t>
+      </w:r>
+      <w:r>
+        <w:rPr>
+          <w:sz w:val="21"/>
+          <w:szCs w:val="21"/>
+        </w:rPr>
+        <w:t xml:space="preserve">continuing to develop as a software </w:t>
+      </w:r>
+      <w:r>
+        <w:rPr>
+          <w:sz w:val="21"/>
+          <w:szCs w:val="21"/>
+        </w:rPr>
+        <w:t>developer</w:t>
+      </w:r>
+      <w:r>
+        <w:rPr>
+          <w:sz w:val="21"/>
+          <w:szCs w:val="21"/>
+        </w:rPr>
+        <w:t xml:space="preserve">, and contributing as a valued member of </w:t>
+      </w:r>
+      <w:r>
+        <w:rPr>
+          <w:sz w:val="21"/>
+          <w:szCs w:val="21"/>
+        </w:rPr>
+        <w:t>my</w:t>
+      </w:r>
+      <w:r>
+        <w:rPr>
+          <w:sz w:val="21"/>
+          <w:szCs w:val="21"/>
+        </w:rPr>
+        <w:t xml:space="preserve"> team.</w:t>
       </w:r>
     </w:p>
     <w:p>
@@ -502,60 +671,8 @@
           <w:sz w:val="21"/>
           <w:szCs w:val="21"/>
         </w:rPr>
-        <w:t>Languages &amp; Core:</w:t>
-      </w:r>
-      <w:r>
-        <w:rPr>
-          <w:sz w:val="21"/>
-          <w:szCs w:val="21"/>
-        </w:rPr>
-        <w:t xml:space="preserve"> </w:t>
-      </w:r>
-      <w:r>
-        <w:rPr>
-          <w:sz w:val="21"/>
-          <w:szCs w:val="21"/>
-        </w:rPr>
-        <w:tab/>
-      </w:r>
-      <w:r>
-        <w:rPr>
-          <w:sz w:val="21"/>
-          <w:szCs w:val="21"/>
-        </w:rPr>
-        <w:tab/>
-      </w:r>
-      <w:r>
-        <w:rPr>
-          <w:sz w:val="21"/>
-          <w:szCs w:val="21"/>
-        </w:rPr>
-        <w:t xml:space="preserve">C#, .NET, </w:t>
-      </w:r>
-      <w:r>
-        <w:rPr>
-          <w:sz w:val="21"/>
-          <w:szCs w:val="21"/>
-        </w:rPr>
-        <w:t xml:space="preserve">Java, </w:t>
-      </w:r>
-      <w:r>
-        <w:rPr>
-          <w:sz w:val="21"/>
-          <w:szCs w:val="21"/>
-        </w:rPr>
-        <w:t xml:space="preserve">Object-Oriented Programming, LINQ, Async Programming  </w:t>
-      </w:r>
-    </w:p>
-    <w:p>
-      <w:pPr>
-        <w:spacing w:after="0" w:line="240" w:lineRule="auto"/>
-        <w:jc w:val="both"/>
-        <w:rPr>
-          <w:sz w:val="21"/>
-          <w:szCs w:val="21"/>
-        </w:rPr>
-      </w:pPr>
+        <w:t xml:space="preserve">Languages &amp; </w:t>
+      </w:r>
       <w:r>
         <w:rPr>
           <w:b/>
@@ -563,67 +680,8 @@
           <w:sz w:val="21"/>
           <w:szCs w:val="21"/>
         </w:rPr>
-        <w:t>Testing &amp; Practices:</w:t>
-      </w:r>
-      <w:r>
-        <w:rPr>
-          <w:sz w:val="21"/>
-          <w:szCs w:val="21"/>
-        </w:rPr>
-        <w:t xml:space="preserve"> </w:t>
-      </w:r>
-      <w:r>
-        <w:rPr>
-          <w:sz w:val="21"/>
-          <w:szCs w:val="21"/>
-        </w:rPr>
-        <w:tab/>
-      </w:r>
-      <w:r>
-        <w:rPr>
-          <w:sz w:val="21"/>
-          <w:szCs w:val="21"/>
-        </w:rPr>
-        <w:tab/>
-      </w:r>
-      <w:r>
-        <w:rPr>
-          <w:sz w:val="21"/>
-          <w:szCs w:val="21"/>
-        </w:rPr>
-        <w:t xml:space="preserve">Test-Driven Development (TDD), NUnit, </w:t>
-      </w:r>
-      <w:r>
-        <w:rPr>
-          <w:sz w:val="21"/>
-          <w:szCs w:val="21"/>
-        </w:rPr>
-        <w:t xml:space="preserve">Shouldly, </w:t>
-      </w:r>
-      <w:r>
-        <w:rPr>
-          <w:sz w:val="21"/>
-          <w:szCs w:val="21"/>
-        </w:rPr>
-        <w:t>Moq</w:t>
-      </w:r>
-      <w:r>
-        <w:rPr>
-          <w:sz w:val="21"/>
-          <w:szCs w:val="21"/>
-        </w:rPr>
-        <w:t>, Agile Development</w:t>
-      </w:r>
-    </w:p>
-    <w:p>
-      <w:pPr>
-        <w:spacing w:after="0" w:line="240" w:lineRule="auto"/>
-        <w:jc w:val="both"/>
-        <w:rPr>
-          <w:sz w:val="21"/>
-          <w:szCs w:val="21"/>
-        </w:rPr>
-      </w:pPr>
+        <w:t>Development</w:t>
+      </w:r>
       <w:r>
         <w:rPr>
           <w:b/>
@@ -631,56 +689,49 @@
           <w:sz w:val="21"/>
           <w:szCs w:val="21"/>
         </w:rPr>
-        <w:t>Backend:</w:t>
-      </w:r>
-      <w:r>
-        <w:rPr>
-          <w:sz w:val="21"/>
-          <w:szCs w:val="21"/>
-        </w:rPr>
-        <w:t xml:space="preserve"> </w:t>
-      </w:r>
-      <w:r>
-        <w:rPr>
-          <w:sz w:val="21"/>
-          <w:szCs w:val="21"/>
-        </w:rPr>
-        <w:tab/>
-      </w:r>
-      <w:r>
-        <w:rPr>
-          <w:sz w:val="21"/>
-          <w:szCs w:val="21"/>
-        </w:rPr>
-        <w:tab/>
-      </w:r>
-      <w:r>
-        <w:rPr>
-          <w:sz w:val="21"/>
-          <w:szCs w:val="21"/>
-        </w:rPr>
-        <w:tab/>
-      </w:r>
-      <w:r>
-        <w:rPr>
-          <w:sz w:val="21"/>
-          <w:szCs w:val="21"/>
-        </w:rPr>
-        <w:t>ASP.NET Core, MVC</w:t>
-      </w:r>
-      <w:r>
-        <w:rPr>
-          <w:sz w:val="21"/>
-          <w:szCs w:val="21"/>
-        </w:rPr>
-        <w:t>, REST APIs</w:t>
-      </w:r>
-      <w:r>
-        <w:rPr>
-          <w:sz w:val="21"/>
-          <w:szCs w:val="21"/>
-        </w:rPr>
-        <w:t xml:space="preserve">, Dependency Injection, Entity Framework Core </w:t>
+        <w:t>:</w:t>
+      </w:r>
+      <w:r>
+        <w:rPr>
+          <w:sz w:val="21"/>
+          <w:szCs w:val="21"/>
+        </w:rPr>
+        <w:t xml:space="preserve">         </w:t>
+      </w:r>
+      <w:r>
+        <w:rPr>
+          <w:sz w:val="21"/>
+          <w:szCs w:val="21"/>
+        </w:rPr>
+        <w:t xml:space="preserve">C#, .NET, </w:t>
+      </w:r>
+      <w:r>
+        <w:rPr>
+          <w:sz w:val="21"/>
+          <w:szCs w:val="21"/>
+        </w:rPr>
+        <w:t xml:space="preserve">Java, </w:t>
+      </w:r>
+      <w:r>
+        <w:rPr>
+          <w:sz w:val="21"/>
+          <w:szCs w:val="21"/>
+        </w:rPr>
+        <w:t>Object-Oriented Programming, LINQ, Async</w:t>
+      </w:r>
+      <w:r>
+        <w:rPr>
+          <w:sz w:val="21"/>
+          <w:szCs w:val="21"/>
+        </w:rPr>
+        <w:t>hronous</w:t>
+      </w:r>
+      <w:r>
+        <w:rPr>
+          <w:sz w:val="21"/>
+          <w:szCs w:val="21"/>
+        </w:rPr>
+        <w:t xml:space="preserve"> Programming  </w:t>
       </w:r>
     </w:p>
     <w:p>
@@ -699,7 +750,7 @@
           <w:sz w:val="21"/>
           <w:szCs w:val="21"/>
         </w:rPr>
-        <w:t>Databases:</w:t>
+        <w:t>Testing &amp; Practices:</w:t>
       </w:r>
       <w:r>
         <w:rPr>
@@ -720,42 +771,35 @@
           <w:sz w:val="21"/>
           <w:szCs w:val="21"/>
         </w:rPr>
-        <w:tab/>
-      </w:r>
-      <w:r>
-        <w:rPr>
-          <w:sz w:val="21"/>
-          <w:szCs w:val="21"/>
-        </w:rPr>
-        <w:tab/>
-      </w:r>
-      <w:r>
-        <w:rPr>
-          <w:sz w:val="21"/>
-          <w:szCs w:val="21"/>
-        </w:rPr>
-        <w:t xml:space="preserve">PostgreSQL, </w:t>
-      </w:r>
-      <w:r>
-        <w:rPr>
-          <w:sz w:val="21"/>
-          <w:szCs w:val="21"/>
-        </w:rPr>
-        <w:t xml:space="preserve">SQL Server, </w:t>
-      </w:r>
-      <w:r>
-        <w:rPr>
-          <w:sz w:val="21"/>
-          <w:szCs w:val="21"/>
-        </w:rPr>
-        <w:t xml:space="preserve">SQLite, </w:t>
-      </w:r>
-      <w:r>
-        <w:rPr>
-          <w:sz w:val="21"/>
-          <w:szCs w:val="21"/>
-        </w:rPr>
-        <w:t>T-SQL, ADO.NET</w:t>
+        <w:t xml:space="preserve">             </w:t>
+      </w:r>
+      <w:r>
+        <w:rPr>
+          <w:sz w:val="21"/>
+          <w:szCs w:val="21"/>
+        </w:rPr>
+        <w:t xml:space="preserve">Test-Driven Development (TDD), NUnit, </w:t>
+      </w:r>
+      <w:r>
+        <w:rPr>
+          <w:sz w:val="21"/>
+          <w:szCs w:val="21"/>
+        </w:rPr>
+        <w:t xml:space="preserve">Shouldly, </w:t>
+      </w:r>
+      <w:r>
+        <w:rPr>
+          <w:sz w:val="21"/>
+          <w:szCs w:val="21"/>
+        </w:rPr>
+        <w:t>Moq</w:t>
+      </w:r>
+      <w:r>
+        <w:rPr>
+          <w:sz w:val="21"/>
+          <w:szCs w:val="21"/>
+        </w:rPr>
+        <w:t>, Agile Development</w:t>
       </w:r>
     </w:p>
     <w:p>
@@ -774,7 +818,7 @@
           <w:sz w:val="21"/>
           <w:szCs w:val="21"/>
         </w:rPr>
-        <w:t>Tools:</w:t>
+        <w:t>Backend:</w:t>
       </w:r>
       <w:r>
         <w:rPr>
@@ -802,70 +846,28 @@
           <w:sz w:val="21"/>
           <w:szCs w:val="21"/>
         </w:rPr>
-        <w:tab/>
-      </w:r>
-      <w:r>
-        <w:rPr>
-          <w:sz w:val="21"/>
-          <w:szCs w:val="21"/>
-        </w:rPr>
-        <w:tab/>
-      </w:r>
-      <w:r>
-        <w:rPr>
-          <w:sz w:val="21"/>
-          <w:szCs w:val="21"/>
-        </w:rPr>
-        <w:t xml:space="preserve">Git, GitHub, </w:t>
-      </w:r>
-      <w:r>
-        <w:rPr>
-          <w:sz w:val="21"/>
-          <w:szCs w:val="21"/>
-        </w:rPr>
-        <w:t xml:space="preserve">GitHub Actions, </w:t>
-      </w:r>
-      <w:r>
-        <w:rPr>
-          <w:sz w:val="21"/>
-          <w:szCs w:val="21"/>
-        </w:rPr>
-        <w:t xml:space="preserve">Docker, </w:t>
-      </w:r>
-      <w:r>
-        <w:rPr>
-          <w:sz w:val="21"/>
-          <w:szCs w:val="21"/>
-        </w:rPr>
-        <w:t xml:space="preserve">Visual Studio, </w:t>
-      </w:r>
-      <w:r>
-        <w:rPr>
-          <w:sz w:val="21"/>
-          <w:szCs w:val="21"/>
-        </w:rPr>
-        <w:t>Rider,</w:t>
-      </w:r>
-      <w:r>
-        <w:rPr>
-          <w:sz w:val="21"/>
-          <w:szCs w:val="21"/>
-        </w:rPr>
-        <w:t xml:space="preserve"> PowerShell</w:t>
-      </w:r>
-      <w:r>
-        <w:rPr>
-          <w:sz w:val="21"/>
-          <w:szCs w:val="21"/>
-        </w:rPr>
-        <w:t>, Trello</w:t>
-      </w:r>
-      <w:r>
-        <w:rPr>
-          <w:sz w:val="21"/>
-          <w:szCs w:val="21"/>
-        </w:rPr>
-        <w:t xml:space="preserve">  </w:t>
+        <w:t xml:space="preserve">             </w:t>
+      </w:r>
+      <w:r>
+        <w:rPr>
+          <w:sz w:val="21"/>
+          <w:szCs w:val="21"/>
+        </w:rPr>
+        <w:t>ASP.NET Core, MVC</w:t>
+      </w:r>
+      <w:r>
+        <w:rPr>
+          <w:sz w:val="21"/>
+          <w:szCs w:val="21"/>
+        </w:rPr>
+        <w:t>, REST APIs</w:t>
+      </w:r>
+      <w:r>
+        <w:rPr>
+          <w:sz w:val="21"/>
+          <w:szCs w:val="21"/>
+        </w:rPr>
+        <w:t xml:space="preserve">, Dependency Injection, Entity Framework Core </w:t>
       </w:r>
     </w:p>
     <w:p>
@@ -884,8 +886,81 @@
           <w:sz w:val="21"/>
           <w:szCs w:val="21"/>
         </w:rPr>
-        <w:t>Frontend</w:t>
-      </w:r>
+        <w:t>Databases:</w:t>
+      </w:r>
+      <w:r>
+        <w:rPr>
+          <w:sz w:val="21"/>
+          <w:szCs w:val="21"/>
+        </w:rPr>
+        <w:t xml:space="preserve"> </w:t>
+      </w:r>
+      <w:r>
+        <w:rPr>
+          <w:sz w:val="21"/>
+          <w:szCs w:val="21"/>
+        </w:rPr>
+        <w:tab/>
+      </w:r>
+      <w:r>
+        <w:rPr>
+          <w:sz w:val="21"/>
+          <w:szCs w:val="21"/>
+        </w:rPr>
+        <w:tab/>
+      </w:r>
+      <w:r>
+        <w:rPr>
+          <w:sz w:val="21"/>
+          <w:szCs w:val="21"/>
+        </w:rPr>
+        <w:t xml:space="preserve">             </w:t>
+      </w:r>
+      <w:r>
+        <w:rPr>
+          <w:sz w:val="21"/>
+          <w:szCs w:val="21"/>
+        </w:rPr>
+        <w:t xml:space="preserve">PostgreSQL, </w:t>
+      </w:r>
+      <w:r>
+        <w:rPr>
+          <w:sz w:val="21"/>
+          <w:szCs w:val="21"/>
+        </w:rPr>
+        <w:t xml:space="preserve">SQL Server, </w:t>
+      </w:r>
+      <w:r>
+        <w:rPr>
+          <w:sz w:val="21"/>
+          <w:szCs w:val="21"/>
+        </w:rPr>
+        <w:t xml:space="preserve">SQLite, </w:t>
+      </w:r>
+      <w:r>
+        <w:rPr>
+          <w:sz w:val="21"/>
+          <w:szCs w:val="21"/>
+        </w:rPr>
+        <w:t xml:space="preserve">Azure SQL, </w:t>
+      </w:r>
+      <w:r>
+        <w:rPr>
+          <w:sz w:val="21"/>
+          <w:szCs w:val="21"/>
+        </w:rPr>
+        <w:t>T-SQL, ADO.NET</w:t>
+      </w:r>
+    </w:p>
+    <w:p>
+      <w:pPr>
+        <w:spacing w:after="0" w:line="240" w:lineRule="auto"/>
+        <w:jc w:val="both"/>
+        <w:rPr>
+          <w:sz w:val="21"/>
+          <w:szCs w:val="21"/>
+        </w:rPr>
+      </w:pPr>
       <w:r>
         <w:rPr>
           <w:b/>
@@ -893,6 +968,125 @@
           <w:sz w:val="21"/>
           <w:szCs w:val="21"/>
         </w:rPr>
+        <w:t>Tools:</w:t>
+      </w:r>
+      <w:r>
+        <w:rPr>
+          <w:sz w:val="21"/>
+          <w:szCs w:val="21"/>
+        </w:rPr>
+        <w:t xml:space="preserve"> </w:t>
+      </w:r>
+      <w:r>
+        <w:rPr>
+          <w:sz w:val="21"/>
+          <w:szCs w:val="21"/>
+        </w:rPr>
+        <w:tab/>
+      </w:r>
+      <w:r>
+        <w:rPr>
+          <w:sz w:val="21"/>
+          <w:szCs w:val="21"/>
+        </w:rPr>
+        <w:tab/>
+      </w:r>
+      <w:r>
+        <w:rPr>
+          <w:sz w:val="21"/>
+          <w:szCs w:val="21"/>
+        </w:rPr>
+        <w:tab/>
+      </w:r>
+      <w:r>
+        <w:rPr>
+          <w:sz w:val="21"/>
+          <w:szCs w:val="21"/>
+        </w:rPr>
+        <w:t xml:space="preserve">             </w:t>
+      </w:r>
+      <w:r>
+        <w:rPr>
+          <w:sz w:val="21"/>
+          <w:szCs w:val="21"/>
+        </w:rPr>
+        <w:t xml:space="preserve">Git, GitHub, </w:t>
+      </w:r>
+      <w:r>
+        <w:rPr>
+          <w:sz w:val="21"/>
+          <w:szCs w:val="21"/>
+        </w:rPr>
+        <w:t xml:space="preserve">GitHub Actions, </w:t>
+      </w:r>
+      <w:r>
+        <w:rPr>
+          <w:sz w:val="21"/>
+          <w:szCs w:val="21"/>
+        </w:rPr>
+        <w:t xml:space="preserve">Docker, </w:t>
+      </w:r>
+      <w:r>
+        <w:rPr>
+          <w:sz w:val="21"/>
+          <w:szCs w:val="21"/>
+        </w:rPr>
+        <w:t xml:space="preserve">Visual Studio, </w:t>
+      </w:r>
+      <w:r>
+        <w:rPr>
+          <w:sz w:val="21"/>
+          <w:szCs w:val="21"/>
+        </w:rPr>
+        <w:t>Rider,</w:t>
+      </w:r>
+      <w:r>
+        <w:rPr>
+          <w:sz w:val="21"/>
+          <w:szCs w:val="21"/>
+        </w:rPr>
+        <w:t xml:space="preserve"> PowerShell</w:t>
+      </w:r>
+      <w:r>
+        <w:rPr>
+          <w:sz w:val="21"/>
+          <w:szCs w:val="21"/>
+        </w:rPr>
+        <w:t>, Trello</w:t>
+      </w:r>
+      <w:r>
+        <w:rPr>
+          <w:sz w:val="21"/>
+          <w:szCs w:val="21"/>
+        </w:rPr>
+        <w:t xml:space="preserve">  </w:t>
+      </w:r>
+    </w:p>
+    <w:p>
+      <w:pPr>
+        <w:spacing w:after="0" w:line="240" w:lineRule="auto"/>
+        <w:jc w:val="both"/>
+        <w:rPr>
+          <w:sz w:val="21"/>
+          <w:szCs w:val="21"/>
+        </w:rPr>
+      </w:pPr>
+      <w:r>
+        <w:rPr>
+          <w:b/>
+          <w:bCs/>
+          <w:sz w:val="21"/>
+          <w:szCs w:val="21"/>
+        </w:rPr>
+        <w:t>Frontend</w:t>
+      </w:r>
+      <w:r>
+        <w:rPr>
+          <w:b/>
+          <w:bCs/>
+          <w:sz w:val="21"/>
+          <w:szCs w:val="21"/>
+        </w:rPr>
         <w:t>:</w:t>
       </w:r>
       <w:r>
@@ -921,7 +1115,7 @@
           <w:sz w:val="21"/>
           <w:szCs w:val="21"/>
         </w:rPr>
-        <w:tab/>
+        <w:t xml:space="preserve">             </w:t>
       </w:r>
       <w:r>
         <w:rPr>
@@ -1302,7 +1496,7 @@
           <w:sz w:val="21"/>
           <w:szCs w:val="21"/>
         </w:rPr>
-        <w:t>Collaborated in a team to build a productivity application that combines lo-fi music with tools including music search, playlists, timers, projects and user accounts.</w:t>
+        <w:t>Collaborated in a team to build a productivity application that combines lo-fi music with tools including music search, playlists, timers, projects and user accounts</w:t>
       </w:r>
     </w:p>
     <w:p>
@@ -1325,7 +1519,7 @@
           <w:sz w:val="21"/>
           <w:szCs w:val="21"/>
         </w:rPr>
-        <w:t>Pair programmed on the YouTube integration, enabling users to search for music and play selected videos within the application, while also contributing to backend functionality, testing and dashboard features.</w:t>
+        <w:t>Pair programmed on the YouTube integration, enabling users to search for music and play selected videos within the application, while also contributing to backend functionality, testing and dashboard features</w:t>
       </w:r>
     </w:p>
     <w:p>
@@ -1348,7 +1542,7 @@
           <w:sz w:val="21"/>
           <w:szCs w:val="21"/>
         </w:rPr>
-        <w:t>Independently implemented API and database health checks to monitor whether key parts of the application were running correctly, and developed a Pomodoro timer prototype that controlled music playback based on a 25-minute focus session.</w:t>
+        <w:t>Independently implemented API and database health checks to monitor whether key parts of the application were running correctly, and developed a Pomodoro timer prototype that controlled music playback based on a 25-minute focus session</w:t>
       </w:r>
     </w:p>
     <w:p>
@@ -1371,7 +1565,28 @@
           <w:sz w:val="21"/>
           <w:szCs w:val="21"/>
         </w:rPr>
-        <w:t>After the bootcamp, reviewed the application independently to find and fix security weaknesses, including issues that could have let users access or change other people's information without permission.</w:t>
+        <w:t xml:space="preserve">Independently reviewed the application for security weaknesses and fixed issues that could have allowed users to access or modify other users' information, including preventing users from giving themselves administrator privileges or accessing </w:t>
+      </w:r>
+      <w:r>
+        <w:rPr>
+          <w:sz w:val="21"/>
+          <w:szCs w:val="21"/>
+        </w:rPr>
+        <w:t>and modifying</w:t>
+      </w:r>
+      <w:r>
+        <w:rPr>
+          <w:sz w:val="21"/>
+          <w:szCs w:val="21"/>
+        </w:rPr>
+        <w:t xml:space="preserve"> </w:t>
+      </w:r>
+      <w:r>
+        <w:rPr>
+          <w:sz w:val="21"/>
+          <w:szCs w:val="21"/>
+        </w:rPr>
+        <w:t>other users' projects</w:t>
       </w:r>
     </w:p>
     <w:p>
@@ -1394,7 +1609,74 @@
           <w:sz w:val="21"/>
           <w:szCs w:val="21"/>
         </w:rPr>
-        <w:t>Rebuilt the login and sign-up process to work correctly, replaced a temporary placeholder for the music search feature with the real working version, finished the timer feature left incomplete during the bootcamp, and deployed the finished application online for anyone to use.</w:t>
+        <w:t xml:space="preserve">Reworked the sign-up and login process to use email addresses consistently with the authentication system, fixing account-creation and login issues and ensuring new user accounts were correctly </w:t>
+      </w:r>
+      <w:r>
+        <w:rPr>
+          <w:sz w:val="21"/>
+          <w:szCs w:val="21"/>
+        </w:rPr>
+        <w:t>linked</w:t>
+      </w:r>
+      <w:r>
+        <w:rPr>
+          <w:sz w:val="21"/>
+          <w:szCs w:val="21"/>
+        </w:rPr>
+        <w:t xml:space="preserve"> to their authentication </w:t>
+      </w:r>
+      <w:r>
+        <w:rPr>
+          <w:sz w:val="21"/>
+          <w:szCs w:val="21"/>
+        </w:rPr>
+        <w:t>accounts</w:t>
+      </w:r>
+    </w:p>
+    <w:p>
+      <w:pPr>
+        <w:pStyle w:val="ListParagraph"/>
+        <w:numPr>
+          <w:ilvl w:val="0"/>
+          <w:numId w:val="18"/>
+        </w:numPr>
+        <w:spacing w:after="0" w:line="240" w:lineRule="auto"/>
+        <w:ind w:left="357" w:hanging="357"/>
+        <w:jc w:val="both"/>
+        <w:rPr>
+          <w:sz w:val="21"/>
+          <w:szCs w:val="21"/>
+        </w:rPr>
+      </w:pPr>
+      <w:r>
+        <w:rPr>
+          <w:sz w:val="21"/>
+          <w:szCs w:val="21"/>
+        </w:rPr>
+        <w:t>Restored the YouTube music search after the bootcamp, replacing temporary hard-coded videos with live search results and adding a 15-minute cache to reduce repeated requests to the external service</w:t>
+      </w:r>
+    </w:p>
+    <w:p>
+      <w:pPr>
+        <w:pStyle w:val="ListParagraph"/>
+        <w:numPr>
+          <w:ilvl w:val="0"/>
+          <w:numId w:val="18"/>
+        </w:numPr>
+        <w:spacing w:after="0" w:line="240" w:lineRule="auto"/>
+        <w:ind w:left="357" w:hanging="357"/>
+        <w:jc w:val="both"/>
+        <w:rPr>
+          <w:sz w:val="21"/>
+          <w:szCs w:val="21"/>
+        </w:rPr>
+      </w:pPr>
+      <w:r>
+        <w:rPr>
+          <w:sz w:val="21"/>
+          <w:szCs w:val="21"/>
+        </w:rPr>
+        <w:t>Completed and reintroduced the Pomodoro timer, fixed an existing playback issue, and deployed the completed application online using Docker and Railway with Azure SQL providing the production database</w:t>
       </w:r>
     </w:p>
     <w:p>
@@ -1708,7 +1990,7 @@
           <w:sz w:val="21"/>
           <w:szCs w:val="21"/>
         </w:rPr>
-        <w:t>Built a full-stack record shop application for managing a record inventory, allowing users to view, search, add, edit and delete records.</w:t>
+        <w:t>Built a full-stack record shop application for managing a record inventory, allowing users to view, search, add, edit and delete records</w:t>
       </w:r>
     </w:p>
     <w:p>
@@ -1731,14 +2013,8 @@
           <w:sz w:val="21"/>
           <w:szCs w:val="21"/>
         </w:rPr>
+        <w:lastRenderedPageBreak/>
         <w:t>Developed the application so changes made through the user interface are processed by the backend and stored persistently, keeping record information available between sessions</w:t>
-      </w:r>
-      <w:r>
-        <w:rPr>
-          <w:sz w:val="21"/>
-          <w:szCs w:val="21"/>
-        </w:rPr>
-        <w:t xml:space="preserve">. </w:t>
       </w:r>
     </w:p>
     <w:p>
@@ -1763,13 +2039,6 @@
         </w:rPr>
         <w:t>Added automated testing and health checks to verify that key parts of the application behave correctly and to help identify problems with the application or database</w:t>
       </w:r>
-      <w:r>
-        <w:rPr>
-          <w:sz w:val="21"/>
-          <w:szCs w:val="21"/>
-        </w:rPr>
-        <w:t>.</w:t>
-      </w:r>
     </w:p>
     <w:p>
       <w:pPr>
@@ -1791,14 +2060,21 @@
           <w:sz w:val="21"/>
           <w:szCs w:val="21"/>
         </w:rPr>
-        <w:t>Deployed the completed application online using Railway, with the frontend and backend running as separate services and a Neon PostgreSQL database providing persistent production data</w:t>
-      </w:r>
-      <w:r>
-        <w:rPr>
-          <w:sz w:val="21"/>
-          <w:szCs w:val="21"/>
-        </w:rPr>
-        <w:t>.</w:t>
+        <w:t>Deployed the completed application online using</w:t>
+      </w:r>
+      <w:r>
+        <w:rPr>
+          <w:sz w:val="21"/>
+          <w:szCs w:val="21"/>
+        </w:rPr>
+        <w:t xml:space="preserve"> Docker and</w:t>
+      </w:r>
+      <w:r>
+        <w:rPr>
+          <w:sz w:val="21"/>
+          <w:szCs w:val="21"/>
+        </w:rPr>
+        <w:t xml:space="preserve"> Railway, with the frontend and backend running as separate services and a Neon PostgreSQL database providing persistent production data</w:t>
       </w:r>
     </w:p>
     <w:p>
@@ -1832,7 +2108,6 @@
           <w:sz w:val="26"/>
           <w:szCs w:val="26"/>
         </w:rPr>
-        <w:lastRenderedPageBreak/>
         <w:t>Professional Development</w:t>
       </w:r>
     </w:p>
@@ -1854,18 +2129,63 @@
           <w:sz w:val="21"/>
           <w:szCs w:val="21"/>
         </w:rPr>
-        <w:t xml:space="preserve">Northcoders Enterprise Engineering Bootcamp  </w:t>
-      </w:r>
-    </w:p>
-    <w:p>
-      <w:pPr>
-        <w:spacing w:after="0" w:line="240" w:lineRule="auto"/>
-        <w:jc w:val="both"/>
-        <w:rPr>
-          <w:sz w:val="21"/>
-          <w:szCs w:val="21"/>
-        </w:rPr>
-      </w:pPr>
+        <w:t xml:space="preserve">Northcoders Enterprise Engineering </w:t>
+      </w:r>
+      <w:r>
+        <w:rPr>
+          <w:b/>
+          <w:bCs/>
+          <w:sz w:val="21"/>
+          <w:szCs w:val="21"/>
+        </w:rPr>
+        <w:t xml:space="preserve">Bootcamp </w:t>
+      </w:r>
+      <w:r>
+        <w:rPr>
+          <w:b/>
+          <w:bCs/>
+          <w:sz w:val="21"/>
+          <w:szCs w:val="21"/>
+        </w:rPr>
+        <w:tab/>
+      </w:r>
+      <w:r>
+        <w:rPr>
+          <w:b/>
+          <w:bCs/>
+          <w:sz w:val="21"/>
+          <w:szCs w:val="21"/>
+        </w:rPr>
+        <w:tab/>
+      </w:r>
+      <w:r>
+        <w:rPr>
+          <w:b/>
+          <w:bCs/>
+          <w:sz w:val="21"/>
+          <w:szCs w:val="21"/>
+        </w:rPr>
+        <w:tab/>
+      </w:r>
+      <w:r>
+        <w:rPr>
+          <w:b/>
+          <w:bCs/>
+          <w:sz w:val="21"/>
+          <w:szCs w:val="21"/>
+        </w:rPr>
+        <w:tab/>
+      </w:r>
+      <w:r>
+        <w:rPr>
+          <w:b/>
+          <w:bCs/>
+          <w:sz w:val="21"/>
+          <w:szCs w:val="21"/>
+        </w:rPr>
+        <w:tab/>
+        <w:t xml:space="preserve">              </w:t>
+      </w:r>
       <w:r>
         <w:rPr>
           <w:sz w:val="21"/>
@@ -2078,31 +2398,123 @@
           <w:sz w:val="21"/>
           <w:szCs w:val="21"/>
         </w:rPr>
-        <w:t xml:space="preserve">Java Programming Masterclass (Udemy)  </w:t>
-      </w:r>
-    </w:p>
-    <w:p>
-      <w:pPr>
-        <w:spacing w:after="0" w:line="240" w:lineRule="auto"/>
-        <w:jc w:val="both"/>
-        <w:rPr>
-          <w:sz w:val="21"/>
-          <w:szCs w:val="21"/>
-        </w:rPr>
-      </w:pPr>
-      <w:r>
-        <w:rPr>
-          <w:sz w:val="21"/>
-          <w:szCs w:val="21"/>
-        </w:rPr>
-        <w:t>2025 – Present</w:t>
-      </w:r>
-      <w:r>
-        <w:rPr>
-          <w:sz w:val="21"/>
-          <w:szCs w:val="21"/>
-        </w:rPr>
-        <w:t xml:space="preserve"> (Self-Study)</w:t>
+        <w:t>Java Programming Masterclass (</w:t>
+      </w:r>
+      <w:r>
+        <w:rPr>
+          <w:b/>
+          <w:bCs/>
+          <w:sz w:val="21"/>
+          <w:szCs w:val="21"/>
+        </w:rPr>
+        <w:t xml:space="preserve">Udemy) </w:t>
+      </w:r>
+      <w:r>
+        <w:rPr>
+          <w:b/>
+          <w:bCs/>
+          <w:sz w:val="21"/>
+          <w:szCs w:val="21"/>
+        </w:rPr>
+        <w:tab/>
+      </w:r>
+      <w:r>
+        <w:rPr>
+          <w:b/>
+          <w:bCs/>
+          <w:sz w:val="21"/>
+          <w:szCs w:val="21"/>
+        </w:rPr>
+        <w:tab/>
+      </w:r>
+      <w:r>
+        <w:rPr>
+          <w:b/>
+          <w:bCs/>
+          <w:sz w:val="21"/>
+          <w:szCs w:val="21"/>
+        </w:rPr>
+        <w:tab/>
+      </w:r>
+      <w:r>
+        <w:rPr>
+          <w:b/>
+          <w:bCs/>
+          <w:sz w:val="21"/>
+          <w:szCs w:val="21"/>
+        </w:rPr>
+        <w:tab/>
+      </w:r>
+      <w:r>
+        <w:rPr>
+          <w:b/>
+          <w:bCs/>
+          <w:sz w:val="21"/>
+          <w:szCs w:val="21"/>
+        </w:rPr>
+        <w:tab/>
+      </w:r>
+      <w:r>
+        <w:rPr>
+          <w:b/>
+          <w:bCs/>
+          <w:sz w:val="21"/>
+          <w:szCs w:val="21"/>
+        </w:rPr>
+        <w:t xml:space="preserve">          </w:t>
+      </w:r>
+      <w:r>
+        <w:rPr>
+          <w:sz w:val="21"/>
+          <w:szCs w:val="21"/>
+        </w:rPr>
+        <w:t>Self Study |</w:t>
+      </w:r>
+      <w:r>
+        <w:rPr>
+          <w:b/>
+          <w:bCs/>
+          <w:sz w:val="21"/>
+          <w:szCs w:val="21"/>
+        </w:rPr>
+        <w:t xml:space="preserve"> </w:t>
+      </w:r>
+      <w:r>
+        <w:rPr>
+          <w:sz w:val="21"/>
+          <w:szCs w:val="21"/>
+        </w:rPr>
+        <w:t>Jan</w:t>
+      </w:r>
+      <w:r>
+        <w:rPr>
+          <w:b/>
+          <w:bCs/>
+          <w:sz w:val="21"/>
+          <w:szCs w:val="21"/>
+        </w:rPr>
+        <w:t xml:space="preserve"> </w:t>
+      </w:r>
+      <w:r>
+        <w:rPr>
+          <w:sz w:val="21"/>
+          <w:szCs w:val="21"/>
+        </w:rPr>
+        <w:t xml:space="preserve">2025 – </w:t>
+      </w:r>
+      <w:r>
+        <w:rPr>
+          <w:sz w:val="21"/>
+          <w:szCs w:val="21"/>
+        </w:rPr>
+        <w:t xml:space="preserve">Jan </w:t>
+      </w:r>
+      <w:r>
+        <w:rPr>
+          <w:sz w:val="21"/>
+          <w:szCs w:val="21"/>
+        </w:rPr>
+        <w:t>2026</w:t>
       </w:r>
       <w:r>
         <w:rPr>
@@ -2193,18 +2605,72 @@
           <w:sz w:val="21"/>
           <w:szCs w:val="21"/>
         </w:rPr>
-        <w:t xml:space="preserve">Google IT Support Professional Certificate (Coursera)  </w:t>
-      </w:r>
-    </w:p>
-    <w:p>
-      <w:pPr>
-        <w:spacing w:after="0" w:line="240" w:lineRule="auto"/>
-        <w:jc w:val="both"/>
-        <w:rPr>
-          <w:sz w:val="21"/>
-          <w:szCs w:val="21"/>
-        </w:rPr>
-      </w:pPr>
+        <w:t>Google IT Support Professional Certificate (</w:t>
+      </w:r>
+      <w:r>
+        <w:rPr>
+          <w:b/>
+          <w:bCs/>
+          <w:sz w:val="21"/>
+          <w:szCs w:val="21"/>
+        </w:rPr>
+        <w:t xml:space="preserve">Coursera) </w:t>
+      </w:r>
+      <w:r>
+        <w:rPr>
+          <w:b/>
+          <w:bCs/>
+          <w:sz w:val="21"/>
+          <w:szCs w:val="21"/>
+        </w:rPr>
+        <w:tab/>
+      </w:r>
+      <w:r>
+        <w:rPr>
+          <w:b/>
+          <w:bCs/>
+          <w:sz w:val="21"/>
+          <w:szCs w:val="21"/>
+        </w:rPr>
+        <w:tab/>
+      </w:r>
+      <w:r>
+        <w:rPr>
+          <w:b/>
+          <w:bCs/>
+          <w:sz w:val="21"/>
+          <w:szCs w:val="21"/>
+        </w:rPr>
+        <w:tab/>
+      </w:r>
+      <w:r>
+        <w:rPr>
+          <w:b/>
+          <w:bCs/>
+          <w:sz w:val="21"/>
+          <w:szCs w:val="21"/>
+        </w:rPr>
+        <w:tab/>
+      </w:r>
+      <w:r>
+        <w:rPr>
+          <w:b/>
+          <w:bCs/>
+          <w:sz w:val="21"/>
+          <w:szCs w:val="21"/>
+        </w:rPr>
+        <w:tab/>
+      </w:r>
+      <w:r>
+        <w:rPr>
+          <w:b/>
+          <w:bCs/>
+          <w:sz w:val="21"/>
+          <w:szCs w:val="21"/>
+        </w:rPr>
+        <w:tab/>
+        <w:t xml:space="preserve">            </w:t>
+      </w:r>
       <w:r>
         <w:rPr>
           <w:sz w:val="21"/>
@@ -2326,20 +2792,71 @@
           <w:sz w:val="21"/>
           <w:szCs w:val="21"/>
         </w:rPr>
-        <w:t xml:space="preserve">PPV Worldwide Limited  </w:t>
-      </w:r>
-    </w:p>
-    <w:p>
-      <w:pPr>
-        <w:keepNext/>
-        <w:keepLines/>
-        <w:spacing w:after="0" w:line="240" w:lineRule="auto"/>
-        <w:jc w:val="both"/>
-        <w:rPr>
-          <w:sz w:val="21"/>
-          <w:szCs w:val="21"/>
-        </w:rPr>
-      </w:pPr>
+        <w:t xml:space="preserve">PPV Worldwide </w:t>
+      </w:r>
+      <w:r>
+        <w:rPr>
+          <w:sz w:val="21"/>
+          <w:szCs w:val="21"/>
+        </w:rPr>
+        <w:t xml:space="preserve">Limited </w:t>
+      </w:r>
+      <w:r>
+        <w:rPr>
+          <w:sz w:val="21"/>
+          <w:szCs w:val="21"/>
+        </w:rPr>
+        <w:tab/>
+      </w:r>
+      <w:r>
+        <w:rPr>
+          <w:sz w:val="21"/>
+          <w:szCs w:val="21"/>
+        </w:rPr>
+        <w:tab/>
+      </w:r>
+      <w:r>
+        <w:rPr>
+          <w:sz w:val="21"/>
+          <w:szCs w:val="21"/>
+        </w:rPr>
+        <w:tab/>
+      </w:r>
+      <w:r>
+        <w:rPr>
+          <w:sz w:val="21"/>
+          <w:szCs w:val="21"/>
+        </w:rPr>
+        <w:tab/>
+      </w:r>
+      <w:r>
+        <w:rPr>
+          <w:sz w:val="21"/>
+          <w:szCs w:val="21"/>
+        </w:rPr>
+        <w:tab/>
+      </w:r>
+      <w:r>
+        <w:rPr>
+          <w:sz w:val="21"/>
+          <w:szCs w:val="21"/>
+        </w:rPr>
+        <w:tab/>
+      </w:r>
+      <w:r>
+        <w:rPr>
+          <w:sz w:val="21"/>
+          <w:szCs w:val="21"/>
+        </w:rPr>
+        <w:tab/>
+      </w:r>
+      <w:r>
+        <w:rPr>
+          <w:sz w:val="21"/>
+          <w:szCs w:val="21"/>
+        </w:rPr>
+        <w:tab/>
+      </w:r>
       <w:r>
         <w:rPr>
           <w:sz w:val="21"/>
@@ -2646,18 +3163,58 @@
           <w:sz w:val="21"/>
           <w:szCs w:val="21"/>
         </w:rPr>
-        <w:t xml:space="preserve">UberEats, Deliveroo &amp; Stuart  </w:t>
-      </w:r>
-    </w:p>
-    <w:p>
-      <w:pPr>
-        <w:spacing w:after="0" w:line="240" w:lineRule="auto"/>
-        <w:jc w:val="both"/>
-        <w:rPr>
-          <w:sz w:val="21"/>
-          <w:szCs w:val="21"/>
-        </w:rPr>
-      </w:pPr>
+        <w:t xml:space="preserve">UberEats, Deliveroo &amp; </w:t>
+      </w:r>
+      <w:r>
+        <w:rPr>
+          <w:sz w:val="21"/>
+          <w:szCs w:val="21"/>
+        </w:rPr>
+        <w:t xml:space="preserve">Stuart </w:t>
+      </w:r>
+      <w:r>
+        <w:rPr>
+          <w:sz w:val="21"/>
+          <w:szCs w:val="21"/>
+        </w:rPr>
+        <w:tab/>
+      </w:r>
+      <w:r>
+        <w:rPr>
+          <w:sz w:val="21"/>
+          <w:szCs w:val="21"/>
+        </w:rPr>
+        <w:tab/>
+      </w:r>
+      <w:r>
+        <w:rPr>
+          <w:sz w:val="21"/>
+          <w:szCs w:val="21"/>
+        </w:rPr>
+        <w:tab/>
+      </w:r>
+      <w:r>
+        <w:rPr>
+          <w:sz w:val="21"/>
+          <w:szCs w:val="21"/>
+        </w:rPr>
+        <w:tab/>
+      </w:r>
+      <w:r>
+        <w:rPr>
+          <w:sz w:val="21"/>
+          <w:szCs w:val="21"/>
+        </w:rPr>
+        <w:tab/>
+      </w:r>
+      <w:r>
+        <w:rPr>
+          <w:sz w:val="21"/>
+          <w:szCs w:val="21"/>
+        </w:rPr>
+        <w:tab/>
+        <w:t xml:space="preserve">            </w:t>
+      </w:r>
       <w:r>
         <w:rPr>
           <w:sz w:val="21"/>
@@ -2867,35 +3424,100 @@
           <w:sz w:val="21"/>
           <w:szCs w:val="21"/>
         </w:rPr>
-        <w:t xml:space="preserve">BSc (Hons) Computer Science (studied to final year)  </w:t>
-      </w:r>
-    </w:p>
-    <w:p>
-      <w:pPr>
-        <w:spacing w:after="0" w:line="240" w:lineRule="auto"/>
-        <w:jc w:val="both"/>
-        <w:rPr>
-          <w:sz w:val="21"/>
-          <w:szCs w:val="21"/>
-        </w:rPr>
-      </w:pPr>
-      <w:r>
-        <w:rPr>
-          <w:sz w:val="21"/>
-          <w:szCs w:val="21"/>
-        </w:rPr>
-        <w:t xml:space="preserve">Greenwich School of Management  </w:t>
-      </w:r>
-    </w:p>
-    <w:p>
-      <w:pPr>
-        <w:spacing w:after="0" w:line="240" w:lineRule="auto"/>
-        <w:jc w:val="both"/>
-        <w:rPr>
-          <w:sz w:val="21"/>
-          <w:szCs w:val="21"/>
-        </w:rPr>
-      </w:pPr>
+        <w:t xml:space="preserve">BSc (Hons) Computer Science </w:t>
+      </w:r>
+      <w:r>
+        <w:rPr>
+          <w:b/>
+          <w:bCs/>
+          <w:sz w:val="21"/>
+          <w:szCs w:val="21"/>
+        </w:rPr>
+        <w:t>| S</w:t>
+      </w:r>
+      <w:r>
+        <w:rPr>
+          <w:b/>
+          <w:bCs/>
+          <w:sz w:val="21"/>
+          <w:szCs w:val="21"/>
+        </w:rPr>
+        <w:t xml:space="preserve">tudied to final year  </w:t>
+      </w:r>
+    </w:p>
+    <w:p>
+      <w:pPr>
+        <w:spacing w:after="0" w:line="240" w:lineRule="auto"/>
+        <w:jc w:val="both"/>
+        <w:rPr>
+          <w:sz w:val="21"/>
+          <w:szCs w:val="21"/>
+        </w:rPr>
+      </w:pPr>
+      <w:r>
+        <w:rPr>
+          <w:sz w:val="21"/>
+          <w:szCs w:val="21"/>
+        </w:rPr>
+        <w:t xml:space="preserve">Greenwich School of </w:t>
+      </w:r>
+      <w:r>
+        <w:rPr>
+          <w:sz w:val="21"/>
+          <w:szCs w:val="21"/>
+        </w:rPr>
+        <w:t xml:space="preserve">Management </w:t>
+      </w:r>
+      <w:r>
+        <w:rPr>
+          <w:sz w:val="21"/>
+          <w:szCs w:val="21"/>
+        </w:rPr>
+        <w:tab/>
+      </w:r>
+      <w:r>
+        <w:rPr>
+          <w:sz w:val="21"/>
+          <w:szCs w:val="21"/>
+        </w:rPr>
+        <w:tab/>
+      </w:r>
+      <w:r>
+        <w:rPr>
+          <w:sz w:val="21"/>
+          <w:szCs w:val="21"/>
+        </w:rPr>
+        <w:tab/>
+      </w:r>
+      <w:r>
+        <w:rPr>
+          <w:sz w:val="21"/>
+          <w:szCs w:val="21"/>
+        </w:rPr>
+        <w:tab/>
+      </w:r>
+      <w:r>
+        <w:rPr>
+          <w:sz w:val="21"/>
+          <w:szCs w:val="21"/>
+        </w:rPr>
+        <w:tab/>
+      </w:r>
+      <w:r>
+        <w:rPr>
+          <w:sz w:val="21"/>
+          <w:szCs w:val="21"/>
+        </w:rPr>
+        <w:tab/>
+      </w:r>
+      <w:r>
+        <w:rPr>
+          <w:sz w:val="21"/>
+          <w:szCs w:val="21"/>
+        </w:rPr>
+        <w:tab/>
+        <w:t xml:space="preserve">              </w:t>
+      </w:r>
       <w:r>
         <w:rPr>
           <w:sz w:val="21"/>
@@ -2981,18 +3603,51 @@
           <w:sz w:val="21"/>
           <w:szCs w:val="21"/>
         </w:rPr>
-        <w:t xml:space="preserve">The College of Haringey, Enfield and North East London  </w:t>
-      </w:r>
-    </w:p>
-    <w:p>
-      <w:pPr>
-        <w:spacing w:after="0" w:line="240" w:lineRule="auto"/>
-        <w:jc w:val="both"/>
-        <w:rPr>
-          <w:sz w:val="21"/>
-          <w:szCs w:val="21"/>
-        </w:rPr>
-      </w:pPr>
+        <w:t xml:space="preserve">The College of Haringey, Enfield and North East </w:t>
+      </w:r>
+      <w:r>
+        <w:rPr>
+          <w:sz w:val="21"/>
+          <w:szCs w:val="21"/>
+        </w:rPr>
+        <w:t xml:space="preserve">London </w:t>
+      </w:r>
+      <w:r>
+        <w:rPr>
+          <w:sz w:val="21"/>
+          <w:szCs w:val="21"/>
+        </w:rPr>
+        <w:tab/>
+      </w:r>
+      <w:r>
+        <w:rPr>
+          <w:sz w:val="21"/>
+          <w:szCs w:val="21"/>
+        </w:rPr>
+        <w:tab/>
+      </w:r>
+      <w:r>
+        <w:rPr>
+          <w:sz w:val="21"/>
+          <w:szCs w:val="21"/>
+        </w:rPr>
+        <w:tab/>
+      </w:r>
+      <w:r>
+        <w:rPr>
+          <w:sz w:val="21"/>
+          <w:szCs w:val="21"/>
+        </w:rPr>
+        <w:tab/>
+      </w:r>
+      <w:r>
+        <w:rPr>
+          <w:sz w:val="21"/>
+          <w:szCs w:val="21"/>
+        </w:rPr>
+        <w:tab/>
+        <w:t xml:space="preserve">              </w:t>
+      </w:r>
       <w:r>
         <w:rPr>
           <w:sz w:val="21"/>
@@ -3332,6 +3987,36 @@
         </w:rPr>
         <w:t>rig</w:t>
       </w:r>
+    </w:p>
+    <w:p>
+      <w:pPr>
+        <w:spacing w:after="0" w:line="240" w:lineRule="auto"/>
+        <w:jc w:val="both"/>
+        <w:rPr>
+          <w:sz w:val="21"/>
+          <w:szCs w:val="21"/>
+        </w:rPr>
+      </w:pPr>
+    </w:p>
+    <w:p>
+      <w:pPr>
+        <w:spacing w:after="0" w:line="240" w:lineRule="auto"/>
+        <w:jc w:val="both"/>
+        <w:rPr>
+          <w:sz w:val="21"/>
+          <w:szCs w:val="21"/>
+        </w:rPr>
+      </w:pPr>
+    </w:p>
+    <w:p>
+      <w:pPr>
+        <w:spacing w:after="0" w:line="240" w:lineRule="auto"/>
+        <w:jc w:val="both"/>
+        <w:rPr>
+          <w:sz w:val="21"/>
+          <w:szCs w:val="21"/>
+        </w:rPr>
+      </w:pPr>
     </w:p>
     <w:sectPr>
       <w:pgSz w:w="11906" w:h="16838" w:code="9"/>

</xml_diff>